<commit_message>
Ursuline AI: simplify nav, Upper School copy, per-part handouts.
Remove Team Leadership section and human/AI block; add hover polish and text audits; update faculty lesson plans and student handouts; keep root off Ursuline redirects.

Co-authored-by: Cursor <cursoragent@cursor.com>
</commit_message>
<xml_diff>
--- a/public/artifacts/team/ursuline_part2_teacher_lesson_plan.docx
+++ b/public/artifacts/team/ursuline_part2_teacher_lesson_plan.docx
@@ -1,13 +1,16 @@
 
 <file path=word/document.xml><?xml version="1.0" encoding="utf-8"?>
-<w:document xmlns:wpc="http://schemas.microsoft.com/office/word/2010/wordprocessingCanvas" xmlns:mo="http://schemas.microsoft.com/office/mac/office/2008/main" xmlns:mc="http://schemas.openxmlformats.org/markup-compatibility/2006" xmlns:mv="urn:schemas-microsoft-com:mac:vml" xmlns:o="urn:schemas-microsoft-com:office:office" xmlns:r="http://schemas.openxmlformats.org/officeDocument/2006/relationships" xmlns:m="http://schemas.openxmlformats.org/officeDocument/2006/math" xmlns:v="urn:schemas-microsoft-com:vml" xmlns:wp14="http://schemas.microsoft.com/office/word/2010/wordprocessingDrawing" xmlns:wp="http://schemas.openxmlformats.org/drawingml/2006/wordprocessingDrawing" xmlns:w10="urn:schemas-microsoft-com:office:word" xmlns:w="http://schemas.openxmlformats.org/wordprocessingml/2006/main" xmlns:w14="http://schemas.microsoft.com/office/word/2010/wordml" xmlns:wpg="http://schemas.microsoft.com/office/word/2010/wordprocessingGroup" xmlns:wpi="http://schemas.microsoft.com/office/word/2010/wordprocessingInk" xmlns:wne="http://schemas.microsoft.com/office/word/2006/wordml" xmlns:wps="http://schemas.microsoft.com/office/word/2010/wordprocessingShape" mc:Ignorable="w14 wp14">
+<w:document xmlns:ns1="http://schemas.openxmlformats.org/markup-compatibility/2006" xmlns:w="http://schemas.openxmlformats.org/wordprocessingml/2006/main" ns1:Ignorable="w14 wp14">
   <w:body>
     <w:p>
       <w:pPr>
-        <w:pStyle w:val="Title"/>
         <w:jc w:val="center"/>
       </w:pPr>
       <w:r>
+        <w:rPr>
+          <w:b/>
+          <w:sz w:val="36"/>
+        </w:rPr>
         <w:t>Inside AI: The Math, Science, and Code Behind Intelligent Tools</w:t>
       </w:r>
     </w:p>
@@ -18,8 +21,9 @@
       <w:r>
         <w:rPr>
           <w:i/>
+          <w:sz w:val="22"/>
         </w:rPr>
-        <w:t>15 to 20 Minute Student-Facing Supplemental Lesson for Ursuline Academy, Dedham</w:t>
+        <w:t>A 10th/11th-grade extension to AI, the Brain, and Serviam</w:t>
       </w:r>
     </w:p>
     <w:p>
@@ -34,44 +38,29 @@
       <w:tblPr>
         <w:tblStyle w:val="TableGrid"/>
         <w:tblW w:type="auto" w:w="0"/>
-        <w:jc w:val="center"/>
         <w:tblLook w:firstColumn="1" w:firstRow="1" w:lastColumn="0" w:lastRow="0" w:noHBand="0" w:noVBand="1" w:val="04A0"/>
       </w:tblPr>
       <w:tblGrid>
-        <w:gridCol w:w="5112"/>
-        <w:gridCol w:w="5112"/>
+        <w:gridCol w:w="5184"/>
+        <w:gridCol w:w="5184"/>
       </w:tblGrid>
       <w:tr>
         <w:tc>
           <w:tcPr>
-            <w:tcW w:type="dxa" w:w="2448"/>
-            <w:shd w:fill="D9EAD3"/>
-            <w:vAlign w:val="center"/>
+            <w:tcW w:type="dxa" w:w="5184"/>
           </w:tcPr>
           <w:p>
-            <w:r/>
             <w:r>
-              <w:rPr>
-                <w:b/>
-                <w:sz w:val="18"/>
-              </w:rPr>
               <w:t>Category</w:t>
             </w:r>
           </w:p>
         </w:tc>
         <w:tc>
           <w:tcPr>
-            <w:tcW w:type="dxa" w:w="8208"/>
-            <w:shd w:fill="D9EAD3"/>
-            <w:vAlign w:val="center"/>
+            <w:tcW w:type="dxa" w:w="5184"/>
           </w:tcPr>
           <w:p>
-            <w:r/>
             <w:r>
-              <w:rPr>
-                <w:b/>
-                <w:sz w:val="18"/>
-              </w:rPr>
               <w:t>Plan</w:t>
             </w:r>
           </w:p>
@@ -80,33 +69,21 @@
       <w:tr>
         <w:tc>
           <w:tcPr>
-            <w:tcW w:type="dxa" w:w="2448"/>
-            <w:vAlign w:val="top"/>
+            <w:tcW w:type="dxa" w:w="5184"/>
           </w:tcPr>
           <w:p>
-            <w:r/>
             <w:r>
-              <w:rPr>
-                <w:b w:val="0"/>
-                <w:sz w:val="18"/>
-              </w:rPr>
               <w:t>Course or context</w:t>
             </w:r>
           </w:p>
         </w:tc>
         <w:tc>
           <w:tcPr>
-            <w:tcW w:type="dxa" w:w="8208"/>
-            <w:vAlign w:val="top"/>
+            <w:tcW w:type="dxa" w:w="5184"/>
           </w:tcPr>
           <w:p>
-            <w:r/>
             <w:r>
-              <w:rPr>
-                <w:b w:val="0"/>
-                <w:sz w:val="18"/>
-              </w:rPr>
-              <w:t>Grades 10 and 11. Computer science, math, science, AI literacy extension, AP CSP bridge, AP CSA bridge, or interdisciplinary STEM seminar.</w:t>
+              <w:t>Grades 10 and 11. Computer science, math, science, AI literacy, I.D.E.A. Hub, AP CSP or AP CSA extension.</w:t>
             </w:r>
           </w:p>
         </w:tc>
@@ -114,33 +91,21 @@
       <w:tr>
         <w:tc>
           <w:tcPr>
-            <w:tcW w:type="dxa" w:w="2448"/>
-            <w:vAlign w:val="top"/>
+            <w:tcW w:type="dxa" w:w="5184"/>
           </w:tcPr>
           <w:p>
-            <w:r/>
             <w:r>
-              <w:rPr>
-                <w:b w:val="0"/>
-                <w:sz w:val="18"/>
-              </w:rPr>
               <w:t>Length</w:t>
             </w:r>
           </w:p>
         </w:tc>
         <w:tc>
           <w:tcPr>
-            <w:tcW w:type="dxa" w:w="8208"/>
-            <w:vAlign w:val="top"/>
+            <w:tcW w:type="dxa" w:w="5184"/>
           </w:tcPr>
           <w:p>
-            <w:r/>
             <w:r>
-              <w:rPr>
-                <w:b w:val="0"/>
-                <w:sz w:val="18"/>
-              </w:rPr>
-              <w:t>15 to 20 minutes. This is a focused extension, not a full AI or machine learning unit.</w:t>
+              <w:t>15 to 20 minutes. The lesson is a focused supplement, not a full machine learning unit.</w:t>
             </w:r>
           </w:p>
         </w:tc>
@@ -148,33 +113,21 @@
       <w:tr>
         <w:tc>
           <w:tcPr>
-            <w:tcW w:type="dxa" w:w="2448"/>
-            <w:vAlign w:val="top"/>
+            <w:tcW w:type="dxa" w:w="5184"/>
           </w:tcPr>
           <w:p>
-            <w:r/>
             <w:r>
-              <w:rPr>
-                <w:b w:val="0"/>
-                <w:sz w:val="18"/>
-              </w:rPr>
               <w:t>Audience</w:t>
             </w:r>
           </w:p>
         </w:tc>
         <w:tc>
           <w:tcPr>
-            <w:tcW w:type="dxa" w:w="8208"/>
-            <w:vAlign w:val="top"/>
+            <w:tcW w:type="dxa" w:w="5184"/>
           </w:tcPr>
           <w:p>
-            <w:r/>
             <w:r>
-              <w:rPr>
-                <w:b w:val="0"/>
-                <w:sz w:val="18"/>
-              </w:rPr>
-              <w:t>Student-facing, reviewed by school leaders. Designed for Ursuline girls with AP extension notes available.</w:t>
+              <w:t>Student-facing extension for upper-school Ursuline students.</w:t>
             </w:r>
           </w:p>
         </w:tc>
@@ -182,33 +135,21 @@
       <w:tr>
         <w:tc>
           <w:tcPr>
-            <w:tcW w:type="dxa" w:w="2448"/>
-            <w:vAlign w:val="top"/>
+            <w:tcW w:type="dxa" w:w="5184"/>
           </w:tcPr>
           <w:p>
-            <w:r/>
             <w:r>
-              <w:rPr>
-                <w:b w:val="0"/>
-                <w:sz w:val="18"/>
-              </w:rPr>
               <w:t>Essential question</w:t>
             </w:r>
           </w:p>
         </w:tc>
         <w:tc>
           <w:tcPr>
-            <w:tcW w:type="dxa" w:w="8208"/>
-            <w:vAlign w:val="top"/>
+            <w:tcW w:type="dxa" w:w="5184"/>
           </w:tcPr>
           <w:p>
-            <w:r/>
             <w:r>
-              <w:rPr>
-                <w:b w:val="0"/>
-                <w:sz w:val="18"/>
-              </w:rPr>
-              <w:t>How does AI turn words into numbers, use patterns, and generate a response that still needs human review?</w:t>
+              <w:t>What happens after a prompt becomes math, and how do we decide whether to trust the result?</w:t>
             </w:r>
           </w:p>
         </w:tc>
@@ -216,32 +157,20 @@
       <w:tr>
         <w:tc>
           <w:tcPr>
-            <w:tcW w:type="dxa" w:w="2448"/>
-            <w:vAlign w:val="top"/>
+            <w:tcW w:type="dxa" w:w="5184"/>
           </w:tcPr>
           <w:p>
-            <w:r/>
             <w:r>
-              <w:rPr>
-                <w:b w:val="0"/>
-                <w:sz w:val="18"/>
-              </w:rPr>
               <w:t>Core thesis</w:t>
             </w:r>
           </w:p>
         </w:tc>
         <w:tc>
           <w:tcPr>
-            <w:tcW w:type="dxa" w:w="8208"/>
-            <w:vAlign w:val="top"/>
+            <w:tcW w:type="dxa" w:w="5184"/>
           </w:tcPr>
           <w:p>
-            <w:r/>
             <w:r>
-              <w:rPr>
-                <w:b w:val="0"/>
-                <w:sz w:val="18"/>
-              </w:rPr>
               <w:t>AI is not magic. It is math trained on patterns. Human wisdom decides whether, when, and how to use it.</w:t>
             </w:r>
           </w:p>
@@ -250,39 +179,26 @@
       <w:tr>
         <w:tc>
           <w:tcPr>
-            <w:tcW w:type="dxa" w:w="2448"/>
-            <w:vAlign w:val="top"/>
+            <w:tcW w:type="dxa" w:w="5184"/>
           </w:tcPr>
           <w:p>
-            <w:r/>
             <w:r>
-              <w:rPr>
-                <w:b w:val="0"/>
-                <w:sz w:val="18"/>
-              </w:rPr>
               <w:t>Mission fit</w:t>
             </w:r>
           </w:p>
         </w:tc>
         <w:tc>
           <w:tcPr>
-            <w:tcW w:type="dxa" w:w="8208"/>
-            <w:vAlign w:val="top"/>
+            <w:tcW w:type="dxa" w:w="5184"/>
           </w:tcPr>
           <w:p>
-            <w:r/>
             <w:r>
-              <w:rPr>
-                <w:b w:val="0"/>
-                <w:sz w:val="18"/>
-              </w:rPr>
-              <w:t>Serviam, intellectual curiosity, integrity, purposeful technology, young women as thoughtful builders and evaluators of AI systems.</w:t>
+              <w:t>Serviam, intellectual curiosity, integrity, purpose, presence, young women as builders, critics, and leaders of technology.</w:t>
             </w:r>
           </w:p>
         </w:tc>
       </w:tr>
     </w:tbl>
-    <w:p/>
     <w:p>
       <w:pPr>
         <w:pStyle w:val="Heading1"/>
@@ -296,7 +212,7 @@
         <w:pStyle w:val="ListBullet"/>
       </w:pPr>
       <w:r>
-        <w:t>I can describe an AI model as a learned function that maps input to output.</w:t>
+        <w:t>I can describe AI as a learned function that maps input to output.</w:t>
       </w:r>
     </w:p>
     <w:p>
@@ -304,7 +220,7 @@
         <w:pStyle w:val="ListBullet"/>
       </w:pPr>
       <w:r>
-        <w:t>I can explain how text becomes tokens, numbers, and vectors.</w:t>
+        <w:t>I can explain how text becomes tokens, token IDs, and vectors.</w:t>
       </w:r>
     </w:p>
     <w:p>
@@ -312,7 +228,7 @@
         <w:pStyle w:val="ListBullet"/>
       </w:pPr>
       <w:r>
-        <w:t>I can connect weights, loss, probability, and attention to math and computer science.</w:t>
+        <w:t>I can connect weights, loss, probability, attention, and loops to math and computer science ideas.</w:t>
       </w:r>
     </w:p>
     <w:p>
@@ -320,7 +236,7 @@
         <w:pStyle w:val="ListBullet"/>
       </w:pPr>
       <w:r>
-        <w:t>I can explain generation as a step-by-step loop.</w:t>
+        <w:t>I can explain why AI output is probable, not guaranteed true.</w:t>
       </w:r>
     </w:p>
     <w:p>
@@ -328,15 +244,7 @@
         <w:pStyle w:val="ListBullet"/>
       </w:pPr>
       <w:r>
-        <w:t>I can identify why AI output must still be tested, verified, and used responsibly.</w:t>
-      </w:r>
-    </w:p>
-    <w:p>
-      <w:pPr>
-        <w:pStyle w:val="ListBullet"/>
-      </w:pPr>
-      <w:r>
-        <w:t>I can connect technical AI understanding to Serviam and human judgment.</w:t>
+        <w:t>I can use human judgment to test, verify, and decide whether AI use serves learning and others.</w:t>
       </w:r>
     </w:p>
     <w:p>
@@ -352,7 +260,7 @@
         <w:pStyle w:val="ListBullet"/>
       </w:pPr>
       <w:r>
-        <w:t>Students can explain f(x) = y as input, model, output.</w:t>
+        <w:t>Students can explain f(x)=y as input, model, and output.</w:t>
       </w:r>
     </w:p>
     <w:p>
@@ -360,7 +268,7 @@
         <w:pStyle w:val="ListBullet"/>
       </w:pPr>
       <w:r>
-        <w:t>Students can define token, vector, weight, loss, probability, attention, and generation loop in student-friendly language.</w:t>
+        <w:t>Students can define token, vector, weight, loss, probability, attention, and loop in student-friendly language.</w:t>
       </w:r>
     </w:p>
     <w:p>
@@ -368,7 +276,7 @@
         <w:pStyle w:val="ListBullet"/>
       </w:pPr>
       <w:r>
-        <w:t>Students can identify one math idea, one CS idea, and one science idea behind AI.</w:t>
+        <w:t>Students can name one math idea, one CS idea, and one science idea behind AI.</w:t>
       </w:r>
     </w:p>
     <w:p>
@@ -384,47 +292,7 @@
         <w:pStyle w:val="ListBullet"/>
       </w:pPr>
       <w:r>
-        <w:t>Students can name one human responsibility in AI use.</w:t>
-      </w:r>
-    </w:p>
-    <w:p>
-      <w:pPr>
-        <w:pStyle w:val="Heading1"/>
-      </w:pPr>
-      <w:r>
-        <w:t>Materials</w:t>
-      </w:r>
-    </w:p>
-    <w:p>
-      <w:pPr>
-        <w:pStyle w:val="ListBullet"/>
-      </w:pPr>
-      <w:r>
-        <w:t>Student-facing Gamma deck: Inside AI, 12 slides.</w:t>
-      </w:r>
-    </w:p>
-    <w:p>
-      <w:pPr>
-        <w:pStyle w:val="ListBullet"/>
-      </w:pPr>
-      <w:r>
-        <w:t>Student handout: Inside AI Quick Reference Card.</w:t>
-      </w:r>
-    </w:p>
-    <w:p>
-      <w:pPr>
-        <w:pStyle w:val="ListBullet"/>
-      </w:pPr>
-      <w:r>
-        <w:t>Prepared visual examples for tokens, vectors, probability bars, and attention sentence.</w:t>
-      </w:r>
-    </w:p>
-    <w:p>
-      <w:pPr>
-        <w:pStyle w:val="ListBullet"/>
-      </w:pPr>
-      <w:r>
-        <w:t>Optional live AI tool only if stable. Prepared examples are preferred for a short sample lesson.</w:t>
+        <w:t>Students can connect model evaluation to Serviam, accuracy, fairness, privacy, and human oversight.</w:t>
       </w:r>
     </w:p>
     <w:p>
@@ -439,80 +307,51 @@
       <w:tblPr>
         <w:tblStyle w:val="TableGrid"/>
         <w:tblW w:type="auto" w:w="0"/>
-        <w:jc w:val="center"/>
         <w:tblLook w:firstColumn="1" w:firstRow="1" w:lastColumn="0" w:lastRow="0" w:noHBand="0" w:noVBand="1" w:val="04A0"/>
       </w:tblPr>
       <w:tblGrid>
-        <w:gridCol w:w="2556"/>
-        <w:gridCol w:w="2556"/>
-        <w:gridCol w:w="2556"/>
-        <w:gridCol w:w="2556"/>
+        <w:gridCol w:w="2592"/>
+        <w:gridCol w:w="2592"/>
+        <w:gridCol w:w="2592"/>
+        <w:gridCol w:w="2592"/>
       </w:tblGrid>
       <w:tr>
         <w:tc>
           <w:tcPr>
-            <w:tcW w:type="dxa" w:w="1584"/>
-            <w:shd w:fill="D9EAD3"/>
-            <w:vAlign w:val="center"/>
+            <w:tcW w:type="dxa" w:w="2592"/>
           </w:tcPr>
           <w:p>
-            <w:r/>
             <w:r>
-              <w:rPr>
-                <w:b/>
-                <w:sz w:val="18"/>
-              </w:rPr>
               <w:t>Time</w:t>
             </w:r>
           </w:p>
         </w:tc>
         <w:tc>
           <w:tcPr>
-            <w:tcW w:type="dxa" w:w="1440"/>
-            <w:shd w:fill="D9EAD3"/>
-            <w:vAlign w:val="center"/>
+            <w:tcW w:type="dxa" w:w="2592"/>
           </w:tcPr>
           <w:p>
-            <w:r/>
             <w:r>
-              <w:rPr>
-                <w:b/>
-                <w:sz w:val="18"/>
-              </w:rPr>
               <w:t>Slides</w:t>
             </w:r>
           </w:p>
         </w:tc>
         <w:tc>
           <w:tcPr>
-            <w:tcW w:type="dxa" w:w="3744"/>
-            <w:shd w:fill="D9EAD3"/>
-            <w:vAlign w:val="center"/>
+            <w:tcW w:type="dxa" w:w="2592"/>
           </w:tcPr>
           <w:p>
-            <w:r/>
             <w:r>
-              <w:rPr>
-                <w:b/>
-                <w:sz w:val="18"/>
-              </w:rPr>
               <w:t>Teacher move</w:t>
             </w:r>
           </w:p>
         </w:tc>
         <w:tc>
           <w:tcPr>
-            <w:tcW w:type="dxa" w:w="3888"/>
-            <w:shd w:fill="D9EAD3"/>
-            <w:vAlign w:val="center"/>
+            <w:tcW w:type="dxa" w:w="2592"/>
           </w:tcPr>
           <w:p>
-            <w:r/>
             <w:r>
-              <w:rPr>
-                <w:b/>
-                <w:sz w:val="18"/>
-              </w:rPr>
               <w:t>Student evidence</w:t>
             </w:r>
           </w:p>
@@ -521,65 +360,41 @@
       <w:tr>
         <w:tc>
           <w:tcPr>
-            <w:tcW w:type="dxa" w:w="1584"/>
-            <w:vAlign w:val="top"/>
+            <w:tcW w:type="dxa" w:w="2592"/>
           </w:tcPr>
           <w:p>
-            <w:r/>
             <w:r>
-              <w:rPr>
-                <w:b w:val="0"/>
-                <w:sz w:val="18"/>
-              </w:rPr>
               <w:t>0:00 to 1:30</w:t>
             </w:r>
           </w:p>
         </w:tc>
         <w:tc>
           <w:tcPr>
-            <w:tcW w:type="dxa" w:w="1440"/>
-            <w:vAlign w:val="top"/>
+            <w:tcW w:type="dxa" w:w="2592"/>
           </w:tcPr>
           <w:p>
-            <w:r/>
             <w:r>
-              <w:rPr>
-                <w:b w:val="0"/>
-                <w:sz w:val="18"/>
-              </w:rPr>
               <w:t>Slides 1 to 2</w:t>
             </w:r>
           </w:p>
         </w:tc>
         <w:tc>
           <w:tcPr>
-            <w:tcW w:type="dxa" w:w="3744"/>
-            <w:vAlign w:val="top"/>
+            <w:tcW w:type="dxa" w:w="2592"/>
           </w:tcPr>
           <w:p>
-            <w:r/>
             <w:r>
-              <w:rPr>
-                <w:b w:val="0"/>
-                <w:sz w:val="18"/>
-              </w:rPr>
-              <w:t>Frame Part 2 and ask the advanced question.</w:t>
+              <w:t>Connect to Part 1 and ask what happens after pressing Enter.</w:t>
             </w:r>
           </w:p>
         </w:tc>
         <w:tc>
           <w:tcPr>
-            <w:tcW w:type="dxa" w:w="3888"/>
-            <w:vAlign w:val="top"/>
+            <w:tcW w:type="dxa" w:w="2592"/>
           </w:tcPr>
           <w:p>
-            <w:r/>
             <w:r>
-              <w:rPr>
-                <w:b w:val="0"/>
-                <w:sz w:val="18"/>
-              </w:rPr>
-              <w:t>Students predict what happens between prompt and response.</w:t>
+              <w:t>Students predict steps in the AI pipeline.</w:t>
             </w:r>
           </w:p>
         </w:tc>
@@ -587,65 +402,41 @@
       <w:tr>
         <w:tc>
           <w:tcPr>
-            <w:tcW w:type="dxa" w:w="1584"/>
-            <w:vAlign w:val="top"/>
+            <w:tcW w:type="dxa" w:w="2592"/>
           </w:tcPr>
           <w:p>
-            <w:r/>
             <w:r>
-              <w:rPr>
-                <w:b w:val="0"/>
-                <w:sz w:val="18"/>
-              </w:rPr>
-              <w:t>1:30 to 3:00</w:t>
+              <w:t>1:30 to 3:30</w:t>
             </w:r>
           </w:p>
         </w:tc>
         <w:tc>
           <w:tcPr>
-            <w:tcW w:type="dxa" w:w="1440"/>
-            <w:vAlign w:val="top"/>
+            <w:tcW w:type="dxa" w:w="2592"/>
           </w:tcPr>
           <w:p>
-            <w:r/>
             <w:r>
-              <w:rPr>
-                <w:b w:val="0"/>
-                <w:sz w:val="18"/>
-              </w:rPr>
               <w:t>Slide 3</w:t>
             </w:r>
           </w:p>
         </w:tc>
         <w:tc>
           <w:tcPr>
-            <w:tcW w:type="dxa" w:w="3744"/>
-            <w:vAlign w:val="top"/>
+            <w:tcW w:type="dxa" w:w="2592"/>
           </w:tcPr>
           <w:p>
-            <w:r/>
             <w:r>
-              <w:rPr>
-                <w:b w:val="0"/>
-                <w:sz w:val="18"/>
-              </w:rPr>
               <w:t>Model AI as a learned function.</w:t>
             </w:r>
           </w:p>
         </w:tc>
         <w:tc>
           <w:tcPr>
-            <w:tcW w:type="dxa" w:w="3888"/>
-            <w:vAlign w:val="top"/>
+            <w:tcW w:type="dxa" w:w="2592"/>
           </w:tcPr>
           <w:p>
-            <w:r/>
             <w:r>
-              <w:rPr>
-                <w:b w:val="0"/>
-                <w:sz w:val="18"/>
-              </w:rPr>
-              <w:t>Students name input-output examples.</w:t>
+              <w:t>Students connect f(x)=y to CS methods and math functions.</w:t>
             </w:r>
           </w:p>
         </w:tc>
@@ -653,65 +444,41 @@
       <w:tr>
         <w:tc>
           <w:tcPr>
-            <w:tcW w:type="dxa" w:w="1584"/>
-            <w:vAlign w:val="top"/>
+            <w:tcW w:type="dxa" w:w="2592"/>
           </w:tcPr>
           <w:p>
-            <w:r/>
             <w:r>
-              <w:rPr>
-                <w:b w:val="0"/>
-                <w:sz w:val="18"/>
-              </w:rPr>
-              <w:t>3:00 to 4:30</w:t>
+              <w:t>3:30 to 5:30</w:t>
             </w:r>
           </w:p>
         </w:tc>
         <w:tc>
           <w:tcPr>
-            <w:tcW w:type="dxa" w:w="1440"/>
-            <w:vAlign w:val="top"/>
+            <w:tcW w:type="dxa" w:w="2592"/>
           </w:tcPr>
           <w:p>
-            <w:r/>
             <w:r>
-              <w:rPr>
-                <w:b w:val="0"/>
-                <w:sz w:val="18"/>
-              </w:rPr>
               <w:t>Slide 4</w:t>
             </w:r>
           </w:p>
         </w:tc>
         <w:tc>
           <w:tcPr>
-            <w:tcW w:type="dxa" w:w="3744"/>
-            <w:vAlign w:val="top"/>
+            <w:tcW w:type="dxa" w:w="2592"/>
           </w:tcPr>
           <w:p>
-            <w:r/>
             <w:r>
-              <w:rPr>
-                <w:b w:val="0"/>
-                <w:sz w:val="18"/>
-              </w:rPr>
-              <w:t>Connect AI training to scientific testing.</w:t>
+              <w:t>Frame data, training, and testing as scientific modeling.</w:t>
             </w:r>
           </w:p>
         </w:tc>
         <w:tc>
           <w:tcPr>
-            <w:tcW w:type="dxa" w:w="3888"/>
-            <w:vAlign w:val="top"/>
+            <w:tcW w:type="dxa" w:w="2592"/>
           </w:tcPr>
           <w:p>
-            <w:r/>
             <w:r>
-              <w:rPr>
-                <w:b w:val="0"/>
-                <w:sz w:val="18"/>
-              </w:rPr>
-              <w:t>Students explain why testing on new data matters.</w:t>
+              <w:t>Students explain why unseen test data matters.</w:t>
             </w:r>
           </w:p>
         </w:tc>
@@ -719,65 +486,41 @@
       <w:tr>
         <w:tc>
           <w:tcPr>
-            <w:tcW w:type="dxa" w:w="1584"/>
-            <w:vAlign w:val="top"/>
+            <w:tcW w:type="dxa" w:w="2592"/>
           </w:tcPr>
           <w:p>
-            <w:r/>
             <w:r>
-              <w:rPr>
-                <w:b w:val="0"/>
-                <w:sz w:val="18"/>
-              </w:rPr>
-              <w:t>4:30 to 7:00</w:t>
+              <w:t>5:30 to 8:00</w:t>
             </w:r>
           </w:p>
         </w:tc>
         <w:tc>
           <w:tcPr>
-            <w:tcW w:type="dxa" w:w="1440"/>
-            <w:vAlign w:val="top"/>
+            <w:tcW w:type="dxa" w:w="2592"/>
           </w:tcPr>
           <w:p>
-            <w:r/>
             <w:r>
-              <w:rPr>
-                <w:b w:val="0"/>
-                <w:sz w:val="18"/>
-              </w:rPr>
               <w:t>Slides 5 to 6</w:t>
             </w:r>
           </w:p>
         </w:tc>
         <w:tc>
           <w:tcPr>
-            <w:tcW w:type="dxa" w:w="3744"/>
-            <w:vAlign w:val="top"/>
+            <w:tcW w:type="dxa" w:w="2592"/>
           </w:tcPr>
           <w:p>
-            <w:r/>
             <w:r>
-              <w:rPr>
-                <w:b w:val="0"/>
-                <w:sz w:val="18"/>
-              </w:rPr>
-              <w:t>Explain tokens, vectors, and similarity.</w:t>
+              <w:t>Show tokens, vectors, and similarity.</w:t>
             </w:r>
           </w:p>
         </w:tc>
         <w:tc>
           <w:tcPr>
-            <w:tcW w:type="dxa" w:w="3888"/>
-            <w:vAlign w:val="top"/>
+            <w:tcW w:type="dxa" w:w="2592"/>
           </w:tcPr>
           <w:p>
-            <w:r/>
             <w:r>
-              <w:rPr>
-                <w:b w:val="0"/>
-                <w:sz w:val="18"/>
-              </w:rPr>
-              <w:t>Students sort related word pairs and explain similarity.</w:t>
+              <w:t>Students split a sentence and place words in clusters.</w:t>
             </w:r>
           </w:p>
         </w:tc>
@@ -785,65 +528,41 @@
       <w:tr>
         <w:tc>
           <w:tcPr>
-            <w:tcW w:type="dxa" w:w="1584"/>
-            <w:vAlign w:val="top"/>
+            <w:tcW w:type="dxa" w:w="2592"/>
           </w:tcPr>
           <w:p>
-            <w:r/>
             <w:r>
-              <w:rPr>
-                <w:b w:val="0"/>
-                <w:sz w:val="18"/>
-              </w:rPr>
-              <w:t>7:00 to 9:30</w:t>
+              <w:t>8:00 to 11:30</w:t>
             </w:r>
           </w:p>
         </w:tc>
         <w:tc>
           <w:tcPr>
-            <w:tcW w:type="dxa" w:w="1440"/>
-            <w:vAlign w:val="top"/>
+            <w:tcW w:type="dxa" w:w="2592"/>
           </w:tcPr>
           <w:p>
-            <w:r/>
             <w:r>
-              <w:rPr>
-                <w:b w:val="0"/>
-                <w:sz w:val="18"/>
-              </w:rPr>
-              <w:t>Slides 7 to 8</w:t>
+              <w:t>Slides 7 to 9</w:t>
             </w:r>
           </w:p>
         </w:tc>
         <w:tc>
           <w:tcPr>
-            <w:tcW w:type="dxa" w:w="3744"/>
-            <w:vAlign w:val="top"/>
+            <w:tcW w:type="dxa" w:w="2592"/>
           </w:tcPr>
           <w:p>
-            <w:r/>
             <w:r>
-              <w:rPr>
-                <w:b w:val="0"/>
-                <w:sz w:val="18"/>
-              </w:rPr>
-              <w:t>Show weights and learning from error.</w:t>
+              <w:t>Explain weights, learning from error, and probability.</w:t>
             </w:r>
           </w:p>
         </w:tc>
         <w:tc>
           <w:tcPr>
-            <w:tcW w:type="dxa" w:w="3888"/>
-            <w:vAlign w:val="top"/>
+            <w:tcW w:type="dxa" w:w="2592"/>
           </w:tcPr>
           <w:p>
-            <w:r/>
             <w:r>
-              <w:rPr>
-                <w:b w:val="0"/>
-                <w:sz w:val="18"/>
-              </w:rPr>
-              <w:t>Students connect feedback loops to draft revision.</w:t>
+              <w:t>Students compare this to revision, debugging, or practice.</w:t>
             </w:r>
           </w:p>
         </w:tc>
@@ -851,65 +570,41 @@
       <w:tr>
         <w:tc>
           <w:tcPr>
-            <w:tcW w:type="dxa" w:w="1584"/>
-            <w:vAlign w:val="top"/>
+            <w:tcW w:type="dxa" w:w="2592"/>
           </w:tcPr>
           <w:p>
-            <w:r/>
             <w:r>
-              <w:rPr>
-                <w:b w:val="0"/>
-                <w:sz w:val="18"/>
-              </w:rPr>
-              <w:t>9:30 to 12:00</w:t>
+              <w:t>11:30 to 15:30</w:t>
             </w:r>
           </w:p>
         </w:tc>
         <w:tc>
           <w:tcPr>
-            <w:tcW w:type="dxa" w:w="1440"/>
-            <w:vAlign w:val="top"/>
+            <w:tcW w:type="dxa" w:w="2592"/>
           </w:tcPr>
           <w:p>
-            <w:r/>
             <w:r>
-              <w:rPr>
-                <w:b w:val="0"/>
-                <w:sz w:val="18"/>
-              </w:rPr>
-              <w:t>Slide 9</w:t>
+              <w:t>Slides 10 to 11</w:t>
             </w:r>
           </w:p>
         </w:tc>
         <w:tc>
           <w:tcPr>
-            <w:tcW w:type="dxa" w:w="3744"/>
-            <w:vAlign w:val="top"/>
+            <w:tcW w:type="dxa" w:w="2592"/>
           </w:tcPr>
           <w:p>
-            <w:r/>
             <w:r>
-              <w:rPr>
-                <w:b w:val="0"/>
-                <w:sz w:val="18"/>
-              </w:rPr>
-              <w:t>Explain probability and next-token choice.</w:t>
+              <w:t>Explain attention and generation loop.</w:t>
             </w:r>
           </w:p>
         </w:tc>
         <w:tc>
           <w:tcPr>
-            <w:tcW w:type="dxa" w:w="3888"/>
-            <w:vAlign w:val="top"/>
+            <w:tcW w:type="dxa" w:w="2592"/>
           </w:tcPr>
           <w:p>
-            <w:r/>
             <w:r>
-              <w:rPr>
-                <w:b w:val="0"/>
-                <w:sz w:val="18"/>
-              </w:rPr>
-              <w:t>Students predict the next likely word and justify with context.</w:t>
+              <w:t>Students solve the pronoun-reference example and read simple pseudocode.</w:t>
             </w:r>
           </w:p>
         </w:tc>
@@ -917,214 +612,52 @@
       <w:tr>
         <w:tc>
           <w:tcPr>
-            <w:tcW w:type="dxa" w:w="1584"/>
-            <w:vAlign w:val="top"/>
+            <w:tcW w:type="dxa" w:w="2592"/>
           </w:tcPr>
           <w:p>
-            <w:r/>
             <w:r>
-              <w:rPr>
-                <w:b w:val="0"/>
-                <w:sz w:val="18"/>
-              </w:rPr>
-              <w:t>12:00 to 15:00</w:t>
+              <w:t>15:30 to 20:00</w:t>
             </w:r>
           </w:p>
         </w:tc>
         <w:tc>
           <w:tcPr>
-            <w:tcW w:type="dxa" w:w="1440"/>
-            <w:vAlign w:val="top"/>
+            <w:tcW w:type="dxa" w:w="2592"/>
           </w:tcPr>
           <w:p>
-            <w:r/>
             <w:r>
-              <w:rPr>
-                <w:b w:val="0"/>
-                <w:sz w:val="18"/>
-              </w:rPr>
-              <w:t>Slides 10 to 11</w:t>
-            </w:r>
-          </w:p>
-        </w:tc>
-        <w:tc>
-          <w:tcPr>
-            <w:tcW w:type="dxa" w:w="3744"/>
-            <w:vAlign w:val="top"/>
-          </w:tcPr>
-          <w:p>
-            <w:r/>
-            <w:r>
-              <w:rPr>
-                <w:b w:val="0"/>
-                <w:sz w:val="18"/>
-              </w:rPr>
-              <w:t>Explain attention and generation loop.</w:t>
-            </w:r>
-          </w:p>
-        </w:tc>
-        <w:tc>
-          <w:tcPr>
-            <w:tcW w:type="dxa" w:w="3888"/>
-            <w:vAlign w:val="top"/>
-          </w:tcPr>
-          <w:p>
-            <w:r/>
-            <w:r>
-              <w:rPr>
-                <w:b w:val="0"/>
-                <w:sz w:val="18"/>
-              </w:rPr>
-              <w:t>Students identify the referent in the attention sentence and summarize the loop.</w:t>
-            </w:r>
-          </w:p>
-        </w:tc>
-      </w:tr>
-      <w:tr>
-        <w:tc>
-          <w:tcPr>
-            <w:tcW w:type="dxa" w:w="1584"/>
-            <w:vAlign w:val="top"/>
-          </w:tcPr>
-          <w:p>
-            <w:r/>
-            <w:r>
-              <w:rPr>
-                <w:b w:val="0"/>
-                <w:sz w:val="18"/>
-              </w:rPr>
-              <w:t>15:00 to 18:30</w:t>
-            </w:r>
-          </w:p>
-        </w:tc>
-        <w:tc>
-          <w:tcPr>
-            <w:tcW w:type="dxa" w:w="1440"/>
-            <w:vAlign w:val="top"/>
-          </w:tcPr>
-          <w:p>
-            <w:r/>
-            <w:r>
-              <w:rPr>
-                <w:b w:val="0"/>
-                <w:sz w:val="18"/>
-              </w:rPr>
               <w:t>Slide 12</w:t>
             </w:r>
           </w:p>
         </w:tc>
         <w:tc>
           <w:tcPr>
-            <w:tcW w:type="dxa" w:w="3744"/>
-            <w:vAlign w:val="top"/>
+            <w:tcW w:type="dxa" w:w="2592"/>
           </w:tcPr>
           <w:p>
-            <w:r/>
             <w:r>
-              <w:rPr>
-                <w:b w:val="0"/>
-                <w:sz w:val="18"/>
-              </w:rPr>
               <w:t>Connect math, science, CS, and Serviam.</w:t>
             </w:r>
           </w:p>
         </w:tc>
         <w:tc>
           <w:tcPr>
-            <w:tcW w:type="dxa" w:w="3888"/>
-            <w:vAlign w:val="top"/>
+            <w:tcW w:type="dxa" w:w="2592"/>
           </w:tcPr>
           <w:p>
-            <w:r/>
             <w:r>
-              <w:rPr>
-                <w:b w:val="0"/>
-                <w:sz w:val="18"/>
-              </w:rPr>
-              <w:t>Students complete the four-part exit ticket.</w:t>
-            </w:r>
-          </w:p>
-        </w:tc>
-      </w:tr>
-      <w:tr>
-        <w:tc>
-          <w:tcPr>
-            <w:tcW w:type="dxa" w:w="1584"/>
-            <w:vAlign w:val="top"/>
-          </w:tcPr>
-          <w:p>
-            <w:r/>
-            <w:r>
-              <w:rPr>
-                <w:b w:val="0"/>
-                <w:sz w:val="18"/>
-              </w:rPr>
-              <w:t>18:30 to 20:00</w:t>
-            </w:r>
-          </w:p>
-        </w:tc>
-        <w:tc>
-          <w:tcPr>
-            <w:tcW w:type="dxa" w:w="1440"/>
-            <w:vAlign w:val="top"/>
-          </w:tcPr>
-          <w:p>
-            <w:r/>
-            <w:r>
-              <w:rPr>
-                <w:b w:val="0"/>
-                <w:sz w:val="18"/>
-              </w:rPr>
-              <w:t>Backup</w:t>
-            </w:r>
-          </w:p>
-        </w:tc>
-        <w:tc>
-          <w:tcPr>
-            <w:tcW w:type="dxa" w:w="3744"/>
-            <w:vAlign w:val="top"/>
-          </w:tcPr>
-          <w:p>
-            <w:r/>
-            <w:r>
-              <w:rPr>
-                <w:b w:val="0"/>
-                <w:sz w:val="18"/>
-              </w:rPr>
-              <w:t>Use only if time remains.</w:t>
-            </w:r>
-          </w:p>
-        </w:tc>
-        <w:tc>
-          <w:tcPr>
-            <w:tcW w:type="dxa" w:w="3888"/>
-            <w:vAlign w:val="top"/>
-          </w:tcPr>
-          <w:p>
-            <w:r/>
-            <w:r>
-              <w:rPr>
-                <w:b w:val="0"/>
-                <w:sz w:val="18"/>
-              </w:rPr>
-              <w:t>Students share one response or ask one question.</w:t>
+              <w:t>Students complete one math idea, one CS idea, one science idea, one human responsibility.</w:t>
             </w:r>
           </w:p>
         </w:tc>
       </w:tr>
     </w:tbl>
-    <w:p/>
     <w:p>
       <w:pPr>
         <w:pStyle w:val="Heading1"/>
       </w:pPr>
       <w:r>
-        <w:t>Main activity structure</w:t>
-      </w:r>
-    </w:p>
-    <w:p>
-      <w:r>
-        <w:t>This short extension uses micro-activities rather than one long activity:</w:t>
+        <w:t>Best-practice design notes</w:t>
       </w:r>
     </w:p>
     <w:p>
@@ -1132,7 +665,7 @@
         <w:pStyle w:val="ListBullet"/>
       </w:pPr>
       <w:r>
-        <w:t>Prediction check: What happens between prompt and response?</w:t>
+        <w:t>Uses prediction before explanation to activate prior knowledge.</w:t>
       </w:r>
     </w:p>
     <w:p>
@@ -1140,7 +673,7 @@
         <w:pStyle w:val="ListBullet"/>
       </w:pPr>
       <w:r>
-        <w:t>Function transfer: name an input-output pair.</w:t>
+        <w:t>Uses visual models to reduce cognitive load.</w:t>
       </w:r>
     </w:p>
     <w:p>
@@ -1148,7 +681,7 @@
         <w:pStyle w:val="ListBullet"/>
       </w:pPr>
       <w:r>
-        <w:t>Vector similarity sort: decide which concepts belong close together.</w:t>
+        <w:t>Uses visible thinking through short prediction, clustering, and exit routines.</w:t>
       </w:r>
     </w:p>
     <w:p>
@@ -1156,7 +689,7 @@
         <w:pStyle w:val="ListBullet"/>
       </w:pPr>
       <w:r>
-        <w:t>Attention decoder: identify what "it" refers to in a sentence.</w:t>
+        <w:t>Uses active learning instead of lecture-only delivery.</w:t>
       </w:r>
     </w:p>
     <w:p>
@@ -1164,7 +697,23 @@
         <w:pStyle w:val="ListBullet"/>
       </w:pPr>
       <w:r>
-        <w:t>Exit ticket: one math idea, one CS idea, one science idea, one human responsibility.</w:t>
+        <w:t>Uses UDL by combining words, diagrams, formulas, examples, and verbal explanation.</w:t>
+      </w:r>
+    </w:p>
+    <w:p>
+      <w:pPr>
+        <w:pStyle w:val="ListBullet"/>
+      </w:pPr>
+      <w:r>
+        <w:t>Uses metacognitive closure through an exit ticket.</w:t>
+      </w:r>
+    </w:p>
+    <w:p>
+      <w:pPr>
+        <w:pStyle w:val="ListBullet"/>
+      </w:pPr>
+      <w:r>
+        <w:t>Uses Serviam to connect technical skill to purpose, integrity, and responsible use.</w:t>
       </w:r>
     </w:p>
     <w:p>
@@ -1179,44 +728,29 @@
       <w:tblPr>
         <w:tblStyle w:val="TableGrid"/>
         <w:tblW w:type="auto" w:w="0"/>
-        <w:jc w:val="center"/>
         <w:tblLook w:firstColumn="1" w:firstRow="1" w:lastColumn="0" w:lastRow="0" w:noHBand="0" w:noVBand="1" w:val="04A0"/>
       </w:tblPr>
       <w:tblGrid>
-        <w:gridCol w:w="5112"/>
-        <w:gridCol w:w="5112"/>
+        <w:gridCol w:w="5184"/>
+        <w:gridCol w:w="5184"/>
       </w:tblGrid>
       <w:tr>
         <w:tc>
           <w:tcPr>
-            <w:tcW w:type="dxa" w:w="2016"/>
-            <w:shd w:fill="D9EAD3"/>
-            <w:vAlign w:val="center"/>
+            <w:tcW w:type="dxa" w:w="5184"/>
           </w:tcPr>
           <w:p>
-            <w:r/>
             <w:r>
-              <w:rPr>
-                <w:b/>
-                <w:sz w:val="18"/>
-              </w:rPr>
-              <w:t>Band</w:t>
+              <w:t>Group</w:t>
             </w:r>
           </w:p>
         </w:tc>
         <w:tc>
           <w:tcPr>
-            <w:tcW w:type="dxa" w:w="8064"/>
-            <w:shd w:fill="D9EAD3"/>
-            <w:vAlign w:val="center"/>
+            <w:tcW w:type="dxa" w:w="5184"/>
           </w:tcPr>
           <w:p>
-            <w:r/>
             <w:r>
-              <w:rPr>
-                <w:b/>
-                <w:sz w:val="18"/>
-              </w:rPr>
               <w:t>Adjustment</w:t>
             </w:r>
           </w:p>
@@ -1225,33 +759,21 @@
       <w:tr>
         <w:tc>
           <w:tcPr>
-            <w:tcW w:type="dxa" w:w="2016"/>
-            <w:vAlign w:val="top"/>
+            <w:tcW w:type="dxa" w:w="5184"/>
           </w:tcPr>
           <w:p>
-            <w:r/>
             <w:r>
-              <w:rPr>
-                <w:b w:val="0"/>
-                <w:sz w:val="18"/>
-              </w:rPr>
-              <w:t>Support</w:t>
+              <w:t>Students needing support</w:t>
             </w:r>
           </w:p>
         </w:tc>
         <w:tc>
           <w:tcPr>
-            <w:tcW w:type="dxa" w:w="8064"/>
-            <w:vAlign w:val="top"/>
+            <w:tcW w:type="dxa" w:w="5184"/>
           </w:tcPr>
           <w:p>
-            <w:r/>
             <w:r>
-              <w:rPr>
-                <w:b w:val="0"/>
-                <w:sz w:val="18"/>
-              </w:rPr>
-              <w:t>Use diagrams, sentence stems, and everyday analogies before formulas.</w:t>
+              <w:t>Use only the pathway, definitions, and diagrams. Skip formulas except f(x)=y.</w:t>
             </w:r>
           </w:p>
         </w:tc>
@@ -1259,33 +781,21 @@
       <w:tr>
         <w:tc>
           <w:tcPr>
-            <w:tcW w:type="dxa" w:w="2016"/>
-            <w:vAlign w:val="top"/>
+            <w:tcW w:type="dxa" w:w="5184"/>
           </w:tcPr>
           <w:p>
-            <w:r/>
             <w:r>
-              <w:rPr>
-                <w:b w:val="0"/>
-                <w:sz w:val="18"/>
-              </w:rPr>
-              <w:t>Grade 10</w:t>
+              <w:t>Grade 10 baseline</w:t>
             </w:r>
           </w:p>
         </w:tc>
         <w:tc>
           <w:tcPr>
-            <w:tcW w:type="dxa" w:w="8064"/>
-            <w:vAlign w:val="top"/>
+            <w:tcW w:type="dxa" w:w="5184"/>
           </w:tcPr>
           <w:p>
-            <w:r/>
             <w:r>
-              <w:rPr>
-                <w:b w:val="0"/>
-                <w:sz w:val="18"/>
-              </w:rPr>
-              <w:t>Keep vectors as lists of numbers and probability as likely choices. Avoid full attention formula.</w:t>
+              <w:t>Use all 12 slides, but keep formulas as intuition.</w:t>
             </w:r>
           </w:p>
         </w:tc>
@@ -1293,33 +803,21 @@
       <w:tr>
         <w:tc>
           <w:tcPr>
-            <w:tcW w:type="dxa" w:w="2016"/>
-            <w:vAlign w:val="top"/>
+            <w:tcW w:type="dxa" w:w="5184"/>
           </w:tcPr>
           <w:p>
-            <w:r/>
             <w:r>
-              <w:rPr>
-                <w:b w:val="0"/>
-                <w:sz w:val="18"/>
-              </w:rPr>
-              <w:t>Grade 11</w:t>
+              <w:t>Grade 11 or AP extension</w:t>
             </w:r>
           </w:p>
         </w:tc>
         <w:tc>
           <w:tcPr>
-            <w:tcW w:type="dxa" w:w="8064"/>
-            <w:vAlign w:val="top"/>
+            <w:tcW w:type="dxa" w:w="5184"/>
           </w:tcPr>
           <w:p>
-            <w:r/>
             <w:r>
-              <w:rPr>
-                <w:b w:val="0"/>
-                <w:sz w:val="18"/>
-              </w:rPr>
-              <w:t>Add weighted sums, loss, and pseudocode loop.</w:t>
+              <w:t>Add dot product, softmax formula, attention formula, gradient descent notation, and Java-style pseudocode in speaker notes.</w:t>
             </w:r>
           </w:p>
         </w:tc>
@@ -1327,113 +825,32 @@
       <w:tr>
         <w:tc>
           <w:tcPr>
-            <w:tcW w:type="dxa" w:w="2016"/>
-            <w:vAlign w:val="top"/>
+            <w:tcW w:type="dxa" w:w="5184"/>
           </w:tcPr>
           <w:p>
-            <w:r/>
             <w:r>
-              <w:rPr>
-                <w:b w:val="0"/>
-                <w:sz w:val="18"/>
-              </w:rPr>
-              <w:t>AP CSP</w:t>
+              <w:t>Fast finishers</w:t>
             </w:r>
           </w:p>
         </w:tc>
         <w:tc>
           <w:tcPr>
-            <w:tcW w:type="dxa" w:w="8064"/>
-            <w:vAlign w:val="top"/>
+            <w:tcW w:type="dxa" w:w="5184"/>
           </w:tcPr>
           <w:p>
-            <w:r/>
             <w:r>
-              <w:rPr>
-                <w:b w:val="0"/>
-                <w:sz w:val="18"/>
-              </w:rPr>
-              <w:t>Connect to abstraction, algorithms, data, and computing impacts.</w:t>
-            </w:r>
-          </w:p>
-        </w:tc>
-      </w:tr>
-      <w:tr>
-        <w:tc>
-          <w:tcPr>
-            <w:tcW w:type="dxa" w:w="2016"/>
-            <w:vAlign w:val="top"/>
-          </w:tcPr>
-          <w:p>
-            <w:r/>
-            <w:r>
-              <w:rPr>
-                <w:b w:val="0"/>
-                <w:sz w:val="18"/>
-              </w:rPr>
-              <w:t>AP CSA</w:t>
-            </w:r>
-          </w:p>
-        </w:tc>
-        <w:tc>
-          <w:tcPr>
-            <w:tcW w:type="dxa" w:w="8064"/>
-            <w:vAlign w:val="top"/>
-          </w:tcPr>
-          <w:p>
-            <w:r/>
-            <w:r>
-              <w:rPr>
-                <w:b w:val="0"/>
-                <w:sz w:val="18"/>
-              </w:rPr>
-              <w:t>Connect to functions, loops, arrays, methods, and testing.</w:t>
-            </w:r>
-          </w:p>
-        </w:tc>
-      </w:tr>
-      <w:tr>
-        <w:tc>
-          <w:tcPr>
-            <w:tcW w:type="dxa" w:w="2016"/>
-            <w:vAlign w:val="top"/>
-          </w:tcPr>
-          <w:p>
-            <w:r/>
-            <w:r>
-              <w:rPr>
-                <w:b w:val="0"/>
-                <w:sz w:val="18"/>
-              </w:rPr>
-              <w:t>Extension</w:t>
-            </w:r>
-          </w:p>
-        </w:tc>
-        <w:tc>
-          <w:tcPr>
-            <w:tcW w:type="dxa" w:w="8064"/>
-            <w:vAlign w:val="top"/>
-          </w:tcPr>
-          <w:p>
-            <w:r/>
-            <w:r>
-              <w:rPr>
-                <w:b w:val="0"/>
-                <w:sz w:val="18"/>
-              </w:rPr>
-              <w:t>Mention embeddings, softmax, attention formula, model cards, and evaluation dimensions.</w:t>
+              <w:t>Ask them to label which part of the pipeline is math, CS, science, or human judgment.</w:t>
             </w:r>
           </w:p>
         </w:tc>
       </w:tr>
     </w:tbl>
-    <w:p/>
     <w:p>
       <w:pPr>
         <w:pStyle w:val="Heading1"/>
       </w:pPr>
       <w:r>
-        <w:t>Standards and framework alignment</w:t>
+        <w:t>Assessment</w:t>
       </w:r>
     </w:p>
     <w:p>
@@ -1441,7 +858,7 @@
         <w:pStyle w:val="ListBullet"/>
       </w:pPr>
       <w:r>
-        <w:t>AP CSP: abstraction, algorithms, data, computing impacts, and responsible innovation.</w:t>
+        <w:t>Exit ticket: one math idea, one computer science idea, one science idea, one human responsibility.</w:t>
       </w:r>
     </w:p>
     <w:p>
@@ -1449,7 +866,7 @@
         <w:pStyle w:val="ListBullet"/>
       </w:pPr>
       <w:r>
-        <w:t>AP CSA: functions/methods, variables, loops, arrays, program behavior, debugging, and testing.</w:t>
+        <w:t>Teacher observation: can students explain why AI output needs review?</w:t>
       </w:r>
     </w:p>
     <w:p>
@@ -1457,7 +874,7 @@
         <w:pStyle w:val="ListBullet"/>
       </w:pPr>
       <w:r>
-        <w:t>CSTA AI Learning Priorities: humans and AI, representation and reasoning, machine learning, ethical AI design, and societal impacts.</w:t>
+        <w:t>Student discussion: can students distinguish calculated similarity from human meaning?</w:t>
       </w:r>
     </w:p>
     <w:p>
@@ -1465,89 +882,12 @@
         <w:pStyle w:val="ListBullet"/>
       </w:pPr>
       <w:r>
-        <w:t>AI4K12: representation and reasoning, learning, and societal impact.</w:t>
-      </w:r>
-    </w:p>
-    <w:p>
-      <w:pPr>
-        <w:pStyle w:val="ListBullet"/>
-      </w:pPr>
-      <w:r>
-        <w:t>Ursuline alignment: Serviam, I.D.E.A. Hub, coding, robotics, digital citizenship, and purposeful technology.</w:t>
-      </w:r>
-    </w:p>
-    <w:p>
-      <w:pPr>
-        <w:pStyle w:val="Heading1"/>
-      </w:pPr>
-      <w:r>
-        <w:t>Why this works as a teaching audition</w:t>
-      </w:r>
-    </w:p>
-    <w:p>
-      <w:pPr>
-        <w:pStyle w:val="ListBullet"/>
-      </w:pPr>
-      <w:r>
-        <w:t>It extends the required lesson without making the required lesson too technical.</w:t>
-      </w:r>
-    </w:p>
-    <w:p>
-      <w:pPr>
-        <w:pStyle w:val="ListBullet"/>
-      </w:pPr>
-      <w:r>
-        <w:t>It shows mathematical thinking through functions, vectors, weights, loss, and probability.</w:t>
-      </w:r>
-    </w:p>
-    <w:p>
-      <w:pPr>
-        <w:pStyle w:val="ListBullet"/>
-      </w:pPr>
-      <w:r>
-        <w:t>It shows computer science thinking through input-output, algorithms, loops, and pseudocode.</w:t>
-      </w:r>
-    </w:p>
-    <w:p>
-      <w:pPr>
-        <w:pStyle w:val="ListBullet"/>
-      </w:pPr>
-      <w:r>
-        <w:t>It shows science thinking through data, testing, error, evaluation, and evidence.</w:t>
-      </w:r>
-    </w:p>
-    <w:p>
-      <w:pPr>
-        <w:pStyle w:val="ListBullet"/>
-      </w:pPr>
-      <w:r>
-        <w:t>It uses active learning and visible thinking instead of lecture-only delivery.</w:t>
-      </w:r>
-    </w:p>
-    <w:p>
-      <w:pPr>
-        <w:pStyle w:val="ListBullet"/>
-      </w:pPr>
-      <w:r>
-        <w:t>It closes with Serviam so the technical lesson remains human-centered.</w:t>
-      </w:r>
-    </w:p>
-    <w:p>
-      <w:pPr>
-        <w:pStyle w:val="Heading1"/>
-      </w:pPr>
-      <w:r>
-        <w:t>Source note</w:t>
-      </w:r>
-    </w:p>
-    <w:p>
-      <w:r>
-        <w:t>Full citation details are included in the companion Research Source Map. Key sources include Ursuline Academy official mission and technology pages, College Board AP CSP and AP CSA, Google ML Crash Course, Vaswani et al., CSTA, AI4K12, UNESCO, NIST, PBLWorks, Harvard Project Zero, CAST UDL, and Freeman et al. active learning research.</w:t>
+        <w:t>Optional prompt: explain the AI pipeline in four sentences for a 9th grader.</w:t>
       </w:r>
     </w:p>
     <w:sectPr>
       <w:pgSz w:w="12240" w:h="15840"/>
-      <w:pgMar w:top="864" w:right="1008" w:bottom="864" w:left="1008" w:header="720" w:footer="720" w:gutter="0"/>
+      <w:pgMar w:top="792" w:right="936" w:bottom="792" w:left="936" w:header="720" w:footer="720" w:gutter="0"/>
       <w:cols w:space="720"/>
       <w:docGrid w:linePitch="360"/>
     </w:sectPr>
@@ -1919,8 +1259,8 @@
     <w:qFormat/>
     <w:rsid w:val="00FC693F"/>
     <w:rPr>
-      <w:rFonts w:ascii="Aptos" w:hAnsi="Aptos" w:eastAsia="Aptos"/>
-      <w:sz w:val="20"/>
+      <w:rFonts w:ascii="Aptos" w:hAnsi="Aptos"/>
+      <w:sz w:val="21"/>
     </w:rPr>
   </w:style>
   <w:style w:type="paragraph" w:styleId="Header">
@@ -1982,7 +1322,7 @@
       <w:outlineLvl w:val="0"/>
     </w:pPr>
     <w:rPr>
-      <w:rFonts w:asciiTheme="majorHAnsi" w:eastAsiaTheme="majorEastAsia" w:hAnsiTheme="majorHAnsi" w:cstheme="majorBidi"/>
+      <w:rFonts w:asciiTheme="majorHAnsi" w:eastAsiaTheme="majorEastAsia" w:hAnsiTheme="majorHAnsi" w:cstheme="majorBidi" w:ascii="Aptos Display" w:hAnsi="Aptos Display"/>
       <w:b/>
       <w:bCs/>
       <w:color w:val="365F91" w:themeColor="accent1" w:themeShade="BF"/>
@@ -2006,7 +1346,7 @@
       <w:outlineLvl w:val="1"/>
     </w:pPr>
     <w:rPr>
-      <w:rFonts w:asciiTheme="majorHAnsi" w:eastAsiaTheme="majorEastAsia" w:hAnsiTheme="majorHAnsi" w:cstheme="majorBidi"/>
+      <w:rFonts w:asciiTheme="majorHAnsi" w:eastAsiaTheme="majorEastAsia" w:hAnsiTheme="majorHAnsi" w:cstheme="majorBidi" w:ascii="Aptos Display" w:hAnsi="Aptos Display"/>
       <w:b/>
       <w:bCs/>
       <w:color w:val="4F81BD" w:themeColor="accent1"/>
@@ -2030,7 +1370,7 @@
       <w:outlineLvl w:val="2"/>
     </w:pPr>
     <w:rPr>
-      <w:rFonts w:asciiTheme="majorHAnsi" w:eastAsiaTheme="majorEastAsia" w:hAnsiTheme="majorHAnsi" w:cstheme="majorBidi"/>
+      <w:rFonts w:asciiTheme="majorHAnsi" w:eastAsiaTheme="majorEastAsia" w:hAnsiTheme="majorHAnsi" w:cstheme="majorBidi" w:ascii="Aptos Display" w:hAnsi="Aptos Display"/>
       <w:b/>
       <w:bCs/>
       <w:color w:val="4F81BD" w:themeColor="accent1"/>

</xml_diff>

<commit_message>
Refresh Ursuline branded handouts and lesson plans.
Replace Pt 1/Pt 2 student and teacher docx artifacts with branded Downloads versions; document paths in artifacts README.

Co-authored-by: Cursor <cursoragent@cursor.com>
</commit_message>
<xml_diff>
--- a/public/artifacts/team/ursuline_part2_teacher_lesson_plan.docx
+++ b/public/artifacts/team/ursuline_part2_teacher_lesson_plan.docx
@@ -1,66 +1,131 @@
 
 <file path=word/document.xml><?xml version="1.0" encoding="utf-8"?>
-<w:document xmlns:ns1="http://schemas.openxmlformats.org/markup-compatibility/2006" xmlns:w="http://schemas.openxmlformats.org/wordprocessingml/2006/main" ns1:Ignorable="w14 wp14">
+<w:document xmlns:wpc="http://schemas.microsoft.com/office/word/2010/wordprocessingCanvas" xmlns:mo="http://schemas.microsoft.com/office/mac/office/2008/main" xmlns:mc="http://schemas.openxmlformats.org/markup-compatibility/2006" xmlns:mv="urn:schemas-microsoft-com:mac:vml" xmlns:o="urn:schemas-microsoft-com:office:office" xmlns:r="http://schemas.openxmlformats.org/officeDocument/2006/relationships" xmlns:m="http://schemas.openxmlformats.org/officeDocument/2006/math" xmlns:v="urn:schemas-microsoft-com:vml" xmlns:wp14="http://schemas.microsoft.com/office/word/2010/wordprocessingDrawing" xmlns:wp="http://schemas.openxmlformats.org/drawingml/2006/wordprocessingDrawing" xmlns:w10="urn:schemas-microsoft-com:office:word" xmlns:w="http://schemas.openxmlformats.org/wordprocessingml/2006/main" xmlns:w14="http://schemas.microsoft.com/office/word/2010/wordml" xmlns:wpg="http://schemas.microsoft.com/office/word/2010/wordprocessingGroup" xmlns:wpi="http://schemas.microsoft.com/office/word/2010/wordprocessingInk" xmlns:wne="http://schemas.microsoft.com/office/word/2006/wordml" xmlns:wps="http://schemas.microsoft.com/office/word/2010/wordprocessingShape" mc:Ignorable="w14 wp14">
   <w:body>
     <w:p>
       <w:pPr>
-        <w:jc w:val="center"/>
+        <w:spacing w:before="80" w:after="40"/>
       </w:pPr>
       <w:r>
         <w:rPr>
+          <w:rFonts w:ascii="Georgia" w:hAnsi="Georgia"/>
           <w:b/>
-          <w:sz w:val="36"/>
+          <w:color w:val="003F35"/>
+          <w:sz w:val="44"/>
         </w:rPr>
         <w:t>Inside AI: The Math, Science, and Code Behind Intelligent Tools</w:t>
       </w:r>
     </w:p>
     <w:p>
       <w:pPr>
-        <w:jc w:val="center"/>
+        <w:spacing w:after="160"/>
       </w:pPr>
       <w:r>
         <w:rPr>
+          <w:rFonts w:ascii="Aptos" w:hAnsi="Aptos"/>
           <w:i/>
-          <w:sz w:val="22"/>
+          <w:color w:val="616E69"/>
+          <w:sz w:val="20"/>
         </w:rPr>
         <w:t>A 10th/11th-grade extension to AI, the Brain, and Serviam</w:t>
       </w:r>
     </w:p>
     <w:p>
       <w:pPr>
-        <w:pStyle w:val="Heading1"/>
+        <w:spacing w:before="0" w:after="120"/>
+        <w:pBdr>
+          <w:bottom w:val="single" w:sz="10" w:space="1" w:color="005C49"/>
+        </w:pBdr>
+      </w:pPr>
+    </w:p>
+    <w:p>
+      <w:pPr>
+        <w:spacing w:before="160" w:after="60"/>
       </w:pPr>
       <w:r>
-        <w:t>Lesson snapshot</w:t>
+        <w:rPr>
+          <w:rFonts w:ascii="Aptos" w:hAnsi="Aptos"/>
+          <w:b/>
+          <w:color w:val="B68A3A"/>
+          <w:sz w:val="17"/>
+        </w:rPr>
+        <w:t>LESSON SNAPSHOT</w:t>
       </w:r>
     </w:p>
     <w:tbl>
       <w:tblPr>
-        <w:tblStyle w:val="TableGrid"/>
         <w:tblW w:type="auto" w:w="0"/>
+        <w:jc w:val="center"/>
+        <w:tblLayout w:type="autofit"/>
         <w:tblLook w:firstColumn="1" w:firstRow="1" w:lastColumn="0" w:lastRow="0" w:noHBand="0" w:noVBand="1" w:val="04A0"/>
       </w:tblPr>
       <w:tblGrid>
-        <w:gridCol w:w="5184"/>
-        <w:gridCol w:w="5184"/>
+        <w:gridCol w:w="5256"/>
+        <w:gridCol w:w="5256"/>
       </w:tblGrid>
       <w:tr>
         <w:tc>
           <w:tcPr>
-            <w:tcW w:type="dxa" w:w="5184"/>
+            <w:tcW w:type="dxa" w:w="2304"/>
+            <w:shd w:fill="005C49"/>
+            <w:tcBorders>
+              <w:top w:val="single" w:sz="6" w:space="0" w:color="005C49"/>
+              <w:left w:val="single" w:sz="6" w:space="0" w:color="005C49"/>
+              <w:bottom w:val="single" w:sz="6" w:space="0" w:color="005C49"/>
+              <w:right w:val="single" w:sz="6" w:space="0" w:color="005C49"/>
+            </w:tcBorders>
+            <w:tcMar>
+              <w:top w:w="80" w:type="dxa"/>
+              <w:bottom w:w="80" w:type="dxa"/>
+              <w:left w:w="100" w:type="dxa"/>
+              <w:right w:w="100" w:type="dxa"/>
+            </w:tcMar>
           </w:tcPr>
           <w:p>
+            <w:pPr>
+              <w:spacing w:after="40" w:line="252" w:lineRule="auto"/>
+            </w:pPr>
             <w:r>
+              <w:rPr>
+                <w:rFonts w:ascii="Aptos" w:hAnsi="Aptos"/>
+                <w:b/>
+                <w:i w:val="0"/>
+                <w:color w:val="FFFFFF"/>
+                <w:sz w:val="16"/>
+              </w:rPr>
               <w:t>Category</w:t>
             </w:r>
           </w:p>
         </w:tc>
         <w:tc>
           <w:tcPr>
-            <w:tcW w:type="dxa" w:w="5184"/>
+            <w:tcW w:type="dxa" w:w="7920"/>
+            <w:shd w:fill="005C49"/>
+            <w:tcBorders>
+              <w:top w:val="single" w:sz="6" w:space="0" w:color="005C49"/>
+              <w:left w:val="single" w:sz="6" w:space="0" w:color="005C49"/>
+              <w:bottom w:val="single" w:sz="6" w:space="0" w:color="005C49"/>
+              <w:right w:val="single" w:sz="6" w:space="0" w:color="005C49"/>
+            </w:tcBorders>
+            <w:tcMar>
+              <w:top w:w="80" w:type="dxa"/>
+              <w:bottom w:w="80" w:type="dxa"/>
+              <w:left w:w="100" w:type="dxa"/>
+              <w:right w:w="100" w:type="dxa"/>
+            </w:tcMar>
           </w:tcPr>
           <w:p>
+            <w:pPr>
+              <w:spacing w:after="40" w:line="252" w:lineRule="auto"/>
+            </w:pPr>
             <w:r>
+              <w:rPr>
+                <w:rFonts w:ascii="Aptos" w:hAnsi="Aptos"/>
+                <w:b/>
+                <w:i w:val="0"/>
+                <w:color w:val="FFFFFF"/>
+                <w:sz w:val="16"/>
+              </w:rPr>
               <w:t>Plan</w:t>
             </w:r>
           </w:p>
@@ -69,20 +134,64 @@
       <w:tr>
         <w:tc>
           <w:tcPr>
-            <w:tcW w:type="dxa" w:w="5184"/>
+            <w:tcW w:type="dxa" w:w="5256"/>
+            <w:shd w:fill="FFFFFF"/>
+            <w:tcBorders>
+              <w:top w:val="single" w:sz="6" w:space="0" w:color="D8E1DD"/>
+              <w:left w:val="single" w:sz="6" w:space="0" w:color="D8E1DD"/>
+              <w:bottom w:val="single" w:sz="6" w:space="0" w:color="D8E1DD"/>
+              <w:right w:val="single" w:sz="6" w:space="0" w:color="D8E1DD"/>
+            </w:tcBorders>
+            <w:tcMar>
+              <w:top w:w="80" w:type="dxa"/>
+              <w:bottom w:w="80" w:type="dxa"/>
+              <w:left w:w="100" w:type="dxa"/>
+              <w:right w:w="100" w:type="dxa"/>
+            </w:tcMar>
           </w:tcPr>
           <w:p>
+            <w:pPr>
+              <w:spacing w:after="40" w:line="252" w:lineRule="auto"/>
+            </w:pPr>
             <w:r>
+              <w:rPr>
+                <w:rFonts w:ascii="Aptos" w:hAnsi="Aptos"/>
+                <w:i w:val="0"/>
+                <w:color w:val="17231F"/>
+                <w:sz w:val="16"/>
+              </w:rPr>
               <w:t>Course or context</w:t>
             </w:r>
           </w:p>
         </w:tc>
         <w:tc>
           <w:tcPr>
-            <w:tcW w:type="dxa" w:w="5184"/>
+            <w:tcW w:type="dxa" w:w="5256"/>
+            <w:shd w:fill="FFFFFF"/>
+            <w:tcBorders>
+              <w:top w:val="single" w:sz="6" w:space="0" w:color="D8E1DD"/>
+              <w:left w:val="single" w:sz="6" w:space="0" w:color="D8E1DD"/>
+              <w:bottom w:val="single" w:sz="6" w:space="0" w:color="D8E1DD"/>
+              <w:right w:val="single" w:sz="6" w:space="0" w:color="D8E1DD"/>
+            </w:tcBorders>
+            <w:tcMar>
+              <w:top w:w="80" w:type="dxa"/>
+              <w:bottom w:w="80" w:type="dxa"/>
+              <w:left w:w="100" w:type="dxa"/>
+              <w:right w:w="100" w:type="dxa"/>
+            </w:tcMar>
           </w:tcPr>
           <w:p>
+            <w:pPr>
+              <w:spacing w:after="40" w:line="252" w:lineRule="auto"/>
+            </w:pPr>
             <w:r>
+              <w:rPr>
+                <w:rFonts w:ascii="Aptos" w:hAnsi="Aptos"/>
+                <w:i w:val="0"/>
+                <w:color w:val="17231F"/>
+                <w:sz w:val="16"/>
+              </w:rPr>
               <w:t>Grades 10 and 11. Computer science, math, science, AI literacy, I.D.E.A. Hub, AP CSP or AP CSA extension.</w:t>
             </w:r>
           </w:p>
@@ -91,21 +200,65 @@
       <w:tr>
         <w:tc>
           <w:tcPr>
-            <w:tcW w:type="dxa" w:w="5184"/>
+            <w:tcW w:type="dxa" w:w="5256"/>
+            <w:shd w:fill="FFFFFF"/>
+            <w:tcBorders>
+              <w:top w:val="single" w:sz="6" w:space="0" w:color="D8E1DD"/>
+              <w:left w:val="single" w:sz="6" w:space="0" w:color="D8E1DD"/>
+              <w:bottom w:val="single" w:sz="6" w:space="0" w:color="D8E1DD"/>
+              <w:right w:val="single" w:sz="6" w:space="0" w:color="D8E1DD"/>
+            </w:tcBorders>
+            <w:tcMar>
+              <w:top w:w="80" w:type="dxa"/>
+              <w:bottom w:w="80" w:type="dxa"/>
+              <w:left w:w="100" w:type="dxa"/>
+              <w:right w:w="100" w:type="dxa"/>
+            </w:tcMar>
           </w:tcPr>
           <w:p>
+            <w:pPr>
+              <w:spacing w:after="40" w:line="252" w:lineRule="auto"/>
+            </w:pPr>
             <w:r>
+              <w:rPr>
+                <w:rFonts w:ascii="Aptos" w:hAnsi="Aptos"/>
+                <w:i w:val="0"/>
+                <w:color w:val="17231F"/>
+                <w:sz w:val="16"/>
+              </w:rPr>
               <w:t>Length</w:t>
             </w:r>
           </w:p>
         </w:tc>
         <w:tc>
           <w:tcPr>
-            <w:tcW w:type="dxa" w:w="5184"/>
+            <w:tcW w:type="dxa" w:w="5256"/>
+            <w:shd w:fill="FFFFFF"/>
+            <w:tcBorders>
+              <w:top w:val="single" w:sz="6" w:space="0" w:color="D8E1DD"/>
+              <w:left w:val="single" w:sz="6" w:space="0" w:color="D8E1DD"/>
+              <w:bottom w:val="single" w:sz="6" w:space="0" w:color="D8E1DD"/>
+              <w:right w:val="single" w:sz="6" w:space="0" w:color="D8E1DD"/>
+            </w:tcBorders>
+            <w:tcMar>
+              <w:top w:w="80" w:type="dxa"/>
+              <w:bottom w:w="80" w:type="dxa"/>
+              <w:left w:w="100" w:type="dxa"/>
+              <w:right w:w="100" w:type="dxa"/>
+            </w:tcMar>
           </w:tcPr>
           <w:p>
+            <w:pPr>
+              <w:spacing w:after="40" w:line="252" w:lineRule="auto"/>
+            </w:pPr>
             <w:r>
-              <w:t>15 to 20 minutes. The lesson is a focused supplement, not a full machine learning unit.</w:t>
+              <w:rPr>
+                <w:rFonts w:ascii="Aptos" w:hAnsi="Aptos"/>
+                <w:i w:val="0"/>
+                <w:color w:val="17231F"/>
+                <w:sz w:val="16"/>
+              </w:rPr>
+              <w:t>15 to 20 minutes. This is a focused supplement, not a full machine learning unit.</w:t>
             </w:r>
           </w:p>
         </w:tc>
@@ -113,21 +266,65 @@
       <w:tr>
         <w:tc>
           <w:tcPr>
-            <w:tcW w:type="dxa" w:w="5184"/>
+            <w:tcW w:type="dxa" w:w="5256"/>
+            <w:shd w:fill="FFFFFF"/>
+            <w:tcBorders>
+              <w:top w:val="single" w:sz="6" w:space="0" w:color="D8E1DD"/>
+              <w:left w:val="single" w:sz="6" w:space="0" w:color="D8E1DD"/>
+              <w:bottom w:val="single" w:sz="6" w:space="0" w:color="D8E1DD"/>
+              <w:right w:val="single" w:sz="6" w:space="0" w:color="D8E1DD"/>
+            </w:tcBorders>
+            <w:tcMar>
+              <w:top w:w="80" w:type="dxa"/>
+              <w:bottom w:w="80" w:type="dxa"/>
+              <w:left w:w="100" w:type="dxa"/>
+              <w:right w:w="100" w:type="dxa"/>
+            </w:tcMar>
           </w:tcPr>
           <w:p>
+            <w:pPr>
+              <w:spacing w:after="40" w:line="252" w:lineRule="auto"/>
+            </w:pPr>
             <w:r>
+              <w:rPr>
+                <w:rFonts w:ascii="Aptos" w:hAnsi="Aptos"/>
+                <w:i w:val="0"/>
+                <w:color w:val="17231F"/>
+                <w:sz w:val="16"/>
+              </w:rPr>
               <w:t>Audience</w:t>
             </w:r>
           </w:p>
         </w:tc>
         <w:tc>
           <w:tcPr>
-            <w:tcW w:type="dxa" w:w="5184"/>
+            <w:tcW w:type="dxa" w:w="5256"/>
+            <w:shd w:fill="FFFFFF"/>
+            <w:tcBorders>
+              <w:top w:val="single" w:sz="6" w:space="0" w:color="D8E1DD"/>
+              <w:left w:val="single" w:sz="6" w:space="0" w:color="D8E1DD"/>
+              <w:bottom w:val="single" w:sz="6" w:space="0" w:color="D8E1DD"/>
+              <w:right w:val="single" w:sz="6" w:space="0" w:color="D8E1DD"/>
+            </w:tcBorders>
+            <w:tcMar>
+              <w:top w:w="80" w:type="dxa"/>
+              <w:bottom w:w="80" w:type="dxa"/>
+              <w:left w:w="100" w:type="dxa"/>
+              <w:right w:w="100" w:type="dxa"/>
+            </w:tcMar>
           </w:tcPr>
           <w:p>
+            <w:pPr>
+              <w:spacing w:after="40" w:line="252" w:lineRule="auto"/>
+            </w:pPr>
             <w:r>
-              <w:t>Student-facing extension for upper-school Ursuline students.</w:t>
+              <w:rPr>
+                <w:rFonts w:ascii="Aptos" w:hAnsi="Aptos"/>
+                <w:i w:val="0"/>
+                <w:color w:val="17231F"/>
+                <w:sz w:val="16"/>
+              </w:rPr>
+              <w:t>Student-facing upper-school extension, reviewed by school leaders.</w:t>
             </w:r>
           </w:p>
         </w:tc>
@@ -135,21 +332,65 @@
       <w:tr>
         <w:tc>
           <w:tcPr>
-            <w:tcW w:type="dxa" w:w="5184"/>
+            <w:tcW w:type="dxa" w:w="5256"/>
+            <w:shd w:fill="FFFFFF"/>
+            <w:tcBorders>
+              <w:top w:val="single" w:sz="6" w:space="0" w:color="D8E1DD"/>
+              <w:left w:val="single" w:sz="6" w:space="0" w:color="D8E1DD"/>
+              <w:bottom w:val="single" w:sz="6" w:space="0" w:color="D8E1DD"/>
+              <w:right w:val="single" w:sz="6" w:space="0" w:color="D8E1DD"/>
+            </w:tcBorders>
+            <w:tcMar>
+              <w:top w:w="80" w:type="dxa"/>
+              <w:bottom w:w="80" w:type="dxa"/>
+              <w:left w:w="100" w:type="dxa"/>
+              <w:right w:w="100" w:type="dxa"/>
+            </w:tcMar>
           </w:tcPr>
           <w:p>
+            <w:pPr>
+              <w:spacing w:after="40" w:line="252" w:lineRule="auto"/>
+            </w:pPr>
             <w:r>
+              <w:rPr>
+                <w:rFonts w:ascii="Aptos" w:hAnsi="Aptos"/>
+                <w:i w:val="0"/>
+                <w:color w:val="17231F"/>
+                <w:sz w:val="16"/>
+              </w:rPr>
               <w:t>Essential question</w:t>
             </w:r>
           </w:p>
         </w:tc>
         <w:tc>
           <w:tcPr>
-            <w:tcW w:type="dxa" w:w="5184"/>
+            <w:tcW w:type="dxa" w:w="5256"/>
+            <w:shd w:fill="FFFFFF"/>
+            <w:tcBorders>
+              <w:top w:val="single" w:sz="6" w:space="0" w:color="D8E1DD"/>
+              <w:left w:val="single" w:sz="6" w:space="0" w:color="D8E1DD"/>
+              <w:bottom w:val="single" w:sz="6" w:space="0" w:color="D8E1DD"/>
+              <w:right w:val="single" w:sz="6" w:space="0" w:color="D8E1DD"/>
+            </w:tcBorders>
+            <w:tcMar>
+              <w:top w:w="80" w:type="dxa"/>
+              <w:bottom w:w="80" w:type="dxa"/>
+              <w:left w:w="100" w:type="dxa"/>
+              <w:right w:w="100" w:type="dxa"/>
+            </w:tcMar>
           </w:tcPr>
           <w:p>
+            <w:pPr>
+              <w:spacing w:after="40" w:line="252" w:lineRule="auto"/>
+            </w:pPr>
             <w:r>
-              <w:t>What happens after a prompt becomes math, and how do we decide whether to trust the result?</w:t>
+              <w:rPr>
+                <w:rFonts w:ascii="Aptos" w:hAnsi="Aptos"/>
+                <w:i w:val="0"/>
+                <w:color w:val="17231F"/>
+                <w:sz w:val="16"/>
+              </w:rPr>
+              <w:t>Can you explain how AI turns language into math, uses patterns, generates a response, and still needs human review?</w:t>
             </w:r>
           </w:p>
         </w:tc>
@@ -157,20 +398,64 @@
       <w:tr>
         <w:tc>
           <w:tcPr>
-            <w:tcW w:type="dxa" w:w="5184"/>
+            <w:tcW w:type="dxa" w:w="5256"/>
+            <w:shd w:fill="FFFFFF"/>
+            <w:tcBorders>
+              <w:top w:val="single" w:sz="6" w:space="0" w:color="D8E1DD"/>
+              <w:left w:val="single" w:sz="6" w:space="0" w:color="D8E1DD"/>
+              <w:bottom w:val="single" w:sz="6" w:space="0" w:color="D8E1DD"/>
+              <w:right w:val="single" w:sz="6" w:space="0" w:color="D8E1DD"/>
+            </w:tcBorders>
+            <w:tcMar>
+              <w:top w:w="80" w:type="dxa"/>
+              <w:bottom w:w="80" w:type="dxa"/>
+              <w:left w:w="100" w:type="dxa"/>
+              <w:right w:w="100" w:type="dxa"/>
+            </w:tcMar>
           </w:tcPr>
           <w:p>
+            <w:pPr>
+              <w:spacing w:after="40" w:line="252" w:lineRule="auto"/>
+            </w:pPr>
             <w:r>
+              <w:rPr>
+                <w:rFonts w:ascii="Aptos" w:hAnsi="Aptos"/>
+                <w:i w:val="0"/>
+                <w:color w:val="17231F"/>
+                <w:sz w:val="16"/>
+              </w:rPr>
               <w:t>Core thesis</w:t>
             </w:r>
           </w:p>
         </w:tc>
         <w:tc>
           <w:tcPr>
-            <w:tcW w:type="dxa" w:w="5184"/>
+            <w:tcW w:type="dxa" w:w="5256"/>
+            <w:shd w:fill="FFFFFF"/>
+            <w:tcBorders>
+              <w:top w:val="single" w:sz="6" w:space="0" w:color="D8E1DD"/>
+              <w:left w:val="single" w:sz="6" w:space="0" w:color="D8E1DD"/>
+              <w:bottom w:val="single" w:sz="6" w:space="0" w:color="D8E1DD"/>
+              <w:right w:val="single" w:sz="6" w:space="0" w:color="D8E1DD"/>
+            </w:tcBorders>
+            <w:tcMar>
+              <w:top w:w="80" w:type="dxa"/>
+              <w:bottom w:w="80" w:type="dxa"/>
+              <w:left w:w="100" w:type="dxa"/>
+              <w:right w:w="100" w:type="dxa"/>
+            </w:tcMar>
           </w:tcPr>
           <w:p>
+            <w:pPr>
+              <w:spacing w:after="40" w:line="252" w:lineRule="auto"/>
+            </w:pPr>
             <w:r>
+              <w:rPr>
+                <w:rFonts w:ascii="Aptos" w:hAnsi="Aptos"/>
+                <w:i w:val="0"/>
+                <w:color w:val="17231F"/>
+                <w:sz w:val="16"/>
+              </w:rPr>
               <w:t>AI is not magic. It is math trained on patterns. Human wisdom decides whether, when, and how to use it.</w:t>
             </w:r>
           </w:p>
@@ -179,21 +464,65 @@
       <w:tr>
         <w:tc>
           <w:tcPr>
-            <w:tcW w:type="dxa" w:w="5184"/>
+            <w:tcW w:type="dxa" w:w="5256"/>
+            <w:shd w:fill="FFFFFF"/>
+            <w:tcBorders>
+              <w:top w:val="single" w:sz="6" w:space="0" w:color="D8E1DD"/>
+              <w:left w:val="single" w:sz="6" w:space="0" w:color="D8E1DD"/>
+              <w:bottom w:val="single" w:sz="6" w:space="0" w:color="D8E1DD"/>
+              <w:right w:val="single" w:sz="6" w:space="0" w:color="D8E1DD"/>
+            </w:tcBorders>
+            <w:tcMar>
+              <w:top w:w="80" w:type="dxa"/>
+              <w:bottom w:w="80" w:type="dxa"/>
+              <w:left w:w="100" w:type="dxa"/>
+              <w:right w:w="100" w:type="dxa"/>
+            </w:tcMar>
           </w:tcPr>
           <w:p>
+            <w:pPr>
+              <w:spacing w:after="40" w:line="252" w:lineRule="auto"/>
+            </w:pPr>
             <w:r>
+              <w:rPr>
+                <w:rFonts w:ascii="Aptos" w:hAnsi="Aptos"/>
+                <w:i w:val="0"/>
+                <w:color w:val="17231F"/>
+                <w:sz w:val="16"/>
+              </w:rPr>
               <w:t>Mission fit</w:t>
             </w:r>
           </w:p>
         </w:tc>
         <w:tc>
           <w:tcPr>
-            <w:tcW w:type="dxa" w:w="5184"/>
+            <w:tcW w:type="dxa" w:w="5256"/>
+            <w:shd w:fill="FFFFFF"/>
+            <w:tcBorders>
+              <w:top w:val="single" w:sz="6" w:space="0" w:color="D8E1DD"/>
+              <w:left w:val="single" w:sz="6" w:space="0" w:color="D8E1DD"/>
+              <w:bottom w:val="single" w:sz="6" w:space="0" w:color="D8E1DD"/>
+              <w:right w:val="single" w:sz="6" w:space="0" w:color="D8E1DD"/>
+            </w:tcBorders>
+            <w:tcMar>
+              <w:top w:w="80" w:type="dxa"/>
+              <w:bottom w:w="80" w:type="dxa"/>
+              <w:left w:w="100" w:type="dxa"/>
+              <w:right w:w="100" w:type="dxa"/>
+            </w:tcMar>
           </w:tcPr>
           <w:p>
+            <w:pPr>
+              <w:spacing w:after="40" w:line="252" w:lineRule="auto"/>
+            </w:pPr>
             <w:r>
-              <w:t>Serviam, intellectual curiosity, integrity, purpose, presence, young women as builders, critics, and leaders of technology.</w:t>
+              <w:rPr>
+                <w:rFonts w:ascii="Aptos" w:hAnsi="Aptos"/>
+                <w:i w:val="0"/>
+                <w:color w:val="17231F"/>
+                <w:sz w:val="16"/>
+              </w:rPr>
+              <w:t>Serviam, intellectual curiosity, integrity, purpose, presence, and young women as builders, critics, and leaders of technology.</w:t>
             </w:r>
           </w:p>
         </w:tc>
@@ -201,157 +530,350 @@
     </w:tbl>
     <w:p>
       <w:pPr>
-        <w:pStyle w:val="Heading1"/>
+        <w:pStyle w:val="Heading2"/>
+        <w:spacing w:before="120" w:after="80"/>
       </w:pPr>
       <w:r>
+        <w:rPr>
+          <w:rFonts w:ascii="Georgia" w:hAnsi="Georgia"/>
+          <w:b/>
+          <w:color w:val="005C49"/>
+          <w:sz w:val="26"/>
+        </w:rPr>
         <w:t>Learning targets</w:t>
       </w:r>
     </w:p>
     <w:p>
       <w:pPr>
         <w:pStyle w:val="ListBullet"/>
+        <w:spacing w:after="20"/>
       </w:pPr>
       <w:r>
+        <w:rPr>
+          <w:rFonts w:ascii="Aptos" w:hAnsi="Aptos"/>
+          <w:color w:val="17231F"/>
+          <w:sz w:val="19"/>
+        </w:rPr>
         <w:t>I can describe AI as a learned function that maps input to output.</w:t>
       </w:r>
     </w:p>
     <w:p>
       <w:pPr>
         <w:pStyle w:val="ListBullet"/>
+        <w:spacing w:after="20"/>
       </w:pPr>
       <w:r>
+        <w:rPr>
+          <w:rFonts w:ascii="Aptos" w:hAnsi="Aptos"/>
+          <w:color w:val="17231F"/>
+          <w:sz w:val="19"/>
+        </w:rPr>
         <w:t>I can explain how text becomes tokens, token IDs, and vectors.</w:t>
       </w:r>
     </w:p>
     <w:p>
       <w:pPr>
         <w:pStyle w:val="ListBullet"/>
+        <w:spacing w:after="20"/>
       </w:pPr>
       <w:r>
-        <w:t>I can connect weights, loss, probability, attention, and loops to math and computer science ideas.</w:t>
+        <w:rPr>
+          <w:rFonts w:ascii="Aptos" w:hAnsi="Aptos"/>
+          <w:color w:val="17231F"/>
+          <w:sz w:val="19"/>
+        </w:rPr>
+        <w:t>I can connect vector similarity, weights, loss, probability, attention, and loops to math and computer science.</w:t>
       </w:r>
     </w:p>
     <w:p>
       <w:pPr>
         <w:pStyle w:val="ListBullet"/>
+        <w:spacing w:after="20"/>
       </w:pPr>
       <w:r>
-        <w:t>I can explain why AI output is probable, not guaranteed true.</w:t>
+        <w:rPr>
+          <w:rFonts w:ascii="Aptos" w:hAnsi="Aptos"/>
+          <w:color w:val="17231F"/>
+          <w:sz w:val="19"/>
+        </w:rPr>
+        <w:t>I can describe training as feedback at scale: predict, measure error, adjust, repeat.</w:t>
       </w:r>
     </w:p>
     <w:p>
       <w:pPr>
         <w:pStyle w:val="ListBullet"/>
+        <w:spacing w:after="20"/>
       </w:pPr>
       <w:r>
+        <w:rPr>
+          <w:rFonts w:ascii="Aptos" w:hAnsi="Aptos"/>
+          <w:color w:val="17231F"/>
+          <w:sz w:val="19"/>
+        </w:rPr>
+        <w:t>I can explain why AI output is likely, not guaranteed true.</w:t>
+      </w:r>
+    </w:p>
+    <w:p>
+      <w:pPr>
+        <w:pStyle w:val="ListBullet"/>
+        <w:spacing w:after="20"/>
+      </w:pPr>
+      <w:r>
+        <w:rPr>
+          <w:rFonts w:ascii="Aptos" w:hAnsi="Aptos"/>
+          <w:color w:val="17231F"/>
+          <w:sz w:val="19"/>
+        </w:rPr>
         <w:t>I can use human judgment to test, verify, and decide whether AI use serves learning and others.</w:t>
       </w:r>
     </w:p>
     <w:p>
       <w:pPr>
-        <w:pStyle w:val="Heading1"/>
+        <w:pStyle w:val="Heading2"/>
+        <w:spacing w:before="120" w:after="80"/>
       </w:pPr>
       <w:r>
+        <w:rPr>
+          <w:rFonts w:ascii="Georgia" w:hAnsi="Georgia"/>
+          <w:b/>
+          <w:color w:val="005C49"/>
+          <w:sz w:val="26"/>
+        </w:rPr>
         <w:t>Success criteria</w:t>
       </w:r>
     </w:p>
     <w:p>
       <w:pPr>
         <w:pStyle w:val="ListBullet"/>
+        <w:spacing w:after="20"/>
       </w:pPr>
       <w:r>
+        <w:rPr>
+          <w:rFonts w:ascii="Aptos" w:hAnsi="Aptos"/>
+          <w:color w:val="17231F"/>
+          <w:sz w:val="19"/>
+        </w:rPr>
         <w:t>Students can explain f(x)=y as input, model, and output.</w:t>
       </w:r>
     </w:p>
     <w:p>
       <w:pPr>
         <w:pStyle w:val="ListBullet"/>
+        <w:spacing w:after="20"/>
       </w:pPr>
       <w:r>
+        <w:rPr>
+          <w:rFonts w:ascii="Aptos" w:hAnsi="Aptos"/>
+          <w:color w:val="17231F"/>
+          <w:sz w:val="19"/>
+        </w:rPr>
         <w:t>Students can define token, vector, weight, loss, probability, attention, and loop in student-friendly language.</w:t>
       </w:r>
     </w:p>
     <w:p>
       <w:pPr>
         <w:pStyle w:val="ListBullet"/>
+        <w:spacing w:after="20"/>
       </w:pPr>
       <w:r>
-        <w:t>Students can name one math idea, one CS idea, and one science idea behind AI.</w:t>
+        <w:rPr>
+          <w:rFonts w:ascii="Aptos" w:hAnsi="Aptos"/>
+          <w:color w:val="17231F"/>
+          <w:sz w:val="19"/>
+        </w:rPr>
+        <w:t>Students can complete a short explanation of the AI pipeline from prompt to human review.</w:t>
       </w:r>
     </w:p>
     <w:p>
       <w:pPr>
         <w:pStyle w:val="ListBullet"/>
+        <w:spacing w:after="20"/>
       </w:pPr>
       <w:r>
-        <w:t>Students can explain why most likely does not mean guaranteed true.</w:t>
+        <w:rPr>
+          <w:rFonts w:ascii="Aptos" w:hAnsi="Aptos"/>
+          <w:color w:val="17231F"/>
+          <w:sz w:val="19"/>
+        </w:rPr>
+        <w:t>Students can use one worked example: cosine similarity, weighted sum, loss, softmax probability, or generation loop.</w:t>
       </w:r>
     </w:p>
     <w:p>
       <w:pPr>
         <w:pStyle w:val="ListBullet"/>
+        <w:spacing w:after="20"/>
       </w:pPr>
       <w:r>
-        <w:t>Students can connect model evaluation to Serviam, accuracy, fairness, privacy, and human oversight.</w:t>
+        <w:rPr>
+          <w:rFonts w:ascii="Aptos" w:hAnsi="Aptos"/>
+          <w:color w:val="17231F"/>
+          <w:sz w:val="19"/>
+        </w:rPr>
+        <w:t>Students can connect model evaluation to accuracy, fairness, privacy, and Serviam.</w:t>
+      </w:r>
+    </w:p>
+    <w:p>
+      <w:r>
+        <w:br w:type="page"/>
       </w:r>
     </w:p>
     <w:p>
       <w:pPr>
-        <w:pStyle w:val="Heading1"/>
+        <w:pStyle w:val="Heading2"/>
+        <w:spacing w:before="120" w:after="80"/>
       </w:pPr>
       <w:r>
+        <w:rPr>
+          <w:rFonts w:ascii="Georgia" w:hAnsi="Georgia"/>
+          <w:b/>
+          <w:color w:val="005C49"/>
+          <w:sz w:val="26"/>
+        </w:rPr>
         <w:t>15 to 20 minute instructional flow</w:t>
       </w:r>
     </w:p>
     <w:tbl>
       <w:tblPr>
-        <w:tblStyle w:val="TableGrid"/>
         <w:tblW w:type="auto" w:w="0"/>
+        <w:jc w:val="center"/>
+        <w:tblLayout w:type="autofit"/>
         <w:tblLook w:firstColumn="1" w:firstRow="1" w:lastColumn="0" w:lastRow="0" w:noHBand="0" w:noVBand="1" w:val="04A0"/>
       </w:tblPr>
       <w:tblGrid>
-        <w:gridCol w:w="2592"/>
-        <w:gridCol w:w="2592"/>
-        <w:gridCol w:w="2592"/>
-        <w:gridCol w:w="2592"/>
+        <w:gridCol w:w="2628"/>
+        <w:gridCol w:w="2628"/>
+        <w:gridCol w:w="2628"/>
+        <w:gridCol w:w="2628"/>
       </w:tblGrid>
       <w:tr>
         <w:tc>
           <w:tcPr>
-            <w:tcW w:type="dxa" w:w="2592"/>
+            <w:tcW w:type="dxa" w:w="1440"/>
+            <w:shd w:fill="005C49"/>
+            <w:tcBorders>
+              <w:top w:val="single" w:sz="6" w:space="0" w:color="005C49"/>
+              <w:left w:val="single" w:sz="6" w:space="0" w:color="005C49"/>
+              <w:bottom w:val="single" w:sz="6" w:space="0" w:color="005C49"/>
+              <w:right w:val="single" w:sz="6" w:space="0" w:color="005C49"/>
+            </w:tcBorders>
+            <w:tcMar>
+              <w:top w:w="80" w:type="dxa"/>
+              <w:bottom w:w="80" w:type="dxa"/>
+              <w:left w:w="100" w:type="dxa"/>
+              <w:right w:w="100" w:type="dxa"/>
+            </w:tcMar>
           </w:tcPr>
           <w:p>
+            <w:pPr>
+              <w:spacing w:after="40" w:line="252" w:lineRule="auto"/>
+            </w:pPr>
             <w:r>
+              <w:rPr>
+                <w:rFonts w:ascii="Aptos" w:hAnsi="Aptos"/>
+                <w:b/>
+                <w:i w:val="0"/>
+                <w:color w:val="FFFFFF"/>
+                <w:sz w:val="14"/>
+              </w:rPr>
               <w:t>Time</w:t>
             </w:r>
           </w:p>
         </w:tc>
         <w:tc>
           <w:tcPr>
-            <w:tcW w:type="dxa" w:w="2592"/>
+            <w:tcW w:type="dxa" w:w="1440"/>
+            <w:shd w:fill="005C49"/>
+            <w:tcBorders>
+              <w:top w:val="single" w:sz="6" w:space="0" w:color="005C49"/>
+              <w:left w:val="single" w:sz="6" w:space="0" w:color="005C49"/>
+              <w:bottom w:val="single" w:sz="6" w:space="0" w:color="005C49"/>
+              <w:right w:val="single" w:sz="6" w:space="0" w:color="005C49"/>
+            </w:tcBorders>
+            <w:tcMar>
+              <w:top w:w="80" w:type="dxa"/>
+              <w:bottom w:w="80" w:type="dxa"/>
+              <w:left w:w="100" w:type="dxa"/>
+              <w:right w:w="100" w:type="dxa"/>
+            </w:tcMar>
           </w:tcPr>
           <w:p>
+            <w:pPr>
+              <w:spacing w:after="40" w:line="252" w:lineRule="auto"/>
+            </w:pPr>
             <w:r>
+              <w:rPr>
+                <w:rFonts w:ascii="Aptos" w:hAnsi="Aptos"/>
+                <w:b/>
+                <w:i w:val="0"/>
+                <w:color w:val="FFFFFF"/>
+                <w:sz w:val="14"/>
+              </w:rPr>
               <w:t>Slides</w:t>
             </w:r>
           </w:p>
         </w:tc>
         <w:tc>
           <w:tcPr>
-            <w:tcW w:type="dxa" w:w="2592"/>
+            <w:tcW w:type="dxa" w:w="3312"/>
+            <w:shd w:fill="005C49"/>
+            <w:tcBorders>
+              <w:top w:val="single" w:sz="6" w:space="0" w:color="005C49"/>
+              <w:left w:val="single" w:sz="6" w:space="0" w:color="005C49"/>
+              <w:bottom w:val="single" w:sz="6" w:space="0" w:color="005C49"/>
+              <w:right w:val="single" w:sz="6" w:space="0" w:color="005C49"/>
+            </w:tcBorders>
+            <w:tcMar>
+              <w:top w:w="80" w:type="dxa"/>
+              <w:bottom w:w="80" w:type="dxa"/>
+              <w:left w:w="100" w:type="dxa"/>
+              <w:right w:w="100" w:type="dxa"/>
+            </w:tcMar>
           </w:tcPr>
           <w:p>
+            <w:pPr>
+              <w:spacing w:after="40" w:line="252" w:lineRule="auto"/>
+            </w:pPr>
             <w:r>
+              <w:rPr>
+                <w:rFonts w:ascii="Aptos" w:hAnsi="Aptos"/>
+                <w:b/>
+                <w:i w:val="0"/>
+                <w:color w:val="FFFFFF"/>
+                <w:sz w:val="14"/>
+              </w:rPr>
               <w:t>Teacher move</w:t>
             </w:r>
           </w:p>
         </w:tc>
         <w:tc>
           <w:tcPr>
-            <w:tcW w:type="dxa" w:w="2592"/>
+            <w:tcW w:type="dxa" w:w="4032"/>
+            <w:shd w:fill="005C49"/>
+            <w:tcBorders>
+              <w:top w:val="single" w:sz="6" w:space="0" w:color="005C49"/>
+              <w:left w:val="single" w:sz="6" w:space="0" w:color="005C49"/>
+              <w:bottom w:val="single" w:sz="6" w:space="0" w:color="005C49"/>
+              <w:right w:val="single" w:sz="6" w:space="0" w:color="005C49"/>
+            </w:tcBorders>
+            <w:tcMar>
+              <w:top w:w="80" w:type="dxa"/>
+              <w:bottom w:w="80" w:type="dxa"/>
+              <w:left w:w="100" w:type="dxa"/>
+              <w:right w:w="100" w:type="dxa"/>
+            </w:tcMar>
           </w:tcPr>
           <w:p>
+            <w:pPr>
+              <w:spacing w:after="40" w:line="252" w:lineRule="auto"/>
+            </w:pPr>
             <w:r>
+              <w:rPr>
+                <w:rFonts w:ascii="Aptos" w:hAnsi="Aptos"/>
+                <w:b/>
+                <w:i w:val="0"/>
+                <w:color w:val="FFFFFF"/>
+                <w:sz w:val="14"/>
+              </w:rPr>
               <w:t>Student evidence</w:t>
             </w:r>
           </w:p>
@@ -360,41 +882,129 @@
       <w:tr>
         <w:tc>
           <w:tcPr>
-            <w:tcW w:type="dxa" w:w="2592"/>
+            <w:tcW w:type="dxa" w:w="2628"/>
+            <w:shd w:fill="FFFFFF"/>
+            <w:tcBorders>
+              <w:top w:val="single" w:sz="6" w:space="0" w:color="D8E1DD"/>
+              <w:left w:val="single" w:sz="6" w:space="0" w:color="D8E1DD"/>
+              <w:bottom w:val="single" w:sz="6" w:space="0" w:color="D8E1DD"/>
+              <w:right w:val="single" w:sz="6" w:space="0" w:color="D8E1DD"/>
+            </w:tcBorders>
+            <w:tcMar>
+              <w:top w:w="80" w:type="dxa"/>
+              <w:bottom w:w="80" w:type="dxa"/>
+              <w:left w:w="100" w:type="dxa"/>
+              <w:right w:w="100" w:type="dxa"/>
+            </w:tcMar>
           </w:tcPr>
           <w:p>
+            <w:pPr>
+              <w:spacing w:after="40" w:line="252" w:lineRule="auto"/>
+            </w:pPr>
             <w:r>
+              <w:rPr>
+                <w:rFonts w:ascii="Aptos" w:hAnsi="Aptos"/>
+                <w:i w:val="0"/>
+                <w:color w:val="17231F"/>
+                <w:sz w:val="14"/>
+              </w:rPr>
               <w:t>0:00 to 1:30</w:t>
             </w:r>
           </w:p>
         </w:tc>
         <w:tc>
           <w:tcPr>
-            <w:tcW w:type="dxa" w:w="2592"/>
+            <w:tcW w:type="dxa" w:w="2628"/>
+            <w:shd w:fill="FFFFFF"/>
+            <w:tcBorders>
+              <w:top w:val="single" w:sz="6" w:space="0" w:color="D8E1DD"/>
+              <w:left w:val="single" w:sz="6" w:space="0" w:color="D8E1DD"/>
+              <w:bottom w:val="single" w:sz="6" w:space="0" w:color="D8E1DD"/>
+              <w:right w:val="single" w:sz="6" w:space="0" w:color="D8E1DD"/>
+            </w:tcBorders>
+            <w:tcMar>
+              <w:top w:w="80" w:type="dxa"/>
+              <w:bottom w:w="80" w:type="dxa"/>
+              <w:left w:w="100" w:type="dxa"/>
+              <w:right w:w="100" w:type="dxa"/>
+            </w:tcMar>
           </w:tcPr>
           <w:p>
+            <w:pPr>
+              <w:spacing w:after="40" w:line="252" w:lineRule="auto"/>
+            </w:pPr>
             <w:r>
+              <w:rPr>
+                <w:rFonts w:ascii="Aptos" w:hAnsi="Aptos"/>
+                <w:i w:val="0"/>
+                <w:color w:val="17231F"/>
+                <w:sz w:val="14"/>
+              </w:rPr>
               <w:t>Slides 1 to 2</w:t>
             </w:r>
           </w:p>
         </w:tc>
         <w:tc>
           <w:tcPr>
-            <w:tcW w:type="dxa" w:w="2592"/>
+            <w:tcW w:type="dxa" w:w="2628"/>
+            <w:shd w:fill="FFFFFF"/>
+            <w:tcBorders>
+              <w:top w:val="single" w:sz="6" w:space="0" w:color="D8E1DD"/>
+              <w:left w:val="single" w:sz="6" w:space="0" w:color="D8E1DD"/>
+              <w:bottom w:val="single" w:sz="6" w:space="0" w:color="D8E1DD"/>
+              <w:right w:val="single" w:sz="6" w:space="0" w:color="D8E1DD"/>
+            </w:tcBorders>
+            <w:tcMar>
+              <w:top w:w="80" w:type="dxa"/>
+              <w:bottom w:w="80" w:type="dxa"/>
+              <w:left w:w="100" w:type="dxa"/>
+              <w:right w:w="100" w:type="dxa"/>
+            </w:tcMar>
           </w:tcPr>
           <w:p>
+            <w:pPr>
+              <w:spacing w:after="40" w:line="252" w:lineRule="auto"/>
+            </w:pPr>
             <w:r>
-              <w:t>Connect to Part 1 and ask what happens after pressing Enter.</w:t>
+              <w:rPr>
+                <w:rFonts w:ascii="Aptos" w:hAnsi="Aptos"/>
+                <w:i w:val="0"/>
+                <w:color w:val="17231F"/>
+                <w:sz w:val="14"/>
+              </w:rPr>
+              <w:t>Connect Part 2 to Part 1 and ask what happens after pressing Enter.</w:t>
             </w:r>
           </w:p>
         </w:tc>
         <w:tc>
           <w:tcPr>
-            <w:tcW w:type="dxa" w:w="2592"/>
+            <w:tcW w:type="dxa" w:w="2628"/>
+            <w:shd w:fill="FFFFFF"/>
+            <w:tcBorders>
+              <w:top w:val="single" w:sz="6" w:space="0" w:color="D8E1DD"/>
+              <w:left w:val="single" w:sz="6" w:space="0" w:color="D8E1DD"/>
+              <w:bottom w:val="single" w:sz="6" w:space="0" w:color="D8E1DD"/>
+              <w:right w:val="single" w:sz="6" w:space="0" w:color="D8E1DD"/>
+            </w:tcBorders>
+            <w:tcMar>
+              <w:top w:w="80" w:type="dxa"/>
+              <w:bottom w:w="80" w:type="dxa"/>
+              <w:left w:w="100" w:type="dxa"/>
+              <w:right w:w="100" w:type="dxa"/>
+            </w:tcMar>
           </w:tcPr>
           <w:p>
+            <w:pPr>
+              <w:spacing w:after="40" w:line="252" w:lineRule="auto"/>
+            </w:pPr>
             <w:r>
-              <w:t>Students predict steps in the AI pipeline.</w:t>
+              <w:rPr>
+                <w:rFonts w:ascii="Aptos" w:hAnsi="Aptos"/>
+                <w:i w:val="0"/>
+                <w:color w:val="17231F"/>
+                <w:sz w:val="14"/>
+              </w:rPr>
+              <w:t>Students predict hidden steps in the AI pipeline.</w:t>
             </w:r>
           </w:p>
         </w:tc>
@@ -402,41 +1012,129 @@
       <w:tr>
         <w:tc>
           <w:tcPr>
-            <w:tcW w:type="dxa" w:w="2592"/>
+            <w:tcW w:type="dxa" w:w="2628"/>
+            <w:shd w:fill="FFFFFF"/>
+            <w:tcBorders>
+              <w:top w:val="single" w:sz="6" w:space="0" w:color="D8E1DD"/>
+              <w:left w:val="single" w:sz="6" w:space="0" w:color="D8E1DD"/>
+              <w:bottom w:val="single" w:sz="6" w:space="0" w:color="D8E1DD"/>
+              <w:right w:val="single" w:sz="6" w:space="0" w:color="D8E1DD"/>
+            </w:tcBorders>
+            <w:tcMar>
+              <w:top w:w="80" w:type="dxa"/>
+              <w:bottom w:w="80" w:type="dxa"/>
+              <w:left w:w="100" w:type="dxa"/>
+              <w:right w:w="100" w:type="dxa"/>
+            </w:tcMar>
           </w:tcPr>
           <w:p>
+            <w:pPr>
+              <w:spacing w:after="40" w:line="252" w:lineRule="auto"/>
+            </w:pPr>
             <w:r>
-              <w:t>1:30 to 3:30</w:t>
+              <w:rPr>
+                <w:rFonts w:ascii="Aptos" w:hAnsi="Aptos"/>
+                <w:i w:val="0"/>
+                <w:color w:val="17231F"/>
+                <w:sz w:val="14"/>
+              </w:rPr>
+              <w:t>1:30 to 3:00</w:t>
             </w:r>
           </w:p>
         </w:tc>
         <w:tc>
           <w:tcPr>
-            <w:tcW w:type="dxa" w:w="2592"/>
+            <w:tcW w:type="dxa" w:w="2628"/>
+            <w:shd w:fill="FFFFFF"/>
+            <w:tcBorders>
+              <w:top w:val="single" w:sz="6" w:space="0" w:color="D8E1DD"/>
+              <w:left w:val="single" w:sz="6" w:space="0" w:color="D8E1DD"/>
+              <w:bottom w:val="single" w:sz="6" w:space="0" w:color="D8E1DD"/>
+              <w:right w:val="single" w:sz="6" w:space="0" w:color="D8E1DD"/>
+            </w:tcBorders>
+            <w:tcMar>
+              <w:top w:w="80" w:type="dxa"/>
+              <w:bottom w:w="80" w:type="dxa"/>
+              <w:left w:w="100" w:type="dxa"/>
+              <w:right w:w="100" w:type="dxa"/>
+            </w:tcMar>
           </w:tcPr>
           <w:p>
+            <w:pPr>
+              <w:spacing w:after="40" w:line="252" w:lineRule="auto"/>
+            </w:pPr>
             <w:r>
+              <w:rPr>
+                <w:rFonts w:ascii="Aptos" w:hAnsi="Aptos"/>
+                <w:i w:val="0"/>
+                <w:color w:val="17231F"/>
+                <w:sz w:val="14"/>
+              </w:rPr>
               <w:t>Slide 3</w:t>
             </w:r>
           </w:p>
         </w:tc>
         <w:tc>
           <w:tcPr>
-            <w:tcW w:type="dxa" w:w="2592"/>
+            <w:tcW w:type="dxa" w:w="2628"/>
+            <w:shd w:fill="FFFFFF"/>
+            <w:tcBorders>
+              <w:top w:val="single" w:sz="6" w:space="0" w:color="D8E1DD"/>
+              <w:left w:val="single" w:sz="6" w:space="0" w:color="D8E1DD"/>
+              <w:bottom w:val="single" w:sz="6" w:space="0" w:color="D8E1DD"/>
+              <w:right w:val="single" w:sz="6" w:space="0" w:color="D8E1DD"/>
+            </w:tcBorders>
+            <w:tcMar>
+              <w:top w:w="80" w:type="dxa"/>
+              <w:bottom w:w="80" w:type="dxa"/>
+              <w:left w:w="100" w:type="dxa"/>
+              <w:right w:w="100" w:type="dxa"/>
+            </w:tcMar>
           </w:tcPr>
           <w:p>
+            <w:pPr>
+              <w:spacing w:after="40" w:line="252" w:lineRule="auto"/>
+            </w:pPr>
             <w:r>
-              <w:t>Model AI as a learned function.</w:t>
+              <w:rPr>
+                <w:rFonts w:ascii="Aptos" w:hAnsi="Aptos"/>
+                <w:i w:val="0"/>
+                <w:color w:val="17231F"/>
+                <w:sz w:val="14"/>
+              </w:rPr>
+              <w:t>Model AI as a learned function: input -&gt; model -&gt; output.</w:t>
             </w:r>
           </w:p>
         </w:tc>
         <w:tc>
           <w:tcPr>
-            <w:tcW w:type="dxa" w:w="2592"/>
+            <w:tcW w:type="dxa" w:w="2628"/>
+            <w:shd w:fill="FFFFFF"/>
+            <w:tcBorders>
+              <w:top w:val="single" w:sz="6" w:space="0" w:color="D8E1DD"/>
+              <w:left w:val="single" w:sz="6" w:space="0" w:color="D8E1DD"/>
+              <w:bottom w:val="single" w:sz="6" w:space="0" w:color="D8E1DD"/>
+              <w:right w:val="single" w:sz="6" w:space="0" w:color="D8E1DD"/>
+            </w:tcBorders>
+            <w:tcMar>
+              <w:top w:w="80" w:type="dxa"/>
+              <w:bottom w:w="80" w:type="dxa"/>
+              <w:left w:w="100" w:type="dxa"/>
+              <w:right w:w="100" w:type="dxa"/>
+            </w:tcMar>
           </w:tcPr>
           <w:p>
+            <w:pPr>
+              <w:spacing w:after="40" w:line="252" w:lineRule="auto"/>
+            </w:pPr>
             <w:r>
-              <w:t>Students connect f(x)=y to CS methods and math functions.</w:t>
+              <w:rPr>
+                <w:rFonts w:ascii="Aptos" w:hAnsi="Aptos"/>
+                <w:i w:val="0"/>
+                <w:color w:val="17231F"/>
+                <w:sz w:val="14"/>
+              </w:rPr>
+              <w:t>Students connect f(x)=y to functions and methods.</w:t>
             </w:r>
           </w:p>
         </w:tc>
@@ -444,41 +1142,129 @@
       <w:tr>
         <w:tc>
           <w:tcPr>
-            <w:tcW w:type="dxa" w:w="2592"/>
+            <w:tcW w:type="dxa" w:w="2628"/>
+            <w:shd w:fill="FFFFFF"/>
+            <w:tcBorders>
+              <w:top w:val="single" w:sz="6" w:space="0" w:color="D8E1DD"/>
+              <w:left w:val="single" w:sz="6" w:space="0" w:color="D8E1DD"/>
+              <w:bottom w:val="single" w:sz="6" w:space="0" w:color="D8E1DD"/>
+              <w:right w:val="single" w:sz="6" w:space="0" w:color="D8E1DD"/>
+            </w:tcBorders>
+            <w:tcMar>
+              <w:top w:w="80" w:type="dxa"/>
+              <w:bottom w:w="80" w:type="dxa"/>
+              <w:left w:w="100" w:type="dxa"/>
+              <w:right w:w="100" w:type="dxa"/>
+            </w:tcMar>
           </w:tcPr>
           <w:p>
+            <w:pPr>
+              <w:spacing w:after="40" w:line="252" w:lineRule="auto"/>
+            </w:pPr>
             <w:r>
-              <w:t>3:30 to 5:30</w:t>
+              <w:rPr>
+                <w:rFonts w:ascii="Aptos" w:hAnsi="Aptos"/>
+                <w:i w:val="0"/>
+                <w:color w:val="17231F"/>
+                <w:sz w:val="14"/>
+              </w:rPr>
+              <w:t>3:00 to 4:45</w:t>
             </w:r>
           </w:p>
         </w:tc>
         <w:tc>
           <w:tcPr>
-            <w:tcW w:type="dxa" w:w="2592"/>
+            <w:tcW w:type="dxa" w:w="2628"/>
+            <w:shd w:fill="FFFFFF"/>
+            <w:tcBorders>
+              <w:top w:val="single" w:sz="6" w:space="0" w:color="D8E1DD"/>
+              <w:left w:val="single" w:sz="6" w:space="0" w:color="D8E1DD"/>
+              <w:bottom w:val="single" w:sz="6" w:space="0" w:color="D8E1DD"/>
+              <w:right w:val="single" w:sz="6" w:space="0" w:color="D8E1DD"/>
+            </w:tcBorders>
+            <w:tcMar>
+              <w:top w:w="80" w:type="dxa"/>
+              <w:bottom w:w="80" w:type="dxa"/>
+              <w:left w:w="100" w:type="dxa"/>
+              <w:right w:w="100" w:type="dxa"/>
+            </w:tcMar>
           </w:tcPr>
           <w:p>
+            <w:pPr>
+              <w:spacing w:after="40" w:line="252" w:lineRule="auto"/>
+            </w:pPr>
             <w:r>
+              <w:rPr>
+                <w:rFonts w:ascii="Aptos" w:hAnsi="Aptos"/>
+                <w:i w:val="0"/>
+                <w:color w:val="17231F"/>
+                <w:sz w:val="14"/>
+              </w:rPr>
               <w:t>Slide 4</w:t>
             </w:r>
           </w:p>
         </w:tc>
         <w:tc>
           <w:tcPr>
-            <w:tcW w:type="dxa" w:w="2592"/>
+            <w:tcW w:type="dxa" w:w="2628"/>
+            <w:shd w:fill="FFFFFF"/>
+            <w:tcBorders>
+              <w:top w:val="single" w:sz="6" w:space="0" w:color="D8E1DD"/>
+              <w:left w:val="single" w:sz="6" w:space="0" w:color="D8E1DD"/>
+              <w:bottom w:val="single" w:sz="6" w:space="0" w:color="D8E1DD"/>
+              <w:right w:val="single" w:sz="6" w:space="0" w:color="D8E1DD"/>
+            </w:tcBorders>
+            <w:tcMar>
+              <w:top w:w="80" w:type="dxa"/>
+              <w:bottom w:w="80" w:type="dxa"/>
+              <w:left w:w="100" w:type="dxa"/>
+              <w:right w:w="100" w:type="dxa"/>
+            </w:tcMar>
           </w:tcPr>
           <w:p>
+            <w:pPr>
+              <w:spacing w:after="40" w:line="252" w:lineRule="auto"/>
+            </w:pPr>
             <w:r>
+              <w:rPr>
+                <w:rFonts w:ascii="Aptos" w:hAnsi="Aptos"/>
+                <w:i w:val="0"/>
+                <w:color w:val="17231F"/>
+                <w:sz w:val="14"/>
+              </w:rPr>
               <w:t>Frame data, training, and testing as scientific modeling.</w:t>
             </w:r>
           </w:p>
         </w:tc>
         <w:tc>
           <w:tcPr>
-            <w:tcW w:type="dxa" w:w="2592"/>
+            <w:tcW w:type="dxa" w:w="2628"/>
+            <w:shd w:fill="FFFFFF"/>
+            <w:tcBorders>
+              <w:top w:val="single" w:sz="6" w:space="0" w:color="D8E1DD"/>
+              <w:left w:val="single" w:sz="6" w:space="0" w:color="D8E1DD"/>
+              <w:bottom w:val="single" w:sz="6" w:space="0" w:color="D8E1DD"/>
+              <w:right w:val="single" w:sz="6" w:space="0" w:color="D8E1DD"/>
+            </w:tcBorders>
+            <w:tcMar>
+              <w:top w:w="80" w:type="dxa"/>
+              <w:bottom w:w="80" w:type="dxa"/>
+              <w:left w:w="100" w:type="dxa"/>
+              <w:right w:w="100" w:type="dxa"/>
+            </w:tcMar>
           </w:tcPr>
           <w:p>
+            <w:pPr>
+              <w:spacing w:after="40" w:line="252" w:lineRule="auto"/>
+            </w:pPr>
             <w:r>
-              <w:t>Students explain why unseen test data matters.</w:t>
+              <w:rPr>
+                <w:rFonts w:ascii="Aptos" w:hAnsi="Aptos"/>
+                <w:i w:val="0"/>
+                <w:color w:val="17231F"/>
+                <w:sz w:val="14"/>
+              </w:rPr>
+              <w:t>Students explain why test data matters.</w:t>
             </w:r>
           </w:p>
         </w:tc>
@@ -486,41 +1272,129 @@
       <w:tr>
         <w:tc>
           <w:tcPr>
-            <w:tcW w:type="dxa" w:w="2592"/>
+            <w:tcW w:type="dxa" w:w="2628"/>
+            <w:shd w:fill="FFFFFF"/>
+            <w:tcBorders>
+              <w:top w:val="single" w:sz="6" w:space="0" w:color="D8E1DD"/>
+              <w:left w:val="single" w:sz="6" w:space="0" w:color="D8E1DD"/>
+              <w:bottom w:val="single" w:sz="6" w:space="0" w:color="D8E1DD"/>
+              <w:right w:val="single" w:sz="6" w:space="0" w:color="D8E1DD"/>
+            </w:tcBorders>
+            <w:tcMar>
+              <w:top w:w="80" w:type="dxa"/>
+              <w:bottom w:w="80" w:type="dxa"/>
+              <w:left w:w="100" w:type="dxa"/>
+              <w:right w:w="100" w:type="dxa"/>
+            </w:tcMar>
           </w:tcPr>
           <w:p>
+            <w:pPr>
+              <w:spacing w:after="40" w:line="252" w:lineRule="auto"/>
+            </w:pPr>
             <w:r>
-              <w:t>5:30 to 8:00</w:t>
+              <w:rPr>
+                <w:rFonts w:ascii="Aptos" w:hAnsi="Aptos"/>
+                <w:i w:val="0"/>
+                <w:color w:val="17231F"/>
+                <w:sz w:val="14"/>
+              </w:rPr>
+              <w:t>4:45 to 7:30</w:t>
             </w:r>
           </w:p>
         </w:tc>
         <w:tc>
           <w:tcPr>
-            <w:tcW w:type="dxa" w:w="2592"/>
+            <w:tcW w:type="dxa" w:w="2628"/>
+            <w:shd w:fill="FFFFFF"/>
+            <w:tcBorders>
+              <w:top w:val="single" w:sz="6" w:space="0" w:color="D8E1DD"/>
+              <w:left w:val="single" w:sz="6" w:space="0" w:color="D8E1DD"/>
+              <w:bottom w:val="single" w:sz="6" w:space="0" w:color="D8E1DD"/>
+              <w:right w:val="single" w:sz="6" w:space="0" w:color="D8E1DD"/>
+            </w:tcBorders>
+            <w:tcMar>
+              <w:top w:w="80" w:type="dxa"/>
+              <w:bottom w:w="80" w:type="dxa"/>
+              <w:left w:w="100" w:type="dxa"/>
+              <w:right w:w="100" w:type="dxa"/>
+            </w:tcMar>
           </w:tcPr>
           <w:p>
+            <w:pPr>
+              <w:spacing w:after="40" w:line="252" w:lineRule="auto"/>
+            </w:pPr>
             <w:r>
+              <w:rPr>
+                <w:rFonts w:ascii="Aptos" w:hAnsi="Aptos"/>
+                <w:i w:val="0"/>
+                <w:color w:val="17231F"/>
+                <w:sz w:val="14"/>
+              </w:rPr>
               <w:t>Slides 5 to 6</w:t>
             </w:r>
           </w:p>
         </w:tc>
         <w:tc>
           <w:tcPr>
-            <w:tcW w:type="dxa" w:w="2592"/>
+            <w:tcW w:type="dxa" w:w="2628"/>
+            <w:shd w:fill="FFFFFF"/>
+            <w:tcBorders>
+              <w:top w:val="single" w:sz="6" w:space="0" w:color="D8E1DD"/>
+              <w:left w:val="single" w:sz="6" w:space="0" w:color="D8E1DD"/>
+              <w:bottom w:val="single" w:sz="6" w:space="0" w:color="D8E1DD"/>
+              <w:right w:val="single" w:sz="6" w:space="0" w:color="D8E1DD"/>
+            </w:tcBorders>
+            <w:tcMar>
+              <w:top w:w="80" w:type="dxa"/>
+              <w:bottom w:w="80" w:type="dxa"/>
+              <w:left w:w="100" w:type="dxa"/>
+              <w:right w:w="100" w:type="dxa"/>
+            </w:tcMar>
           </w:tcPr>
           <w:p>
+            <w:pPr>
+              <w:spacing w:after="40" w:line="252" w:lineRule="auto"/>
+            </w:pPr>
             <w:r>
-              <w:t>Show tokens, vectors, and similarity.</w:t>
+              <w:rPr>
+                <w:rFonts w:ascii="Aptos" w:hAnsi="Aptos"/>
+                <w:i w:val="0"/>
+                <w:color w:val="17231F"/>
+                <w:sz w:val="14"/>
+              </w:rPr>
+              <w:t>Show tokens, vectors, and similarity through the Tokens and Similarity simulation.</w:t>
             </w:r>
           </w:p>
         </w:tc>
         <w:tc>
           <w:tcPr>
-            <w:tcW w:type="dxa" w:w="2592"/>
+            <w:tcW w:type="dxa" w:w="2628"/>
+            <w:shd w:fill="FFFFFF"/>
+            <w:tcBorders>
+              <w:top w:val="single" w:sz="6" w:space="0" w:color="D8E1DD"/>
+              <w:left w:val="single" w:sz="6" w:space="0" w:color="D8E1DD"/>
+              <w:bottom w:val="single" w:sz="6" w:space="0" w:color="D8E1DD"/>
+              <w:right w:val="single" w:sz="6" w:space="0" w:color="D8E1DD"/>
+            </w:tcBorders>
+            <w:tcMar>
+              <w:top w:w="80" w:type="dxa"/>
+              <w:bottom w:w="80" w:type="dxa"/>
+              <w:left w:w="100" w:type="dxa"/>
+              <w:right w:w="100" w:type="dxa"/>
+            </w:tcMar>
           </w:tcPr>
           <w:p>
+            <w:pPr>
+              <w:spacing w:after="40" w:line="252" w:lineRule="auto"/>
+            </w:pPr>
             <w:r>
-              <w:t>Students split a sentence and place words in clusters.</w:t>
+              <w:rPr>
+                <w:rFonts w:ascii="Aptos" w:hAnsi="Aptos"/>
+                <w:i w:val="0"/>
+                <w:color w:val="17231F"/>
+                <w:sz w:val="14"/>
+              </w:rPr>
+              <w:t>Students compare related and unrelated terms using the vector map.</w:t>
             </w:r>
           </w:p>
         </w:tc>
@@ -528,41 +1402,129 @@
       <w:tr>
         <w:tc>
           <w:tcPr>
-            <w:tcW w:type="dxa" w:w="2592"/>
+            <w:tcW w:type="dxa" w:w="2628"/>
+            <w:shd w:fill="FFFFFF"/>
+            <w:tcBorders>
+              <w:top w:val="single" w:sz="6" w:space="0" w:color="D8E1DD"/>
+              <w:left w:val="single" w:sz="6" w:space="0" w:color="D8E1DD"/>
+              <w:bottom w:val="single" w:sz="6" w:space="0" w:color="D8E1DD"/>
+              <w:right w:val="single" w:sz="6" w:space="0" w:color="D8E1DD"/>
+            </w:tcBorders>
+            <w:tcMar>
+              <w:top w:w="80" w:type="dxa"/>
+              <w:bottom w:w="80" w:type="dxa"/>
+              <w:left w:w="100" w:type="dxa"/>
+              <w:right w:w="100" w:type="dxa"/>
+            </w:tcMar>
           </w:tcPr>
           <w:p>
+            <w:pPr>
+              <w:spacing w:after="40" w:line="252" w:lineRule="auto"/>
+            </w:pPr>
             <w:r>
-              <w:t>8:00 to 11:30</w:t>
+              <w:rPr>
+                <w:rFonts w:ascii="Aptos" w:hAnsi="Aptos"/>
+                <w:i w:val="0"/>
+                <w:color w:val="17231F"/>
+                <w:sz w:val="14"/>
+              </w:rPr>
+              <w:t>7:30 to 11:30</w:t>
             </w:r>
           </w:p>
         </w:tc>
         <w:tc>
           <w:tcPr>
-            <w:tcW w:type="dxa" w:w="2592"/>
+            <w:tcW w:type="dxa" w:w="2628"/>
+            <w:shd w:fill="FFFFFF"/>
+            <w:tcBorders>
+              <w:top w:val="single" w:sz="6" w:space="0" w:color="D8E1DD"/>
+              <w:left w:val="single" w:sz="6" w:space="0" w:color="D8E1DD"/>
+              <w:bottom w:val="single" w:sz="6" w:space="0" w:color="D8E1DD"/>
+              <w:right w:val="single" w:sz="6" w:space="0" w:color="D8E1DD"/>
+            </w:tcBorders>
+            <w:tcMar>
+              <w:top w:w="80" w:type="dxa"/>
+              <w:bottom w:w="80" w:type="dxa"/>
+              <w:left w:w="100" w:type="dxa"/>
+              <w:right w:w="100" w:type="dxa"/>
+            </w:tcMar>
           </w:tcPr>
           <w:p>
+            <w:pPr>
+              <w:spacing w:after="40" w:line="252" w:lineRule="auto"/>
+            </w:pPr>
             <w:r>
+              <w:rPr>
+                <w:rFonts w:ascii="Aptos" w:hAnsi="Aptos"/>
+                <w:i w:val="0"/>
+                <w:color w:val="17231F"/>
+                <w:sz w:val="14"/>
+              </w:rPr>
               <w:t>Slides 7 to 9</w:t>
             </w:r>
           </w:p>
         </w:tc>
         <w:tc>
           <w:tcPr>
-            <w:tcW w:type="dxa" w:w="2592"/>
+            <w:tcW w:type="dxa" w:w="2628"/>
+            <w:shd w:fill="FFFFFF"/>
+            <w:tcBorders>
+              <w:top w:val="single" w:sz="6" w:space="0" w:color="D8E1DD"/>
+              <w:left w:val="single" w:sz="6" w:space="0" w:color="D8E1DD"/>
+              <w:bottom w:val="single" w:sz="6" w:space="0" w:color="D8E1DD"/>
+              <w:right w:val="single" w:sz="6" w:space="0" w:color="D8E1DD"/>
+            </w:tcBorders>
+            <w:tcMar>
+              <w:top w:w="80" w:type="dxa"/>
+              <w:bottom w:w="80" w:type="dxa"/>
+              <w:left w:w="100" w:type="dxa"/>
+              <w:right w:w="100" w:type="dxa"/>
+            </w:tcMar>
           </w:tcPr>
           <w:p>
+            <w:pPr>
+              <w:spacing w:after="40" w:line="252" w:lineRule="auto"/>
+            </w:pPr>
             <w:r>
-              <w:t>Explain weights, learning from error, and probability.</w:t>
+              <w:rPr>
+                <w:rFonts w:ascii="Aptos" w:hAnsi="Aptos"/>
+                <w:i w:val="0"/>
+                <w:color w:val="17231F"/>
+                <w:sz w:val="14"/>
+              </w:rPr>
+              <w:t>Explain weighted sums, training from error, and probability.</w:t>
             </w:r>
           </w:p>
         </w:tc>
         <w:tc>
           <w:tcPr>
-            <w:tcW w:type="dxa" w:w="2592"/>
+            <w:tcW w:type="dxa" w:w="2628"/>
+            <w:shd w:fill="FFFFFF"/>
+            <w:tcBorders>
+              <w:top w:val="single" w:sz="6" w:space="0" w:color="D8E1DD"/>
+              <w:left w:val="single" w:sz="6" w:space="0" w:color="D8E1DD"/>
+              <w:bottom w:val="single" w:sz="6" w:space="0" w:color="D8E1DD"/>
+              <w:right w:val="single" w:sz="6" w:space="0" w:color="D8E1DD"/>
+            </w:tcBorders>
+            <w:tcMar>
+              <w:top w:w="80" w:type="dxa"/>
+              <w:bottom w:w="80" w:type="dxa"/>
+              <w:left w:w="100" w:type="dxa"/>
+              <w:right w:w="100" w:type="dxa"/>
+            </w:tcMar>
           </w:tcPr>
           <w:p>
+            <w:pPr>
+              <w:spacing w:after="40" w:line="252" w:lineRule="auto"/>
+            </w:pPr>
             <w:r>
-              <w:t>Students compare this to revision, debugging, or practice.</w:t>
+              <w:rPr>
+                <w:rFonts w:ascii="Aptos" w:hAnsi="Aptos"/>
+                <w:i w:val="0"/>
+                <w:color w:val="17231F"/>
+                <w:sz w:val="14"/>
+              </w:rPr>
+              <w:t>Students follow one weighted sum and one probability example.</w:t>
             </w:r>
           </w:p>
         </w:tc>
@@ -570,40 +1532,128 @@
       <w:tr>
         <w:tc>
           <w:tcPr>
-            <w:tcW w:type="dxa" w:w="2592"/>
+            <w:tcW w:type="dxa" w:w="2628"/>
+            <w:shd w:fill="FFFFFF"/>
+            <w:tcBorders>
+              <w:top w:val="single" w:sz="6" w:space="0" w:color="D8E1DD"/>
+              <w:left w:val="single" w:sz="6" w:space="0" w:color="D8E1DD"/>
+              <w:bottom w:val="single" w:sz="6" w:space="0" w:color="D8E1DD"/>
+              <w:right w:val="single" w:sz="6" w:space="0" w:color="D8E1DD"/>
+            </w:tcBorders>
+            <w:tcMar>
+              <w:top w:w="80" w:type="dxa"/>
+              <w:bottom w:w="80" w:type="dxa"/>
+              <w:left w:w="100" w:type="dxa"/>
+              <w:right w:w="100" w:type="dxa"/>
+            </w:tcMar>
           </w:tcPr>
           <w:p>
+            <w:pPr>
+              <w:spacing w:after="40" w:line="252" w:lineRule="auto"/>
+            </w:pPr>
             <w:r>
+              <w:rPr>
+                <w:rFonts w:ascii="Aptos" w:hAnsi="Aptos"/>
+                <w:i w:val="0"/>
+                <w:color w:val="17231F"/>
+                <w:sz w:val="14"/>
+              </w:rPr>
               <w:t>11:30 to 15:30</w:t>
             </w:r>
           </w:p>
         </w:tc>
         <w:tc>
           <w:tcPr>
-            <w:tcW w:type="dxa" w:w="2592"/>
+            <w:tcW w:type="dxa" w:w="2628"/>
+            <w:shd w:fill="FFFFFF"/>
+            <w:tcBorders>
+              <w:top w:val="single" w:sz="6" w:space="0" w:color="D8E1DD"/>
+              <w:left w:val="single" w:sz="6" w:space="0" w:color="D8E1DD"/>
+              <w:bottom w:val="single" w:sz="6" w:space="0" w:color="D8E1DD"/>
+              <w:right w:val="single" w:sz="6" w:space="0" w:color="D8E1DD"/>
+            </w:tcBorders>
+            <w:tcMar>
+              <w:top w:w="80" w:type="dxa"/>
+              <w:bottom w:w="80" w:type="dxa"/>
+              <w:left w:w="100" w:type="dxa"/>
+              <w:right w:w="100" w:type="dxa"/>
+            </w:tcMar>
           </w:tcPr>
           <w:p>
+            <w:pPr>
+              <w:spacing w:after="40" w:line="252" w:lineRule="auto"/>
+            </w:pPr>
             <w:r>
+              <w:rPr>
+                <w:rFonts w:ascii="Aptos" w:hAnsi="Aptos"/>
+                <w:i w:val="0"/>
+                <w:color w:val="17231F"/>
+                <w:sz w:val="14"/>
+              </w:rPr>
               <w:t>Slides 10 to 11</w:t>
             </w:r>
           </w:p>
         </w:tc>
         <w:tc>
           <w:tcPr>
-            <w:tcW w:type="dxa" w:w="2592"/>
+            <w:tcW w:type="dxa" w:w="2628"/>
+            <w:shd w:fill="FFFFFF"/>
+            <w:tcBorders>
+              <w:top w:val="single" w:sz="6" w:space="0" w:color="D8E1DD"/>
+              <w:left w:val="single" w:sz="6" w:space="0" w:color="D8E1DD"/>
+              <w:bottom w:val="single" w:sz="6" w:space="0" w:color="D8E1DD"/>
+              <w:right w:val="single" w:sz="6" w:space="0" w:color="D8E1DD"/>
+            </w:tcBorders>
+            <w:tcMar>
+              <w:top w:w="80" w:type="dxa"/>
+              <w:bottom w:w="80" w:type="dxa"/>
+              <w:left w:w="100" w:type="dxa"/>
+              <w:right w:w="100" w:type="dxa"/>
+            </w:tcMar>
           </w:tcPr>
           <w:p>
+            <w:pPr>
+              <w:spacing w:after="40" w:line="252" w:lineRule="auto"/>
+            </w:pPr>
             <w:r>
-              <w:t>Explain attention and generation loop.</w:t>
+              <w:rPr>
+                <w:rFonts w:ascii="Aptos" w:hAnsi="Aptos"/>
+                <w:i w:val="0"/>
+                <w:color w:val="17231F"/>
+                <w:sz w:val="14"/>
+              </w:rPr>
+              <w:t>Explain attention and the generation loop.</w:t>
             </w:r>
           </w:p>
         </w:tc>
         <w:tc>
           <w:tcPr>
-            <w:tcW w:type="dxa" w:w="2592"/>
+            <w:tcW w:type="dxa" w:w="2628"/>
+            <w:shd w:fill="FFFFFF"/>
+            <w:tcBorders>
+              <w:top w:val="single" w:sz="6" w:space="0" w:color="D8E1DD"/>
+              <w:left w:val="single" w:sz="6" w:space="0" w:color="D8E1DD"/>
+              <w:bottom w:val="single" w:sz="6" w:space="0" w:color="D8E1DD"/>
+              <w:right w:val="single" w:sz="6" w:space="0" w:color="D8E1DD"/>
+            </w:tcBorders>
+            <w:tcMar>
+              <w:top w:w="80" w:type="dxa"/>
+              <w:bottom w:w="80" w:type="dxa"/>
+              <w:left w:w="100" w:type="dxa"/>
+              <w:right w:w="100" w:type="dxa"/>
+            </w:tcMar>
           </w:tcPr>
           <w:p>
+            <w:pPr>
+              <w:spacing w:after="40" w:line="252" w:lineRule="auto"/>
+            </w:pPr>
             <w:r>
+              <w:rPr>
+                <w:rFonts w:ascii="Aptos" w:hAnsi="Aptos"/>
+                <w:i w:val="0"/>
+                <w:color w:val="17231F"/>
+                <w:sz w:val="14"/>
+              </w:rPr>
               <w:t>Students solve the pronoun-reference example and read simple pseudocode.</w:t>
             </w:r>
           </w:p>
@@ -612,41 +1662,129 @@
       <w:tr>
         <w:tc>
           <w:tcPr>
-            <w:tcW w:type="dxa" w:w="2592"/>
+            <w:tcW w:type="dxa" w:w="2628"/>
+            <w:shd w:fill="FFFFFF"/>
+            <w:tcBorders>
+              <w:top w:val="single" w:sz="6" w:space="0" w:color="D8E1DD"/>
+              <w:left w:val="single" w:sz="6" w:space="0" w:color="D8E1DD"/>
+              <w:bottom w:val="single" w:sz="6" w:space="0" w:color="D8E1DD"/>
+              <w:right w:val="single" w:sz="6" w:space="0" w:color="D8E1DD"/>
+            </w:tcBorders>
+            <w:tcMar>
+              <w:top w:w="80" w:type="dxa"/>
+              <w:bottom w:w="80" w:type="dxa"/>
+              <w:left w:w="100" w:type="dxa"/>
+              <w:right w:w="100" w:type="dxa"/>
+            </w:tcMar>
           </w:tcPr>
           <w:p>
+            <w:pPr>
+              <w:spacing w:after="40" w:line="252" w:lineRule="auto"/>
+            </w:pPr>
             <w:r>
+              <w:rPr>
+                <w:rFonts w:ascii="Aptos" w:hAnsi="Aptos"/>
+                <w:i w:val="0"/>
+                <w:color w:val="17231F"/>
+                <w:sz w:val="14"/>
+              </w:rPr>
               <w:t>15:30 to 20:00</w:t>
             </w:r>
           </w:p>
         </w:tc>
         <w:tc>
           <w:tcPr>
-            <w:tcW w:type="dxa" w:w="2592"/>
+            <w:tcW w:type="dxa" w:w="2628"/>
+            <w:shd w:fill="FFFFFF"/>
+            <w:tcBorders>
+              <w:top w:val="single" w:sz="6" w:space="0" w:color="D8E1DD"/>
+              <w:left w:val="single" w:sz="6" w:space="0" w:color="D8E1DD"/>
+              <w:bottom w:val="single" w:sz="6" w:space="0" w:color="D8E1DD"/>
+              <w:right w:val="single" w:sz="6" w:space="0" w:color="D8E1DD"/>
+            </w:tcBorders>
+            <w:tcMar>
+              <w:top w:w="80" w:type="dxa"/>
+              <w:bottom w:w="80" w:type="dxa"/>
+              <w:left w:w="100" w:type="dxa"/>
+              <w:right w:w="100" w:type="dxa"/>
+            </w:tcMar>
           </w:tcPr>
           <w:p>
+            <w:pPr>
+              <w:spacing w:after="40" w:line="252" w:lineRule="auto"/>
+            </w:pPr>
             <w:r>
+              <w:rPr>
+                <w:rFonts w:ascii="Aptos" w:hAnsi="Aptos"/>
+                <w:i w:val="0"/>
+                <w:color w:val="17231F"/>
+                <w:sz w:val="14"/>
+              </w:rPr>
               <w:t>Slide 12</w:t>
             </w:r>
           </w:p>
         </w:tc>
         <w:tc>
           <w:tcPr>
-            <w:tcW w:type="dxa" w:w="2592"/>
+            <w:tcW w:type="dxa" w:w="2628"/>
+            <w:shd w:fill="FFFFFF"/>
+            <w:tcBorders>
+              <w:top w:val="single" w:sz="6" w:space="0" w:color="D8E1DD"/>
+              <w:left w:val="single" w:sz="6" w:space="0" w:color="D8E1DD"/>
+              <w:bottom w:val="single" w:sz="6" w:space="0" w:color="D8E1DD"/>
+              <w:right w:val="single" w:sz="6" w:space="0" w:color="D8E1DD"/>
+            </w:tcBorders>
+            <w:tcMar>
+              <w:top w:w="80" w:type="dxa"/>
+              <w:bottom w:w="80" w:type="dxa"/>
+              <w:left w:w="100" w:type="dxa"/>
+              <w:right w:w="100" w:type="dxa"/>
+            </w:tcMar>
           </w:tcPr>
           <w:p>
+            <w:pPr>
+              <w:spacing w:after="40" w:line="252" w:lineRule="auto"/>
+            </w:pPr>
             <w:r>
-              <w:t>Connect math, science, CS, and Serviam.</w:t>
+              <w:rPr>
+                <w:rFonts w:ascii="Aptos" w:hAnsi="Aptos"/>
+                <w:i w:val="0"/>
+                <w:color w:val="17231F"/>
+                <w:sz w:val="14"/>
+              </w:rPr>
+              <w:t>Use the stronger exit ticket: explain how AI works.</w:t>
             </w:r>
           </w:p>
         </w:tc>
         <w:tc>
           <w:tcPr>
-            <w:tcW w:type="dxa" w:w="2592"/>
+            <w:tcW w:type="dxa" w:w="2628"/>
+            <w:shd w:fill="FFFFFF"/>
+            <w:tcBorders>
+              <w:top w:val="single" w:sz="6" w:space="0" w:color="D8E1DD"/>
+              <w:left w:val="single" w:sz="6" w:space="0" w:color="D8E1DD"/>
+              <w:bottom w:val="single" w:sz="6" w:space="0" w:color="D8E1DD"/>
+              <w:right w:val="single" w:sz="6" w:space="0" w:color="D8E1DD"/>
+            </w:tcBorders>
+            <w:tcMar>
+              <w:top w:w="80" w:type="dxa"/>
+              <w:bottom w:w="80" w:type="dxa"/>
+              <w:left w:w="100" w:type="dxa"/>
+              <w:right w:w="100" w:type="dxa"/>
+            </w:tcMar>
           </w:tcPr>
           <w:p>
+            <w:pPr>
+              <w:spacing w:after="40" w:line="252" w:lineRule="auto"/>
+            </w:pPr>
             <w:r>
-              <w:t>Students complete one math idea, one CS idea, one science idea, one human responsibility.</w:t>
+              <w:rPr>
+                <w:rFonts w:ascii="Aptos" w:hAnsi="Aptos"/>
+                <w:i w:val="0"/>
+                <w:color w:val="17231F"/>
+                <w:sz w:val="14"/>
+              </w:rPr>
+              <w:t>Students write 4 to 5 sentences or a labeled diagram.</w:t>
             </w:r>
           </w:p>
         </w:tc>
@@ -654,103 +1792,1321 @@
     </w:tbl>
     <w:p>
       <w:pPr>
-        <w:pStyle w:val="Heading1"/>
+        <w:pStyle w:val="Heading2"/>
+        <w:spacing w:before="120" w:after="80"/>
       </w:pPr>
       <w:r>
-        <w:t>Best-practice design notes</w:t>
+        <w:rPr>
+          <w:rFonts w:ascii="Georgia" w:hAnsi="Georgia"/>
+          <w:b/>
+          <w:color w:val="005C49"/>
+          <w:sz w:val="26"/>
+        </w:rPr>
+        <w:t>Core technical explanation for teacher delivery</w:t>
+      </w:r>
+    </w:p>
+    <w:tbl>
+      <w:tblPr>
+        <w:tblW w:type="auto" w:w="0"/>
+        <w:jc w:val="center"/>
+        <w:tblLook w:firstColumn="1" w:firstRow="1" w:lastColumn="0" w:lastRow="0" w:noHBand="0" w:noVBand="1" w:val="04A0"/>
+      </w:tblPr>
+      <w:tblGrid>
+        <w:gridCol w:w="10512"/>
+      </w:tblGrid>
+      <w:tr>
+        <w:tc>
+          <w:tcPr>
+            <w:tcW w:type="dxa" w:w="10512"/>
+            <w:shd w:fill="E8F2EE"/>
+            <w:tcBorders>
+              <w:top w:val="single" w:sz="8" w:space="0" w:color="005C49"/>
+              <w:left w:val="single" w:sz="8" w:space="0" w:color="005C49"/>
+              <w:bottom w:val="single" w:sz="8" w:space="0" w:color="005C49"/>
+              <w:right w:val="single" w:sz="8" w:space="0" w:color="005C49"/>
+            </w:tcBorders>
+            <w:tcMar>
+              <w:top w:w="100" w:type="dxa"/>
+              <w:bottom w:w="100" w:type="dxa"/>
+              <w:left w:w="150" w:type="dxa"/>
+              <w:right w:w="150" w:type="dxa"/>
+            </w:tcMar>
+          </w:tcPr>
+          <w:p>
+            <w:pPr>
+              <w:spacing w:after="40" w:line="252" w:lineRule="auto"/>
+            </w:pPr>
+            <w:r>
+              <w:rPr>
+                <w:rFonts w:ascii="Aptos" w:hAnsi="Aptos"/>
+                <w:b/>
+                <w:i w:val="0"/>
+                <w:color w:val="003F35"/>
+                <w:sz w:val="19"/>
+              </w:rPr>
+              <w:t>Say it simply</w:t>
+            </w:r>
+          </w:p>
+          <w:p>
+            <w:pPr>
+              <w:spacing w:after="40" w:line="252" w:lineRule="auto"/>
+            </w:pPr>
+            <w:r>
+              <w:rPr>
+                <w:rFonts w:ascii="Aptos" w:hAnsi="Aptos"/>
+                <w:b w:val="0"/>
+                <w:i w:val="0"/>
+                <w:color w:val="17231F"/>
+                <w:sz w:val="18"/>
+              </w:rPr>
+              <w:t>When a student presses Enter, the system turns words into tokens, token IDs, and vectors. Those vectors move through layers of weighted math. The model uses attention to weigh relationships in context and probability to generate one token at a time. Training improves the model by measuring error and adjusting weights. The output can still be wrong, biased, incomplete, or unsafe, so human review remains essential.</w:t>
+            </w:r>
+          </w:p>
+        </w:tc>
+      </w:tr>
+    </w:tbl>
+    <w:p>
+      <w:pPr>
+        <w:pStyle w:val="Heading2"/>
+        <w:spacing w:before="120" w:after="80"/>
+      </w:pPr>
+      <w:r>
+        <w:rPr>
+          <w:rFonts w:ascii="Georgia" w:hAnsi="Georgia"/>
+          <w:b/>
+          <w:color w:val="005C49"/>
+          <w:sz w:val="26"/>
+        </w:rPr>
+        <w:t>Worked examples that match the 12-slide deck</w:t>
+      </w:r>
+    </w:p>
+    <w:tbl>
+      <w:tblPr>
+        <w:tblW w:type="auto" w:w="0"/>
+        <w:jc w:val="center"/>
+        <w:tblLayout w:type="autofit"/>
+        <w:tblLook w:firstColumn="1" w:firstRow="1" w:lastColumn="0" w:lastRow="0" w:noHBand="0" w:noVBand="1" w:val="04A0"/>
+      </w:tblPr>
+      <w:tblGrid>
+        <w:gridCol w:w="3504"/>
+        <w:gridCol w:w="3504"/>
+        <w:gridCol w:w="3504"/>
+      </w:tblGrid>
+      <w:tr>
+        <w:tc>
+          <w:tcPr>
+            <w:tcW w:type="dxa" w:w="1584"/>
+            <w:shd w:fill="005C49"/>
+            <w:tcBorders>
+              <w:top w:val="single" w:sz="6" w:space="0" w:color="005C49"/>
+              <w:left w:val="single" w:sz="6" w:space="0" w:color="005C49"/>
+              <w:bottom w:val="single" w:sz="6" w:space="0" w:color="005C49"/>
+              <w:right w:val="single" w:sz="6" w:space="0" w:color="005C49"/>
+            </w:tcBorders>
+            <w:tcMar>
+              <w:top w:w="80" w:type="dxa"/>
+              <w:bottom w:w="80" w:type="dxa"/>
+              <w:left w:w="100" w:type="dxa"/>
+              <w:right w:w="100" w:type="dxa"/>
+            </w:tcMar>
+          </w:tcPr>
+          <w:p>
+            <w:pPr>
+              <w:spacing w:after="40" w:line="252" w:lineRule="auto"/>
+            </w:pPr>
+            <w:r>
+              <w:rPr>
+                <w:rFonts w:ascii="Aptos" w:hAnsi="Aptos"/>
+                <w:b/>
+                <w:i w:val="0"/>
+                <w:color w:val="FFFFFF"/>
+                <w:sz w:val="14"/>
+              </w:rPr>
+              <w:t>Concept</w:t>
+            </w:r>
+          </w:p>
+        </w:tc>
+        <w:tc>
+          <w:tcPr>
+            <w:tcW w:type="dxa" w:w="3312"/>
+            <w:shd w:fill="005C49"/>
+            <w:tcBorders>
+              <w:top w:val="single" w:sz="6" w:space="0" w:color="005C49"/>
+              <w:left w:val="single" w:sz="6" w:space="0" w:color="005C49"/>
+              <w:bottom w:val="single" w:sz="6" w:space="0" w:color="005C49"/>
+              <w:right w:val="single" w:sz="6" w:space="0" w:color="005C49"/>
+            </w:tcBorders>
+            <w:tcMar>
+              <w:top w:w="80" w:type="dxa"/>
+              <w:bottom w:w="80" w:type="dxa"/>
+              <w:left w:w="100" w:type="dxa"/>
+              <w:right w:w="100" w:type="dxa"/>
+            </w:tcMar>
+          </w:tcPr>
+          <w:p>
+            <w:pPr>
+              <w:spacing w:after="40" w:line="252" w:lineRule="auto"/>
+            </w:pPr>
+            <w:r>
+              <w:rPr>
+                <w:rFonts w:ascii="Aptos" w:hAnsi="Aptos"/>
+                <w:b/>
+                <w:i w:val="0"/>
+                <w:color w:val="FFFFFF"/>
+                <w:sz w:val="14"/>
+              </w:rPr>
+              <w:t>Example</w:t>
+            </w:r>
+          </w:p>
+        </w:tc>
+        <w:tc>
+          <w:tcPr>
+            <w:tcW w:type="dxa" w:w="5184"/>
+            <w:shd w:fill="005C49"/>
+            <w:tcBorders>
+              <w:top w:val="single" w:sz="6" w:space="0" w:color="005C49"/>
+              <w:left w:val="single" w:sz="6" w:space="0" w:color="005C49"/>
+              <w:bottom w:val="single" w:sz="6" w:space="0" w:color="005C49"/>
+              <w:right w:val="single" w:sz="6" w:space="0" w:color="005C49"/>
+            </w:tcBorders>
+            <w:tcMar>
+              <w:top w:w="80" w:type="dxa"/>
+              <w:bottom w:w="80" w:type="dxa"/>
+              <w:left w:w="100" w:type="dxa"/>
+              <w:right w:w="100" w:type="dxa"/>
+            </w:tcMar>
+          </w:tcPr>
+          <w:p>
+            <w:pPr>
+              <w:spacing w:after="40" w:line="252" w:lineRule="auto"/>
+            </w:pPr>
+            <w:r>
+              <w:rPr>
+                <w:rFonts w:ascii="Aptos" w:hAnsi="Aptos"/>
+                <w:b/>
+                <w:i w:val="0"/>
+                <w:color w:val="FFFFFF"/>
+                <w:sz w:val="14"/>
+              </w:rPr>
+              <w:t>Teacher explanation</w:t>
+            </w:r>
+          </w:p>
+        </w:tc>
+      </w:tr>
+      <w:tr>
+        <w:tc>
+          <w:tcPr>
+            <w:tcW w:type="dxa" w:w="3504"/>
+            <w:shd w:fill="FFFFFF"/>
+            <w:tcBorders>
+              <w:top w:val="single" w:sz="6" w:space="0" w:color="D8E1DD"/>
+              <w:left w:val="single" w:sz="6" w:space="0" w:color="D8E1DD"/>
+              <w:bottom w:val="single" w:sz="6" w:space="0" w:color="D8E1DD"/>
+              <w:right w:val="single" w:sz="6" w:space="0" w:color="D8E1DD"/>
+            </w:tcBorders>
+            <w:tcMar>
+              <w:top w:w="80" w:type="dxa"/>
+              <w:bottom w:w="80" w:type="dxa"/>
+              <w:left w:w="100" w:type="dxa"/>
+              <w:right w:w="100" w:type="dxa"/>
+            </w:tcMar>
+          </w:tcPr>
+          <w:p>
+            <w:pPr>
+              <w:spacing w:after="40" w:line="252" w:lineRule="auto"/>
+            </w:pPr>
+            <w:r>
+              <w:rPr>
+                <w:rFonts w:ascii="Aptos" w:hAnsi="Aptos"/>
+                <w:i w:val="0"/>
+                <w:color w:val="17231F"/>
+                <w:sz w:val="14"/>
+              </w:rPr>
+              <w:t>Function</w:t>
+            </w:r>
+          </w:p>
+        </w:tc>
+        <w:tc>
+          <w:tcPr>
+            <w:tcW w:type="dxa" w:w="3504"/>
+            <w:shd w:fill="FFFFFF"/>
+            <w:tcBorders>
+              <w:top w:val="single" w:sz="6" w:space="0" w:color="D8E1DD"/>
+              <w:left w:val="single" w:sz="6" w:space="0" w:color="D8E1DD"/>
+              <w:bottom w:val="single" w:sz="6" w:space="0" w:color="D8E1DD"/>
+              <w:right w:val="single" w:sz="6" w:space="0" w:color="D8E1DD"/>
+            </w:tcBorders>
+            <w:tcMar>
+              <w:top w:w="80" w:type="dxa"/>
+              <w:bottom w:w="80" w:type="dxa"/>
+              <w:left w:w="100" w:type="dxa"/>
+              <w:right w:w="100" w:type="dxa"/>
+            </w:tcMar>
+          </w:tcPr>
+          <w:p>
+            <w:pPr>
+              <w:spacing w:after="40" w:line="252" w:lineRule="auto"/>
+            </w:pPr>
+            <w:r>
+              <w:rPr>
+                <w:rFonts w:ascii="Aptos" w:hAnsi="Aptos"/>
+                <w:i w:val="0"/>
+                <w:color w:val="17231F"/>
+                <w:sz w:val="14"/>
+              </w:rPr>
+              <w:t>f(x)=y</w:t>
+            </w:r>
+          </w:p>
+        </w:tc>
+        <w:tc>
+          <w:tcPr>
+            <w:tcW w:type="dxa" w:w="3504"/>
+            <w:shd w:fill="FFFFFF"/>
+            <w:tcBorders>
+              <w:top w:val="single" w:sz="6" w:space="0" w:color="D8E1DD"/>
+              <w:left w:val="single" w:sz="6" w:space="0" w:color="D8E1DD"/>
+              <w:bottom w:val="single" w:sz="6" w:space="0" w:color="D8E1DD"/>
+              <w:right w:val="single" w:sz="6" w:space="0" w:color="D8E1DD"/>
+            </w:tcBorders>
+            <w:tcMar>
+              <w:top w:w="80" w:type="dxa"/>
+              <w:bottom w:w="80" w:type="dxa"/>
+              <w:left w:w="100" w:type="dxa"/>
+              <w:right w:w="100" w:type="dxa"/>
+            </w:tcMar>
+          </w:tcPr>
+          <w:p>
+            <w:pPr>
+              <w:spacing w:after="40" w:line="252" w:lineRule="auto"/>
+            </w:pPr>
+            <w:r>
+              <w:rPr>
+                <w:rFonts w:ascii="Aptos" w:hAnsi="Aptos"/>
+                <w:i w:val="0"/>
+                <w:color w:val="17231F"/>
+                <w:sz w:val="14"/>
+              </w:rPr>
+              <w:t>Prompt -&gt; model -&gt; response. In code: def model(prompt): return response</w:t>
+            </w:r>
+          </w:p>
+        </w:tc>
+      </w:tr>
+      <w:tr>
+        <w:tc>
+          <w:tcPr>
+            <w:tcW w:type="dxa" w:w="3504"/>
+            <w:shd w:fill="FFFFFF"/>
+            <w:tcBorders>
+              <w:top w:val="single" w:sz="6" w:space="0" w:color="D8E1DD"/>
+              <w:left w:val="single" w:sz="6" w:space="0" w:color="D8E1DD"/>
+              <w:bottom w:val="single" w:sz="6" w:space="0" w:color="D8E1DD"/>
+              <w:right w:val="single" w:sz="6" w:space="0" w:color="D8E1DD"/>
+            </w:tcBorders>
+            <w:tcMar>
+              <w:top w:w="80" w:type="dxa"/>
+              <w:bottom w:w="80" w:type="dxa"/>
+              <w:left w:w="100" w:type="dxa"/>
+              <w:right w:w="100" w:type="dxa"/>
+            </w:tcMar>
+          </w:tcPr>
+          <w:p>
+            <w:pPr>
+              <w:spacing w:after="40" w:line="252" w:lineRule="auto"/>
+            </w:pPr>
+            <w:r>
+              <w:rPr>
+                <w:rFonts w:ascii="Aptos" w:hAnsi="Aptos"/>
+                <w:i w:val="0"/>
+                <w:color w:val="17231F"/>
+                <w:sz w:val="14"/>
+              </w:rPr>
+              <w:t>Token to vector</w:t>
+            </w:r>
+          </w:p>
+        </w:tc>
+        <w:tc>
+          <w:tcPr>
+            <w:tcW w:type="dxa" w:w="3504"/>
+            <w:shd w:fill="FFFFFF"/>
+            <w:tcBorders>
+              <w:top w:val="single" w:sz="6" w:space="0" w:color="D8E1DD"/>
+              <w:left w:val="single" w:sz="6" w:space="0" w:color="D8E1DD"/>
+              <w:bottom w:val="single" w:sz="6" w:space="0" w:color="D8E1DD"/>
+              <w:right w:val="single" w:sz="6" w:space="0" w:color="D8E1DD"/>
+            </w:tcBorders>
+            <w:tcMar>
+              <w:top w:w="80" w:type="dxa"/>
+              <w:bottom w:w="80" w:type="dxa"/>
+              <w:left w:w="100" w:type="dxa"/>
+              <w:right w:w="100" w:type="dxa"/>
+            </w:tcMar>
+          </w:tcPr>
+          <w:p>
+            <w:pPr>
+              <w:spacing w:after="40" w:line="252" w:lineRule="auto"/>
+            </w:pPr>
+            <w:r>
+              <w:rPr>
+                <w:rFonts w:ascii="Aptos" w:hAnsi="Aptos"/>
+                <w:i w:val="0"/>
+                <w:color w:val="17231F"/>
+                <w:sz w:val="14"/>
+              </w:rPr>
+              <w:t>robot -&gt; [0.12, -0.44, 0.81, ...]</w:t>
+            </w:r>
+          </w:p>
+        </w:tc>
+        <w:tc>
+          <w:tcPr>
+            <w:tcW w:type="dxa" w:w="3504"/>
+            <w:shd w:fill="FFFFFF"/>
+            <w:tcBorders>
+              <w:top w:val="single" w:sz="6" w:space="0" w:color="D8E1DD"/>
+              <w:left w:val="single" w:sz="6" w:space="0" w:color="D8E1DD"/>
+              <w:bottom w:val="single" w:sz="6" w:space="0" w:color="D8E1DD"/>
+              <w:right w:val="single" w:sz="6" w:space="0" w:color="D8E1DD"/>
+            </w:tcBorders>
+            <w:tcMar>
+              <w:top w:w="80" w:type="dxa"/>
+              <w:bottom w:w="80" w:type="dxa"/>
+              <w:left w:w="100" w:type="dxa"/>
+              <w:right w:w="100" w:type="dxa"/>
+            </w:tcMar>
+          </w:tcPr>
+          <w:p>
+            <w:pPr>
+              <w:spacing w:after="40" w:line="252" w:lineRule="auto"/>
+            </w:pPr>
+            <w:r>
+              <w:rPr>
+                <w:rFonts w:ascii="Aptos" w:hAnsi="Aptos"/>
+                <w:i w:val="0"/>
+                <w:color w:val="17231F"/>
+                <w:sz w:val="14"/>
+              </w:rPr>
+              <w:t>Text must become numbers before a model can calculate with it.</w:t>
+            </w:r>
+          </w:p>
+        </w:tc>
+      </w:tr>
+      <w:tr>
+        <w:tc>
+          <w:tcPr>
+            <w:tcW w:type="dxa" w:w="3504"/>
+            <w:shd w:fill="FFFFFF"/>
+            <w:tcBorders>
+              <w:top w:val="single" w:sz="6" w:space="0" w:color="D8E1DD"/>
+              <w:left w:val="single" w:sz="6" w:space="0" w:color="D8E1DD"/>
+              <w:bottom w:val="single" w:sz="6" w:space="0" w:color="D8E1DD"/>
+              <w:right w:val="single" w:sz="6" w:space="0" w:color="D8E1DD"/>
+            </w:tcBorders>
+            <w:tcMar>
+              <w:top w:w="80" w:type="dxa"/>
+              <w:bottom w:w="80" w:type="dxa"/>
+              <w:left w:w="100" w:type="dxa"/>
+              <w:right w:w="100" w:type="dxa"/>
+            </w:tcMar>
+          </w:tcPr>
+          <w:p>
+            <w:pPr>
+              <w:spacing w:after="40" w:line="252" w:lineRule="auto"/>
+            </w:pPr>
+            <w:r>
+              <w:rPr>
+                <w:rFonts w:ascii="Aptos" w:hAnsi="Aptos"/>
+                <w:i w:val="0"/>
+                <w:color w:val="17231F"/>
+                <w:sz w:val="14"/>
+              </w:rPr>
+              <w:t>Vector similarity</w:t>
+            </w:r>
+          </w:p>
+        </w:tc>
+        <w:tc>
+          <w:tcPr>
+            <w:tcW w:type="dxa" w:w="3504"/>
+            <w:shd w:fill="FFFFFF"/>
+            <w:tcBorders>
+              <w:top w:val="single" w:sz="6" w:space="0" w:color="D8E1DD"/>
+              <w:left w:val="single" w:sz="6" w:space="0" w:color="D8E1DD"/>
+              <w:bottom w:val="single" w:sz="6" w:space="0" w:color="D8E1DD"/>
+              <w:right w:val="single" w:sz="6" w:space="0" w:color="D8E1DD"/>
+            </w:tcBorders>
+            <w:tcMar>
+              <w:top w:w="80" w:type="dxa"/>
+              <w:bottom w:w="80" w:type="dxa"/>
+              <w:left w:w="100" w:type="dxa"/>
+              <w:right w:w="100" w:type="dxa"/>
+            </w:tcMar>
+          </w:tcPr>
+          <w:p>
+            <w:pPr>
+              <w:spacing w:after="40" w:line="252" w:lineRule="auto"/>
+            </w:pPr>
+            <w:r>
+              <w:rPr>
+                <w:rFonts w:ascii="Aptos" w:hAnsi="Aptos"/>
+                <w:i w:val="0"/>
+                <w:color w:val="17231F"/>
+                <w:sz w:val="14"/>
+              </w:rPr>
+              <w:t>A=[3,4], B=[4,3], cos(theta)=24/25=0.96</w:t>
+            </w:r>
+          </w:p>
+        </w:tc>
+        <w:tc>
+          <w:tcPr>
+            <w:tcW w:type="dxa" w:w="3504"/>
+            <w:shd w:fill="FFFFFF"/>
+            <w:tcBorders>
+              <w:top w:val="single" w:sz="6" w:space="0" w:color="D8E1DD"/>
+              <w:left w:val="single" w:sz="6" w:space="0" w:color="D8E1DD"/>
+              <w:bottom w:val="single" w:sz="6" w:space="0" w:color="D8E1DD"/>
+              <w:right w:val="single" w:sz="6" w:space="0" w:color="D8E1DD"/>
+            </w:tcBorders>
+            <w:tcMar>
+              <w:top w:w="80" w:type="dxa"/>
+              <w:bottom w:w="80" w:type="dxa"/>
+              <w:left w:w="100" w:type="dxa"/>
+              <w:right w:w="100" w:type="dxa"/>
+            </w:tcMar>
+          </w:tcPr>
+          <w:p>
+            <w:pPr>
+              <w:spacing w:after="40" w:line="252" w:lineRule="auto"/>
+            </w:pPr>
+            <w:r>
+              <w:rPr>
+                <w:rFonts w:ascii="Aptos" w:hAnsi="Aptos"/>
+                <w:i w:val="0"/>
+                <w:color w:val="17231F"/>
+                <w:sz w:val="14"/>
+              </w:rPr>
+              <w:t>Related vectors point in similar directions. Similarity is calculated, not felt.</w:t>
+            </w:r>
+          </w:p>
+        </w:tc>
+      </w:tr>
+      <w:tr>
+        <w:tc>
+          <w:tcPr>
+            <w:tcW w:type="dxa" w:w="3504"/>
+            <w:shd w:fill="FFFFFF"/>
+            <w:tcBorders>
+              <w:top w:val="single" w:sz="6" w:space="0" w:color="D8E1DD"/>
+              <w:left w:val="single" w:sz="6" w:space="0" w:color="D8E1DD"/>
+              <w:bottom w:val="single" w:sz="6" w:space="0" w:color="D8E1DD"/>
+              <w:right w:val="single" w:sz="6" w:space="0" w:color="D8E1DD"/>
+            </w:tcBorders>
+            <w:tcMar>
+              <w:top w:w="80" w:type="dxa"/>
+              <w:bottom w:w="80" w:type="dxa"/>
+              <w:left w:w="100" w:type="dxa"/>
+              <w:right w:w="100" w:type="dxa"/>
+            </w:tcMar>
+          </w:tcPr>
+          <w:p>
+            <w:pPr>
+              <w:spacing w:after="40" w:line="252" w:lineRule="auto"/>
+            </w:pPr>
+            <w:r>
+              <w:rPr>
+                <w:rFonts w:ascii="Aptos" w:hAnsi="Aptos"/>
+                <w:i w:val="0"/>
+                <w:color w:val="17231F"/>
+                <w:sz w:val="14"/>
+              </w:rPr>
+              <w:t>Weighted sum</w:t>
+            </w:r>
+          </w:p>
+        </w:tc>
+        <w:tc>
+          <w:tcPr>
+            <w:tcW w:type="dxa" w:w="3504"/>
+            <w:shd w:fill="FFFFFF"/>
+            <w:tcBorders>
+              <w:top w:val="single" w:sz="6" w:space="0" w:color="D8E1DD"/>
+              <w:left w:val="single" w:sz="6" w:space="0" w:color="D8E1DD"/>
+              <w:bottom w:val="single" w:sz="6" w:space="0" w:color="D8E1DD"/>
+              <w:right w:val="single" w:sz="6" w:space="0" w:color="D8E1DD"/>
+            </w:tcBorders>
+            <w:tcMar>
+              <w:top w:w="80" w:type="dxa"/>
+              <w:bottom w:w="80" w:type="dxa"/>
+              <w:left w:w="100" w:type="dxa"/>
+              <w:right w:w="100" w:type="dxa"/>
+            </w:tcMar>
+          </w:tcPr>
+          <w:p>
+            <w:pPr>
+              <w:spacing w:after="40" w:line="252" w:lineRule="auto"/>
+            </w:pPr>
+            <w:r>
+              <w:rPr>
+                <w:rFonts w:ascii="Aptos" w:hAnsi="Aptos"/>
+                <w:i w:val="0"/>
+                <w:color w:val="17231F"/>
+                <w:sz w:val="14"/>
+              </w:rPr>
+              <w:t>z = w1*x1 + w2*x2 + b</w:t>
+            </w:r>
+          </w:p>
+        </w:tc>
+        <w:tc>
+          <w:tcPr>
+            <w:tcW w:type="dxa" w:w="3504"/>
+            <w:shd w:fill="FFFFFF"/>
+            <w:tcBorders>
+              <w:top w:val="single" w:sz="6" w:space="0" w:color="D8E1DD"/>
+              <w:left w:val="single" w:sz="6" w:space="0" w:color="D8E1DD"/>
+              <w:bottom w:val="single" w:sz="6" w:space="0" w:color="D8E1DD"/>
+              <w:right w:val="single" w:sz="6" w:space="0" w:color="D8E1DD"/>
+            </w:tcBorders>
+            <w:tcMar>
+              <w:top w:w="80" w:type="dxa"/>
+              <w:bottom w:w="80" w:type="dxa"/>
+              <w:left w:w="100" w:type="dxa"/>
+              <w:right w:w="100" w:type="dxa"/>
+            </w:tcMar>
+          </w:tcPr>
+          <w:p>
+            <w:pPr>
+              <w:spacing w:after="40" w:line="252" w:lineRule="auto"/>
+            </w:pPr>
+            <w:r>
+              <w:rPr>
+                <w:rFonts w:ascii="Aptos" w:hAnsi="Aptos"/>
+                <w:i w:val="0"/>
+                <w:color w:val="17231F"/>
+                <w:sz w:val="14"/>
+              </w:rPr>
+              <w:t>Weights decide which signals matter more. Training changes the weights.</w:t>
+            </w:r>
+          </w:p>
+        </w:tc>
+      </w:tr>
+      <w:tr>
+        <w:tc>
+          <w:tcPr>
+            <w:tcW w:type="dxa" w:w="3504"/>
+            <w:shd w:fill="FFFFFF"/>
+            <w:tcBorders>
+              <w:top w:val="single" w:sz="6" w:space="0" w:color="D8E1DD"/>
+              <w:left w:val="single" w:sz="6" w:space="0" w:color="D8E1DD"/>
+              <w:bottom w:val="single" w:sz="6" w:space="0" w:color="D8E1DD"/>
+              <w:right w:val="single" w:sz="6" w:space="0" w:color="D8E1DD"/>
+            </w:tcBorders>
+            <w:tcMar>
+              <w:top w:w="80" w:type="dxa"/>
+              <w:bottom w:w="80" w:type="dxa"/>
+              <w:left w:w="100" w:type="dxa"/>
+              <w:right w:w="100" w:type="dxa"/>
+            </w:tcMar>
+          </w:tcPr>
+          <w:p>
+            <w:pPr>
+              <w:spacing w:after="40" w:line="252" w:lineRule="auto"/>
+            </w:pPr>
+            <w:r>
+              <w:rPr>
+                <w:rFonts w:ascii="Aptos" w:hAnsi="Aptos"/>
+                <w:i w:val="0"/>
+                <w:color w:val="17231F"/>
+                <w:sz w:val="14"/>
+              </w:rPr>
+              <w:t>Loss</w:t>
+            </w:r>
+          </w:p>
+        </w:tc>
+        <w:tc>
+          <w:tcPr>
+            <w:tcW w:type="dxa" w:w="3504"/>
+            <w:shd w:fill="FFFFFF"/>
+            <w:tcBorders>
+              <w:top w:val="single" w:sz="6" w:space="0" w:color="D8E1DD"/>
+              <w:left w:val="single" w:sz="6" w:space="0" w:color="D8E1DD"/>
+              <w:bottom w:val="single" w:sz="6" w:space="0" w:color="D8E1DD"/>
+              <w:right w:val="single" w:sz="6" w:space="0" w:color="D8E1DD"/>
+            </w:tcBorders>
+            <w:tcMar>
+              <w:top w:w="80" w:type="dxa"/>
+              <w:bottom w:w="80" w:type="dxa"/>
+              <w:left w:w="100" w:type="dxa"/>
+              <w:right w:w="100" w:type="dxa"/>
+            </w:tcMar>
+          </w:tcPr>
+          <w:p>
+            <w:pPr>
+              <w:spacing w:after="40" w:line="252" w:lineRule="auto"/>
+            </w:pPr>
+            <w:r>
+              <w:rPr>
+                <w:rFonts w:ascii="Aptos" w:hAnsi="Aptos"/>
+                <w:i w:val="0"/>
+                <w:color w:val="17231F"/>
+                <w:sz w:val="14"/>
+              </w:rPr>
+              <w:t>If p(Paris)=0.90, loss is low. If p(Paris)=0.01, loss is high.</w:t>
+            </w:r>
+          </w:p>
+        </w:tc>
+        <w:tc>
+          <w:tcPr>
+            <w:tcW w:type="dxa" w:w="3504"/>
+            <w:shd w:fill="FFFFFF"/>
+            <w:tcBorders>
+              <w:top w:val="single" w:sz="6" w:space="0" w:color="D8E1DD"/>
+              <w:left w:val="single" w:sz="6" w:space="0" w:color="D8E1DD"/>
+              <w:bottom w:val="single" w:sz="6" w:space="0" w:color="D8E1DD"/>
+              <w:right w:val="single" w:sz="6" w:space="0" w:color="D8E1DD"/>
+            </w:tcBorders>
+            <w:tcMar>
+              <w:top w:w="80" w:type="dxa"/>
+              <w:bottom w:w="80" w:type="dxa"/>
+              <w:left w:w="100" w:type="dxa"/>
+              <w:right w:w="100" w:type="dxa"/>
+            </w:tcMar>
+          </w:tcPr>
+          <w:p>
+            <w:pPr>
+              <w:spacing w:after="40" w:line="252" w:lineRule="auto"/>
+            </w:pPr>
+            <w:r>
+              <w:rPr>
+                <w:rFonts w:ascii="Aptos" w:hAnsi="Aptos"/>
+                <w:i w:val="0"/>
+                <w:color w:val="17231F"/>
+                <w:sz w:val="14"/>
+              </w:rPr>
+              <w:t>Loss measures error. Training tries to reduce it.</w:t>
+            </w:r>
+          </w:p>
+        </w:tc>
+      </w:tr>
+      <w:tr>
+        <w:tc>
+          <w:tcPr>
+            <w:tcW w:type="dxa" w:w="3504"/>
+            <w:shd w:fill="FFFFFF"/>
+            <w:tcBorders>
+              <w:top w:val="single" w:sz="6" w:space="0" w:color="D8E1DD"/>
+              <w:left w:val="single" w:sz="6" w:space="0" w:color="D8E1DD"/>
+              <w:bottom w:val="single" w:sz="6" w:space="0" w:color="D8E1DD"/>
+              <w:right w:val="single" w:sz="6" w:space="0" w:color="D8E1DD"/>
+            </w:tcBorders>
+            <w:tcMar>
+              <w:top w:w="80" w:type="dxa"/>
+              <w:bottom w:w="80" w:type="dxa"/>
+              <w:left w:w="100" w:type="dxa"/>
+              <w:right w:w="100" w:type="dxa"/>
+            </w:tcMar>
+          </w:tcPr>
+          <w:p>
+            <w:pPr>
+              <w:spacing w:after="40" w:line="252" w:lineRule="auto"/>
+            </w:pPr>
+            <w:r>
+              <w:rPr>
+                <w:rFonts w:ascii="Aptos" w:hAnsi="Aptos"/>
+                <w:i w:val="0"/>
+                <w:color w:val="17231F"/>
+                <w:sz w:val="14"/>
+              </w:rPr>
+              <w:t>Softmax</w:t>
+            </w:r>
+          </w:p>
+        </w:tc>
+        <w:tc>
+          <w:tcPr>
+            <w:tcW w:type="dxa" w:w="3504"/>
+            <w:shd w:fill="FFFFFF"/>
+            <w:tcBorders>
+              <w:top w:val="single" w:sz="6" w:space="0" w:color="D8E1DD"/>
+              <w:left w:val="single" w:sz="6" w:space="0" w:color="D8E1DD"/>
+              <w:bottom w:val="single" w:sz="6" w:space="0" w:color="D8E1DD"/>
+              <w:right w:val="single" w:sz="6" w:space="0" w:color="D8E1DD"/>
+            </w:tcBorders>
+            <w:tcMar>
+              <w:top w:w="80" w:type="dxa"/>
+              <w:bottom w:w="80" w:type="dxa"/>
+              <w:left w:w="100" w:type="dxa"/>
+              <w:right w:w="100" w:type="dxa"/>
+            </w:tcMar>
+          </w:tcPr>
+          <w:p>
+            <w:pPr>
+              <w:spacing w:after="40" w:line="252" w:lineRule="auto"/>
+            </w:pPr>
+            <w:r>
+              <w:rPr>
+                <w:rFonts w:ascii="Aptos" w:hAnsi="Aptos"/>
+                <w:i w:val="0"/>
+                <w:color w:val="17231F"/>
+                <w:sz w:val="14"/>
+              </w:rPr>
+              <w:t>robot 0.61, sensor 0.32, toaster 0.07</w:t>
+            </w:r>
+          </w:p>
+        </w:tc>
+        <w:tc>
+          <w:tcPr>
+            <w:tcW w:type="dxa" w:w="3504"/>
+            <w:shd w:fill="FFFFFF"/>
+            <w:tcBorders>
+              <w:top w:val="single" w:sz="6" w:space="0" w:color="D8E1DD"/>
+              <w:left w:val="single" w:sz="6" w:space="0" w:color="D8E1DD"/>
+              <w:bottom w:val="single" w:sz="6" w:space="0" w:color="D8E1DD"/>
+              <w:right w:val="single" w:sz="6" w:space="0" w:color="D8E1DD"/>
+            </w:tcBorders>
+            <w:tcMar>
+              <w:top w:w="80" w:type="dxa"/>
+              <w:bottom w:w="80" w:type="dxa"/>
+              <w:left w:w="100" w:type="dxa"/>
+              <w:right w:w="100" w:type="dxa"/>
+            </w:tcMar>
+          </w:tcPr>
+          <w:p>
+            <w:pPr>
+              <w:spacing w:after="40" w:line="252" w:lineRule="auto"/>
+            </w:pPr>
+            <w:r>
+              <w:rPr>
+                <w:rFonts w:ascii="Aptos" w:hAnsi="Aptos"/>
+                <w:i w:val="0"/>
+                <w:color w:val="17231F"/>
+                <w:sz w:val="14"/>
+              </w:rPr>
+              <w:t>Scores become probabilities that sum to 1.</w:t>
+            </w:r>
+          </w:p>
+        </w:tc>
+      </w:tr>
+      <w:tr>
+        <w:tc>
+          <w:tcPr>
+            <w:tcW w:type="dxa" w:w="3504"/>
+            <w:shd w:fill="FFFFFF"/>
+            <w:tcBorders>
+              <w:top w:val="single" w:sz="6" w:space="0" w:color="D8E1DD"/>
+              <w:left w:val="single" w:sz="6" w:space="0" w:color="D8E1DD"/>
+              <w:bottom w:val="single" w:sz="6" w:space="0" w:color="D8E1DD"/>
+              <w:right w:val="single" w:sz="6" w:space="0" w:color="D8E1DD"/>
+            </w:tcBorders>
+            <w:tcMar>
+              <w:top w:w="80" w:type="dxa"/>
+              <w:bottom w:w="80" w:type="dxa"/>
+              <w:left w:w="100" w:type="dxa"/>
+              <w:right w:w="100" w:type="dxa"/>
+            </w:tcMar>
+          </w:tcPr>
+          <w:p>
+            <w:pPr>
+              <w:spacing w:after="40" w:line="252" w:lineRule="auto"/>
+            </w:pPr>
+            <w:r>
+              <w:rPr>
+                <w:rFonts w:ascii="Aptos" w:hAnsi="Aptos"/>
+                <w:i w:val="0"/>
+                <w:color w:val="17231F"/>
+                <w:sz w:val="14"/>
+              </w:rPr>
+              <w:t>Attention</w:t>
+            </w:r>
+          </w:p>
+        </w:tc>
+        <w:tc>
+          <w:tcPr>
+            <w:tcW w:type="dxa" w:w="3504"/>
+            <w:shd w:fill="FFFFFF"/>
+            <w:tcBorders>
+              <w:top w:val="single" w:sz="6" w:space="0" w:color="D8E1DD"/>
+              <w:left w:val="single" w:sz="6" w:space="0" w:color="D8E1DD"/>
+              <w:bottom w:val="single" w:sz="6" w:space="0" w:color="D8E1DD"/>
+              <w:right w:val="single" w:sz="6" w:space="0" w:color="D8E1DD"/>
+            </w:tcBorders>
+            <w:tcMar>
+              <w:top w:w="80" w:type="dxa"/>
+              <w:bottom w:w="80" w:type="dxa"/>
+              <w:left w:w="100" w:type="dxa"/>
+              <w:right w:w="100" w:type="dxa"/>
+            </w:tcMar>
+          </w:tcPr>
+          <w:p>
+            <w:pPr>
+              <w:spacing w:after="40" w:line="252" w:lineRule="auto"/>
+            </w:pPr>
+            <w:r>
+              <w:rPr>
+                <w:rFonts w:ascii="Aptos" w:hAnsi="Aptos"/>
+                <w:i w:val="0"/>
+                <w:color w:val="17231F"/>
+                <w:sz w:val="14"/>
+              </w:rPr>
+              <w:t>it -&gt; gear, gear has highest attention weight</w:t>
+            </w:r>
+          </w:p>
+        </w:tc>
+        <w:tc>
+          <w:tcPr>
+            <w:tcW w:type="dxa" w:w="3504"/>
+            <w:shd w:fill="FFFFFF"/>
+            <w:tcBorders>
+              <w:top w:val="single" w:sz="6" w:space="0" w:color="D8E1DD"/>
+              <w:left w:val="single" w:sz="6" w:space="0" w:color="D8E1DD"/>
+              <w:bottom w:val="single" w:sz="6" w:space="0" w:color="D8E1DD"/>
+              <w:right w:val="single" w:sz="6" w:space="0" w:color="D8E1DD"/>
+            </w:tcBorders>
+            <w:tcMar>
+              <w:top w:w="80" w:type="dxa"/>
+              <w:bottom w:w="80" w:type="dxa"/>
+              <w:left w:w="100" w:type="dxa"/>
+              <w:right w:w="100" w:type="dxa"/>
+            </w:tcMar>
+          </w:tcPr>
+          <w:p>
+            <w:pPr>
+              <w:spacing w:after="40" w:line="252" w:lineRule="auto"/>
+            </w:pPr>
+            <w:r>
+              <w:rPr>
+                <w:rFonts w:ascii="Aptos" w:hAnsi="Aptos"/>
+                <w:i w:val="0"/>
+                <w:color w:val="17231F"/>
+                <w:sz w:val="14"/>
+              </w:rPr>
+              <w:t>Attention weights relationships in context.</w:t>
+            </w:r>
+          </w:p>
+        </w:tc>
+      </w:tr>
+      <w:tr>
+        <w:tc>
+          <w:tcPr>
+            <w:tcW w:type="dxa" w:w="3504"/>
+            <w:shd w:fill="FFFFFF"/>
+            <w:tcBorders>
+              <w:top w:val="single" w:sz="6" w:space="0" w:color="D8E1DD"/>
+              <w:left w:val="single" w:sz="6" w:space="0" w:color="D8E1DD"/>
+              <w:bottom w:val="single" w:sz="6" w:space="0" w:color="D8E1DD"/>
+              <w:right w:val="single" w:sz="6" w:space="0" w:color="D8E1DD"/>
+            </w:tcBorders>
+            <w:tcMar>
+              <w:top w:w="80" w:type="dxa"/>
+              <w:bottom w:w="80" w:type="dxa"/>
+              <w:left w:w="100" w:type="dxa"/>
+              <w:right w:w="100" w:type="dxa"/>
+            </w:tcMar>
+          </w:tcPr>
+          <w:p>
+            <w:pPr>
+              <w:spacing w:after="40" w:line="252" w:lineRule="auto"/>
+            </w:pPr>
+            <w:r>
+              <w:rPr>
+                <w:rFonts w:ascii="Aptos" w:hAnsi="Aptos"/>
+                <w:i w:val="0"/>
+                <w:color w:val="17231F"/>
+                <w:sz w:val="14"/>
+              </w:rPr>
+              <w:t>Loop</w:t>
+            </w:r>
+          </w:p>
+        </w:tc>
+        <w:tc>
+          <w:tcPr>
+            <w:tcW w:type="dxa" w:w="3504"/>
+            <w:shd w:fill="FFFFFF"/>
+            <w:tcBorders>
+              <w:top w:val="single" w:sz="6" w:space="0" w:color="D8E1DD"/>
+              <w:left w:val="single" w:sz="6" w:space="0" w:color="D8E1DD"/>
+              <w:bottom w:val="single" w:sz="6" w:space="0" w:color="D8E1DD"/>
+              <w:right w:val="single" w:sz="6" w:space="0" w:color="D8E1DD"/>
+            </w:tcBorders>
+            <w:tcMar>
+              <w:top w:w="80" w:type="dxa"/>
+              <w:bottom w:w="80" w:type="dxa"/>
+              <w:left w:w="100" w:type="dxa"/>
+              <w:right w:w="100" w:type="dxa"/>
+            </w:tcMar>
+          </w:tcPr>
+          <w:p>
+            <w:pPr>
+              <w:spacing w:after="40" w:line="252" w:lineRule="auto"/>
+            </w:pPr>
+            <w:r>
+              <w:rPr>
+                <w:rFonts w:ascii="Aptos" w:hAnsi="Aptos"/>
+                <w:i w:val="0"/>
+                <w:color w:val="17231F"/>
+                <w:sz w:val="14"/>
+              </w:rPr>
+              <w:t>predict -&gt; sample -&gt; append -&gt; continue</w:t>
+            </w:r>
+          </w:p>
+        </w:tc>
+        <w:tc>
+          <w:tcPr>
+            <w:tcW w:type="dxa" w:w="3504"/>
+            <w:shd w:fill="FFFFFF"/>
+            <w:tcBorders>
+              <w:top w:val="single" w:sz="6" w:space="0" w:color="D8E1DD"/>
+              <w:left w:val="single" w:sz="6" w:space="0" w:color="D8E1DD"/>
+              <w:bottom w:val="single" w:sz="6" w:space="0" w:color="D8E1DD"/>
+              <w:right w:val="single" w:sz="6" w:space="0" w:color="D8E1DD"/>
+            </w:tcBorders>
+            <w:tcMar>
+              <w:top w:w="80" w:type="dxa"/>
+              <w:bottom w:w="80" w:type="dxa"/>
+              <w:left w:w="100" w:type="dxa"/>
+              <w:right w:w="100" w:type="dxa"/>
+            </w:tcMar>
+          </w:tcPr>
+          <w:p>
+            <w:pPr>
+              <w:spacing w:after="40" w:line="252" w:lineRule="auto"/>
+            </w:pPr>
+            <w:r>
+              <w:rPr>
+                <w:rFonts w:ascii="Aptos" w:hAnsi="Aptos"/>
+                <w:i w:val="0"/>
+                <w:color w:val="17231F"/>
+                <w:sz w:val="14"/>
+              </w:rPr>
+              <w:t>Generation is step by step, not magic.</w:t>
+            </w:r>
+          </w:p>
+        </w:tc>
+      </w:tr>
+    </w:tbl>
+    <w:p>
+      <w:r>
+        <w:br w:type="page"/>
       </w:r>
     </w:p>
     <w:p>
       <w:pPr>
-        <w:pStyle w:val="ListBullet"/>
+        <w:pStyle w:val="Heading2"/>
+        <w:spacing w:before="120" w:after="80"/>
       </w:pPr>
       <w:r>
-        <w:t>Uses prediction before explanation to activate prior knowledge.</w:t>
+        <w:rPr>
+          <w:rFonts w:ascii="Georgia" w:hAnsi="Georgia"/>
+          <w:b/>
+          <w:color w:val="005C49"/>
+          <w:sz w:val="26"/>
+        </w:rPr>
+        <w:t>Simulation integration</w:t>
       </w:r>
     </w:p>
     <w:p>
       <w:pPr>
-        <w:pStyle w:val="ListBullet"/>
+        <w:spacing w:after="40"/>
+        <w:jc w:val="center"/>
       </w:pPr>
       <w:r>
-        <w:t>Uses visual models to reduce cognitive load.</w:t>
+        <w:drawing>
+          <wp:inline xmlns:a="http://schemas.openxmlformats.org/drawingml/2006/main" xmlns:pic="http://schemas.openxmlformats.org/drawingml/2006/picture">
+            <wp:extent cx="5303520" cy="3104942"/>
+            <wp:docPr id="1" name="Picture 1"/>
+            <wp:cNvGraphicFramePr>
+              <a:graphicFrameLocks noChangeAspect="1"/>
+            </wp:cNvGraphicFramePr>
+            <a:graphic>
+              <a:graphicData uri="http://schemas.openxmlformats.org/drawingml/2006/picture">
+                <pic:pic>
+                  <pic:nvPicPr>
+                    <pic:cNvPr id="0" name="Screenshot 2026-05-22 at 8.34.27 PM.png"/>
+                    <pic:cNvPicPr/>
+                  </pic:nvPicPr>
+                  <pic:blipFill>
+                    <a:blip r:embed="rId11"/>
+                    <a:stretch>
+                      <a:fillRect/>
+                    </a:stretch>
+                  </pic:blipFill>
+                  <pic:spPr>
+                    <a:xfrm>
+                      <a:off x="0" y="0"/>
+                      <a:ext cx="5303520" cy="3104942"/>
+                    </a:xfrm>
+                    <a:prstGeom prst="rect"/>
+                  </pic:spPr>
+                </pic:pic>
+              </a:graphicData>
+            </a:graphic>
+          </wp:inline>
+        </w:drawing>
       </w:r>
     </w:p>
     <w:p>
       <w:pPr>
-        <w:pStyle w:val="ListBullet"/>
+        <w:spacing w:after="80"/>
+        <w:jc w:val="center"/>
       </w:pPr>
       <w:r>
-        <w:t>Uses visible thinking through short prediction, clustering, and exit routines.</w:t>
+        <w:rPr>
+          <w:rFonts w:ascii="Aptos" w:hAnsi="Aptos"/>
+          <w:i/>
+          <w:color w:val="616E69"/>
+          <w:sz w:val="15"/>
+        </w:rPr>
+        <w:t>Simulation 1: Tokens and Similarity. Students compare token pairs and observe cosine similarity and clusters.</w:t>
       </w:r>
     </w:p>
     <w:p>
       <w:pPr>
-        <w:pStyle w:val="ListBullet"/>
+        <w:spacing w:after="60" w:line="252" w:lineRule="auto"/>
       </w:pPr>
       <w:r>
-        <w:t>Uses active learning instead of lecture-only delivery.</w:t>
+        <w:rPr>
+          <w:rFonts w:ascii="Aptos" w:hAnsi="Aptos"/>
+          <w:b w:val="0"/>
+          <w:i w:val="0"/>
+          <w:color w:val="17231F"/>
+          <w:sz w:val="17"/>
+        </w:rPr>
+        <w:t>Simulation 1 teacher move: Ask students to compare code and algorithm, then code and cupcake. They should notice that related terms cluster closer and produce a higher cosine similarity. The key idea is that vectors represent learned relationships mathematically, not human meaning in the full sense.</w:t>
       </w:r>
     </w:p>
     <w:p>
       <w:pPr>
-        <w:pStyle w:val="ListBullet"/>
+        <w:spacing w:after="40"/>
+        <w:jc w:val="center"/>
       </w:pPr>
       <w:r>
-        <w:t>Uses UDL by combining words, diagrams, formulas, examples, and verbal explanation.</w:t>
+        <w:drawing>
+          <wp:inline xmlns:a="http://schemas.openxmlformats.org/drawingml/2006/main" xmlns:pic="http://schemas.openxmlformats.org/drawingml/2006/picture">
+            <wp:extent cx="5303520" cy="2760524"/>
+            <wp:docPr id="2" name="Picture 2"/>
+            <wp:cNvGraphicFramePr>
+              <a:graphicFrameLocks noChangeAspect="1"/>
+            </wp:cNvGraphicFramePr>
+            <a:graphic>
+              <a:graphicData uri="http://schemas.openxmlformats.org/drawingml/2006/picture">
+                <pic:pic>
+                  <pic:nvPicPr>
+                    <pic:cNvPr id="0" name="Screenshot 2026-05-22 at 8.34.37 PM.png"/>
+                    <pic:cNvPicPr/>
+                  </pic:nvPicPr>
+                  <pic:blipFill>
+                    <a:blip r:embed="rId12"/>
+                    <a:stretch>
+                      <a:fillRect/>
+                    </a:stretch>
+                  </pic:blipFill>
+                  <pic:spPr>
+                    <a:xfrm>
+                      <a:off x="0" y="0"/>
+                      <a:ext cx="5303520" cy="2760524"/>
+                    </a:xfrm>
+                    <a:prstGeom prst="rect"/>
+                  </pic:spPr>
+                </pic:pic>
+              </a:graphicData>
+            </a:graphic>
+          </wp:inline>
+        </w:drawing>
       </w:r>
     </w:p>
     <w:p>
       <w:pPr>
-        <w:pStyle w:val="ListBullet"/>
+        <w:spacing w:after="80"/>
+        <w:jc w:val="center"/>
       </w:pPr>
       <w:r>
-        <w:t>Uses metacognitive closure through an exit ticket.</w:t>
+        <w:rPr>
+          <w:rFonts w:ascii="Aptos" w:hAnsi="Aptos"/>
+          <w:i/>
+          <w:color w:val="616E69"/>
+          <w:sz w:val="15"/>
+        </w:rPr>
+        <w:t>Simulation 2: Weights and Loss. Students adjust inputs and weights, then observe prediction, error, and loss.</w:t>
       </w:r>
     </w:p>
     <w:p>
       <w:pPr>
-        <w:pStyle w:val="ListBullet"/>
+        <w:spacing w:after="60" w:line="252" w:lineRule="auto"/>
       </w:pPr>
       <w:r>
-        <w:t>Uses Serviam to connect technical skill to purpose, integrity, and responsible use.</w:t>
+        <w:rPr>
+          <w:rFonts w:ascii="Aptos" w:hAnsi="Aptos"/>
+          <w:b w:val="0"/>
+          <w:i w:val="0"/>
+          <w:color w:val="17231F"/>
+          <w:sz w:val="17"/>
+        </w:rPr>
+        <w:t>Simulation 2 teacher move: Ask students to predict what happens when evidence strength is high but a weight is negative. Then run one step and twenty steps. The key idea is that training adjusts weights to reduce loss, much like revision improves a draft, but mathematically and at scale.</w:t>
+      </w:r>
+    </w:p>
+    <w:p>
+      <w:r>
+        <w:br w:type="page"/>
       </w:r>
     </w:p>
     <w:p>
       <w:pPr>
-        <w:pStyle w:val="Heading1"/>
+        <w:pStyle w:val="Heading2"/>
+        <w:spacing w:before="120" w:after="80"/>
       </w:pPr>
       <w:r>
+        <w:rPr>
+          <w:rFonts w:ascii="Georgia" w:hAnsi="Georgia"/>
+          <w:b/>
+          <w:color w:val="005C49"/>
+          <w:sz w:val="26"/>
+        </w:rPr>
+        <w:t>Student exit ticket</w:t>
+      </w:r>
+    </w:p>
+    <w:tbl>
+      <w:tblPr>
+        <w:tblW w:type="auto" w:w="0"/>
+        <w:jc w:val="center"/>
+        <w:tblLook w:firstColumn="1" w:firstRow="1" w:lastColumn="0" w:lastRow="0" w:noHBand="0" w:noVBand="1" w:val="04A0"/>
+      </w:tblPr>
+      <w:tblGrid>
+        <w:gridCol w:w="10512"/>
+      </w:tblGrid>
+      <w:tr>
+        <w:tc>
+          <w:tcPr>
+            <w:tcW w:type="dxa" w:w="10512"/>
+            <w:shd w:fill="F7F4EE"/>
+            <w:tcBorders>
+              <w:top w:val="single" w:sz="8" w:space="0" w:color="D8E1DD"/>
+              <w:left w:val="single" w:sz="8" w:space="0" w:color="D8E1DD"/>
+              <w:bottom w:val="single" w:sz="8" w:space="0" w:color="D8E1DD"/>
+              <w:right w:val="single" w:sz="8" w:space="0" w:color="D8E1DD"/>
+            </w:tcBorders>
+            <w:tcMar>
+              <w:top w:w="100" w:type="dxa"/>
+              <w:bottom w:w="100" w:type="dxa"/>
+              <w:left w:w="150" w:type="dxa"/>
+              <w:right w:w="150" w:type="dxa"/>
+            </w:tcMar>
+          </w:tcPr>
+          <w:p>
+            <w:pPr>
+              <w:spacing w:after="40" w:line="252" w:lineRule="auto"/>
+            </w:pPr>
+            <w:r>
+              <w:rPr>
+                <w:rFonts w:ascii="Aptos" w:hAnsi="Aptos"/>
+                <w:b/>
+                <w:i w:val="0"/>
+                <w:color w:val="003F35"/>
+                <w:sz w:val="19"/>
+              </w:rPr>
+              <w:t>Explain how AI works</w:t>
+            </w:r>
+          </w:p>
+          <w:p>
+            <w:pPr>
+              <w:spacing w:after="40" w:line="252" w:lineRule="auto"/>
+            </w:pPr>
+            <w:r>
+              <w:rPr>
+                <w:rFonts w:ascii="Aptos" w:hAnsi="Aptos"/>
+                <w:b w:val="0"/>
+                <w:i w:val="0"/>
+                <w:color w:val="17231F"/>
+                <w:sz w:val="18"/>
+              </w:rPr>
+              <w:t>In 4 to 5 sentences or a labeled diagram, explain how AI creates a response. Include one math idea, one computer science idea, one science or testing idea, and one reason human review still matters.</w:t>
+            </w:r>
+          </w:p>
+        </w:tc>
+      </w:tr>
+    </w:tbl>
+    <w:p>
+      <w:pPr>
+        <w:pStyle w:val="Heading2"/>
+        <w:spacing w:before="120" w:after="80"/>
+      </w:pPr>
+      <w:r>
+        <w:rPr>
+          <w:rFonts w:ascii="Georgia" w:hAnsi="Georgia"/>
+          <w:b/>
+          <w:color w:val="005C49"/>
+          <w:sz w:val="26"/>
+        </w:rPr>
         <w:t>Differentiation</w:t>
       </w:r>
     </w:p>
     <w:tbl>
       <w:tblPr>
-        <w:tblStyle w:val="TableGrid"/>
         <w:tblW w:type="auto" w:w="0"/>
+        <w:jc w:val="center"/>
+        <w:tblLayout w:type="autofit"/>
         <w:tblLook w:firstColumn="1" w:firstRow="1" w:lastColumn="0" w:lastRow="0" w:noHBand="0" w:noVBand="1" w:val="04A0"/>
       </w:tblPr>
       <w:tblGrid>
-        <w:gridCol w:w="5184"/>
-        <w:gridCol w:w="5184"/>
+        <w:gridCol w:w="5256"/>
+        <w:gridCol w:w="5256"/>
       </w:tblGrid>
       <w:tr>
         <w:tc>
           <w:tcPr>
-            <w:tcW w:type="dxa" w:w="5184"/>
+            <w:tcW w:type="dxa" w:w="2448"/>
+            <w:shd w:fill="005C49"/>
+            <w:tcBorders>
+              <w:top w:val="single" w:sz="6" w:space="0" w:color="005C49"/>
+              <w:left w:val="single" w:sz="6" w:space="0" w:color="005C49"/>
+              <w:bottom w:val="single" w:sz="6" w:space="0" w:color="005C49"/>
+              <w:right w:val="single" w:sz="6" w:space="0" w:color="005C49"/>
+            </w:tcBorders>
+            <w:tcMar>
+              <w:top w:w="80" w:type="dxa"/>
+              <w:bottom w:w="80" w:type="dxa"/>
+              <w:left w:w="100" w:type="dxa"/>
+              <w:right w:w="100" w:type="dxa"/>
+            </w:tcMar>
           </w:tcPr>
           <w:p>
+            <w:pPr>
+              <w:spacing w:after="40" w:line="252" w:lineRule="auto"/>
+            </w:pPr>
             <w:r>
+              <w:rPr>
+                <w:rFonts w:ascii="Aptos" w:hAnsi="Aptos"/>
+                <w:b/>
+                <w:i w:val="0"/>
+                <w:color w:val="FFFFFF"/>
+                <w:sz w:val="16"/>
+              </w:rPr>
               <w:t>Group</w:t>
             </w:r>
           </w:p>
         </w:tc>
         <w:tc>
           <w:tcPr>
-            <w:tcW w:type="dxa" w:w="5184"/>
+            <w:tcW w:type="dxa" w:w="7632"/>
+            <w:shd w:fill="005C49"/>
+            <w:tcBorders>
+              <w:top w:val="single" w:sz="6" w:space="0" w:color="005C49"/>
+              <w:left w:val="single" w:sz="6" w:space="0" w:color="005C49"/>
+              <w:bottom w:val="single" w:sz="6" w:space="0" w:color="005C49"/>
+              <w:right w:val="single" w:sz="6" w:space="0" w:color="005C49"/>
+            </w:tcBorders>
+            <w:tcMar>
+              <w:top w:w="80" w:type="dxa"/>
+              <w:bottom w:w="80" w:type="dxa"/>
+              <w:left w:w="100" w:type="dxa"/>
+              <w:right w:w="100" w:type="dxa"/>
+            </w:tcMar>
           </w:tcPr>
           <w:p>
+            <w:pPr>
+              <w:spacing w:after="40" w:line="252" w:lineRule="auto"/>
+            </w:pPr>
             <w:r>
+              <w:rPr>
+                <w:rFonts w:ascii="Aptos" w:hAnsi="Aptos"/>
+                <w:b/>
+                <w:i w:val="0"/>
+                <w:color w:val="FFFFFF"/>
+                <w:sz w:val="16"/>
+              </w:rPr>
               <w:t>Adjustment</w:t>
             </w:r>
           </w:p>
@@ -759,21 +3115,65 @@
       <w:tr>
         <w:tc>
           <w:tcPr>
-            <w:tcW w:type="dxa" w:w="5184"/>
+            <w:tcW w:type="dxa" w:w="5256"/>
+            <w:shd w:fill="FFFFFF"/>
+            <w:tcBorders>
+              <w:top w:val="single" w:sz="6" w:space="0" w:color="D8E1DD"/>
+              <w:left w:val="single" w:sz="6" w:space="0" w:color="D8E1DD"/>
+              <w:bottom w:val="single" w:sz="6" w:space="0" w:color="D8E1DD"/>
+              <w:right w:val="single" w:sz="6" w:space="0" w:color="D8E1DD"/>
+            </w:tcBorders>
+            <w:tcMar>
+              <w:top w:w="80" w:type="dxa"/>
+              <w:bottom w:w="80" w:type="dxa"/>
+              <w:left w:w="100" w:type="dxa"/>
+              <w:right w:w="100" w:type="dxa"/>
+            </w:tcMar>
           </w:tcPr>
           <w:p>
+            <w:pPr>
+              <w:spacing w:after="40" w:line="252" w:lineRule="auto"/>
+            </w:pPr>
             <w:r>
+              <w:rPr>
+                <w:rFonts w:ascii="Aptos" w:hAnsi="Aptos"/>
+                <w:i w:val="0"/>
+                <w:color w:val="17231F"/>
+                <w:sz w:val="16"/>
+              </w:rPr>
               <w:t>Students needing support</w:t>
             </w:r>
           </w:p>
         </w:tc>
         <w:tc>
           <w:tcPr>
-            <w:tcW w:type="dxa" w:w="5184"/>
+            <w:tcW w:type="dxa" w:w="5256"/>
+            <w:shd w:fill="FFFFFF"/>
+            <w:tcBorders>
+              <w:top w:val="single" w:sz="6" w:space="0" w:color="D8E1DD"/>
+              <w:left w:val="single" w:sz="6" w:space="0" w:color="D8E1DD"/>
+              <w:bottom w:val="single" w:sz="6" w:space="0" w:color="D8E1DD"/>
+              <w:right w:val="single" w:sz="6" w:space="0" w:color="D8E1DD"/>
+            </w:tcBorders>
+            <w:tcMar>
+              <w:top w:w="80" w:type="dxa"/>
+              <w:bottom w:w="80" w:type="dxa"/>
+              <w:left w:w="100" w:type="dxa"/>
+              <w:right w:w="100" w:type="dxa"/>
+            </w:tcMar>
           </w:tcPr>
           <w:p>
+            <w:pPr>
+              <w:spacing w:after="40" w:line="252" w:lineRule="auto"/>
+            </w:pPr>
             <w:r>
-              <w:t>Use only the pathway, definitions, and diagrams. Skip formulas except f(x)=y.</w:t>
+              <w:rPr>
+                <w:rFonts w:ascii="Aptos" w:hAnsi="Aptos"/>
+                <w:i w:val="0"/>
+                <w:color w:val="17231F"/>
+                <w:sz w:val="16"/>
+              </w:rPr>
+              <w:t>Use the pathway, definitions, and diagrams. Skip formulas except f(x)=y and the weighted sum as a visual.</w:t>
             </w:r>
           </w:p>
         </w:tc>
@@ -781,21 +3181,65 @@
       <w:tr>
         <w:tc>
           <w:tcPr>
-            <w:tcW w:type="dxa" w:w="5184"/>
+            <w:tcW w:type="dxa" w:w="5256"/>
+            <w:shd w:fill="FFFFFF"/>
+            <w:tcBorders>
+              <w:top w:val="single" w:sz="6" w:space="0" w:color="D8E1DD"/>
+              <w:left w:val="single" w:sz="6" w:space="0" w:color="D8E1DD"/>
+              <w:bottom w:val="single" w:sz="6" w:space="0" w:color="D8E1DD"/>
+              <w:right w:val="single" w:sz="6" w:space="0" w:color="D8E1DD"/>
+            </w:tcBorders>
+            <w:tcMar>
+              <w:top w:w="80" w:type="dxa"/>
+              <w:bottom w:w="80" w:type="dxa"/>
+              <w:left w:w="100" w:type="dxa"/>
+              <w:right w:w="100" w:type="dxa"/>
+            </w:tcMar>
           </w:tcPr>
           <w:p>
+            <w:pPr>
+              <w:spacing w:after="40" w:line="252" w:lineRule="auto"/>
+            </w:pPr>
             <w:r>
+              <w:rPr>
+                <w:rFonts w:ascii="Aptos" w:hAnsi="Aptos"/>
+                <w:i w:val="0"/>
+                <w:color w:val="17231F"/>
+                <w:sz w:val="16"/>
+              </w:rPr>
               <w:t>Grade 10 baseline</w:t>
             </w:r>
           </w:p>
         </w:tc>
         <w:tc>
           <w:tcPr>
-            <w:tcW w:type="dxa" w:w="5184"/>
+            <w:tcW w:type="dxa" w:w="5256"/>
+            <w:shd w:fill="FFFFFF"/>
+            <w:tcBorders>
+              <w:top w:val="single" w:sz="6" w:space="0" w:color="D8E1DD"/>
+              <w:left w:val="single" w:sz="6" w:space="0" w:color="D8E1DD"/>
+              <w:bottom w:val="single" w:sz="6" w:space="0" w:color="D8E1DD"/>
+              <w:right w:val="single" w:sz="6" w:space="0" w:color="D8E1DD"/>
+            </w:tcBorders>
+            <w:tcMar>
+              <w:top w:w="80" w:type="dxa"/>
+              <w:bottom w:w="80" w:type="dxa"/>
+              <w:left w:w="100" w:type="dxa"/>
+              <w:right w:w="100" w:type="dxa"/>
+            </w:tcMar>
           </w:tcPr>
           <w:p>
+            <w:pPr>
+              <w:spacing w:after="40" w:line="252" w:lineRule="auto"/>
+            </w:pPr>
             <w:r>
-              <w:t>Use all 12 slides, but keep formulas as intuition.</w:t>
+              <w:rPr>
+                <w:rFonts w:ascii="Aptos" w:hAnsi="Aptos"/>
+                <w:i w:val="0"/>
+                <w:color w:val="17231F"/>
+                <w:sz w:val="16"/>
+              </w:rPr>
+              <w:t>Use all 12 slides and both simulations. Keep formulas as intuition and focus on explanation.</w:t>
             </w:r>
           </w:p>
         </w:tc>
@@ -803,21 +3247,65 @@
       <w:tr>
         <w:tc>
           <w:tcPr>
-            <w:tcW w:type="dxa" w:w="5184"/>
+            <w:tcW w:type="dxa" w:w="5256"/>
+            <w:shd w:fill="FFFFFF"/>
+            <w:tcBorders>
+              <w:top w:val="single" w:sz="6" w:space="0" w:color="D8E1DD"/>
+              <w:left w:val="single" w:sz="6" w:space="0" w:color="D8E1DD"/>
+              <w:bottom w:val="single" w:sz="6" w:space="0" w:color="D8E1DD"/>
+              <w:right w:val="single" w:sz="6" w:space="0" w:color="D8E1DD"/>
+            </w:tcBorders>
+            <w:tcMar>
+              <w:top w:w="80" w:type="dxa"/>
+              <w:bottom w:w="80" w:type="dxa"/>
+              <w:left w:w="100" w:type="dxa"/>
+              <w:right w:w="100" w:type="dxa"/>
+            </w:tcMar>
           </w:tcPr>
           <w:p>
+            <w:pPr>
+              <w:spacing w:after="40" w:line="252" w:lineRule="auto"/>
+            </w:pPr>
             <w:r>
-              <w:t>Grade 11 or AP extension</w:t>
+              <w:rPr>
+                <w:rFonts w:ascii="Aptos" w:hAnsi="Aptos"/>
+                <w:i w:val="0"/>
+                <w:color w:val="17231F"/>
+                <w:sz w:val="16"/>
+              </w:rPr>
+              <w:t>Grade 11 extension</w:t>
             </w:r>
           </w:p>
         </w:tc>
         <w:tc>
           <w:tcPr>
-            <w:tcW w:type="dxa" w:w="5184"/>
+            <w:tcW w:type="dxa" w:w="5256"/>
+            <w:shd w:fill="FFFFFF"/>
+            <w:tcBorders>
+              <w:top w:val="single" w:sz="6" w:space="0" w:color="D8E1DD"/>
+              <w:left w:val="single" w:sz="6" w:space="0" w:color="D8E1DD"/>
+              <w:bottom w:val="single" w:sz="6" w:space="0" w:color="D8E1DD"/>
+              <w:right w:val="single" w:sz="6" w:space="0" w:color="D8E1DD"/>
+            </w:tcBorders>
+            <w:tcMar>
+              <w:top w:w="80" w:type="dxa"/>
+              <w:bottom w:w="80" w:type="dxa"/>
+              <w:left w:w="100" w:type="dxa"/>
+              <w:right w:w="100" w:type="dxa"/>
+            </w:tcMar>
           </w:tcPr>
           <w:p>
+            <w:pPr>
+              <w:spacing w:after="40" w:line="252" w:lineRule="auto"/>
+            </w:pPr>
             <w:r>
-              <w:t>Add dot product, softmax formula, attention formula, gradient descent notation, and Java-style pseudocode in speaker notes.</w:t>
+              <w:rPr>
+                <w:rFonts w:ascii="Aptos" w:hAnsi="Aptos"/>
+                <w:i w:val="0"/>
+                <w:color w:val="17231F"/>
+                <w:sz w:val="16"/>
+              </w:rPr>
+              <w:t>Add cosine similarity, loss example, and pseudocode. Ask students to annotate which step is math, CS, science, or human judgment.</w:t>
             </w:r>
           </w:p>
         </w:tc>
@@ -825,21 +3313,65 @@
       <w:tr>
         <w:tc>
           <w:tcPr>
-            <w:tcW w:type="dxa" w:w="5184"/>
+            <w:tcW w:type="dxa" w:w="5256"/>
+            <w:shd w:fill="FFFFFF"/>
+            <w:tcBorders>
+              <w:top w:val="single" w:sz="6" w:space="0" w:color="D8E1DD"/>
+              <w:left w:val="single" w:sz="6" w:space="0" w:color="D8E1DD"/>
+              <w:bottom w:val="single" w:sz="6" w:space="0" w:color="D8E1DD"/>
+              <w:right w:val="single" w:sz="6" w:space="0" w:color="D8E1DD"/>
+            </w:tcBorders>
+            <w:tcMar>
+              <w:top w:w="80" w:type="dxa"/>
+              <w:bottom w:w="80" w:type="dxa"/>
+              <w:left w:w="100" w:type="dxa"/>
+              <w:right w:w="100" w:type="dxa"/>
+            </w:tcMar>
           </w:tcPr>
           <w:p>
+            <w:pPr>
+              <w:spacing w:after="40" w:line="252" w:lineRule="auto"/>
+            </w:pPr>
             <w:r>
-              <w:t>Fast finishers</w:t>
+              <w:rPr>
+                <w:rFonts w:ascii="Aptos" w:hAnsi="Aptos"/>
+                <w:i w:val="0"/>
+                <w:color w:val="17231F"/>
+                <w:sz w:val="16"/>
+              </w:rPr>
+              <w:t>AP extension</w:t>
             </w:r>
           </w:p>
         </w:tc>
         <w:tc>
           <w:tcPr>
-            <w:tcW w:type="dxa" w:w="5184"/>
+            <w:tcW w:type="dxa" w:w="5256"/>
+            <w:shd w:fill="FFFFFF"/>
+            <w:tcBorders>
+              <w:top w:val="single" w:sz="6" w:space="0" w:color="D8E1DD"/>
+              <w:left w:val="single" w:sz="6" w:space="0" w:color="D8E1DD"/>
+              <w:bottom w:val="single" w:sz="6" w:space="0" w:color="D8E1DD"/>
+              <w:right w:val="single" w:sz="6" w:space="0" w:color="D8E1DD"/>
+            </w:tcBorders>
+            <w:tcMar>
+              <w:top w:w="80" w:type="dxa"/>
+              <w:bottom w:w="80" w:type="dxa"/>
+              <w:left w:w="100" w:type="dxa"/>
+              <w:right w:w="100" w:type="dxa"/>
+            </w:tcMar>
           </w:tcPr>
           <w:p>
+            <w:pPr>
+              <w:spacing w:after="40" w:line="252" w:lineRule="auto"/>
+            </w:pPr>
             <w:r>
-              <w:t>Ask them to label which part of the pipeline is math, CS, science, or human judgment.</w:t>
+              <w:rPr>
+                <w:rFonts w:ascii="Aptos" w:hAnsi="Aptos"/>
+                <w:i w:val="0"/>
+                <w:color w:val="17231F"/>
+                <w:sz w:val="16"/>
+              </w:rPr>
+              <w:t>Add dot product, softmax formula, attention formula, and Java-style arrays in speaker notes only.</w:t>
             </w:r>
           </w:p>
         </w:tc>
@@ -847,52 +3379,221 @@
     </w:tbl>
     <w:p>
       <w:pPr>
-        <w:pStyle w:val="Heading1"/>
+        <w:pStyle w:val="Heading2"/>
+        <w:spacing w:before="120" w:after="80"/>
       </w:pPr>
       <w:r>
-        <w:t>Assessment</w:t>
+        <w:rPr>
+          <w:rFonts w:ascii="Georgia" w:hAnsi="Georgia"/>
+          <w:b/>
+          <w:color w:val="005C49"/>
+          <w:sz w:val="26"/>
+        </w:rPr>
+        <w:t>Best-practice design notes</w:t>
       </w:r>
     </w:p>
     <w:p>
       <w:pPr>
         <w:pStyle w:val="ListBullet"/>
+        <w:spacing w:after="20"/>
       </w:pPr>
       <w:r>
-        <w:t>Exit ticket: one math idea, one computer science idea, one science idea, one human responsibility.</w:t>
+        <w:rPr>
+          <w:rFonts w:ascii="Aptos" w:hAnsi="Aptos"/>
+          <w:color w:val="17231F"/>
+          <w:sz w:val="19"/>
+        </w:rPr>
+        <w:t>Prediction before explanation activates prior knowledge and curiosity.</w:t>
       </w:r>
     </w:p>
     <w:p>
       <w:pPr>
         <w:pStyle w:val="ListBullet"/>
+        <w:spacing w:after="20"/>
       </w:pPr>
       <w:r>
-        <w:t>Teacher observation: can students explain why AI output needs review?</w:t>
+        <w:rPr>
+          <w:rFonts w:ascii="Aptos" w:hAnsi="Aptos"/>
+          <w:color w:val="17231F"/>
+          <w:sz w:val="19"/>
+        </w:rPr>
+        <w:t>Visual models and simulations reduce cognitive load and make abstract ideas visible.</w:t>
       </w:r>
     </w:p>
     <w:p>
       <w:pPr>
         <w:pStyle w:val="ListBullet"/>
+        <w:spacing w:after="20"/>
       </w:pPr>
       <w:r>
-        <w:t>Student discussion: can students distinguish calculated similarity from human meaning?</w:t>
+        <w:rPr>
+          <w:rFonts w:ascii="Aptos" w:hAnsi="Aptos"/>
+          <w:color w:val="17231F"/>
+          <w:sz w:val="19"/>
+        </w:rPr>
+        <w:t>Short worked examples make the math and code concrete without turning the lesson into a college lecture.</w:t>
       </w:r>
     </w:p>
     <w:p>
       <w:pPr>
         <w:pStyle w:val="ListBullet"/>
+        <w:spacing w:after="20"/>
       </w:pPr>
       <w:r>
-        <w:t>Optional prompt: explain the AI pipeline in four sentences for a 9th grader.</w:t>
+        <w:rPr>
+          <w:rFonts w:ascii="Aptos" w:hAnsi="Aptos"/>
+          <w:color w:val="17231F"/>
+          <w:sz w:val="19"/>
+        </w:rPr>
+        <w:t>Students produce visible evidence of learning through the exit explanation.</w:t>
+      </w:r>
+    </w:p>
+    <w:p>
+      <w:pPr>
+        <w:pStyle w:val="ListBullet"/>
+        <w:spacing w:after="20"/>
+      </w:pPr>
+      <w:r>
+        <w:rPr>
+          <w:rFonts w:ascii="Aptos" w:hAnsi="Aptos"/>
+          <w:color w:val="17231F"/>
+          <w:sz w:val="19"/>
+        </w:rPr>
+        <w:t>UDL is supported through diagrams, formulas, written prompts, speaking opportunities, and simulation-based exploration.</w:t>
+      </w:r>
+    </w:p>
+    <w:p>
+      <w:pPr>
+        <w:pStyle w:val="ListBullet"/>
+        <w:spacing w:after="20"/>
+      </w:pPr>
+      <w:r>
+        <w:rPr>
+          <w:rFonts w:ascii="Aptos" w:hAnsi="Aptos"/>
+          <w:color w:val="17231F"/>
+          <w:sz w:val="19"/>
+        </w:rPr>
+        <w:t>Serviam connects technical skill to responsible use, testing, fairness, privacy, and human oversight.</w:t>
       </w:r>
     </w:p>
     <w:sectPr>
+      <w:headerReference w:type="default" r:id="rId9"/>
+      <w:footerReference w:type="default" r:id="rId10"/>
       <w:pgSz w:w="12240" w:h="15840"/>
-      <w:pgMar w:top="792" w:right="936" w:bottom="792" w:left="936" w:header="720" w:footer="720" w:gutter="0"/>
+      <w:pgMar w:top="792" w:right="864" w:bottom="792" w:left="864" w:header="720" w:footer="720" w:gutter="0"/>
       <w:cols w:space="720"/>
       <w:docGrid w:linePitch="360"/>
     </w:sectPr>
   </w:body>
 </w:document>
+</file>
+
+<file path=word/footer1.xml><?xml version="1.0" encoding="utf-8"?>
+<w:ftr xmlns:m="http://schemas.openxmlformats.org/officeDocument/2006/math" xmlns:mc="http://schemas.openxmlformats.org/markup-compatibility/2006" xmlns:mo="http://schemas.microsoft.com/office/mac/office/2008/main" xmlns:mv="urn:schemas-microsoft-com:mac:vml" xmlns:o="urn:schemas-microsoft-com:office:office" xmlns:r="http://schemas.openxmlformats.org/officeDocument/2006/relationships" xmlns:v="urn:schemas-microsoft-com:vml" xmlns:w10="urn:schemas-microsoft-com:office:word" xmlns:w14="http://schemas.microsoft.com/office/word/2010/wordml" xmlns:w="http://schemas.openxmlformats.org/wordprocessingml/2006/main" xmlns:wne="http://schemas.microsoft.com/office/word/2006/wordml" xmlns:wp14="http://schemas.microsoft.com/office/word/2010/wordprocessingDrawing" xmlns:wp="http://schemas.openxmlformats.org/drawingml/2006/wordprocessingDrawing" xmlns:wpc="http://schemas.microsoft.com/office/word/2010/wordprocessingCanvas" xmlns:wpg="http://schemas.microsoft.com/office/word/2010/wordprocessingGroup" xmlns:wpi="http://schemas.microsoft.com/office/word/2010/wordprocessingInk" xmlns:wps="http://schemas.microsoft.com/office/word/2010/wordprocessingShape" mc:Ignorable="w14 wp14">
+  <w:p>
+    <w:pPr>
+      <w:pStyle w:val="Footer"/>
+      <w:jc w:val="center"/>
+    </w:pPr>
+    <w:r>
+      <w:rPr>
+        <w:rFonts w:ascii="Aptos" w:hAnsi="Aptos"/>
+        <w:color w:val="616E69"/>
+        <w:sz w:val="15"/>
+      </w:rPr>
+      <w:t>AI is not magic. It is math trained on patterns. Human wisdom decides whether, when, and how to use it. · Serviam: I will serve.</w:t>
+    </w:r>
+  </w:p>
+</w:ftr>
+</file>
+
+<file path=word/header1.xml><?xml version="1.0" encoding="utf-8"?>
+<w:hdr xmlns:m="http://schemas.openxmlformats.org/officeDocument/2006/math" xmlns:mc="http://schemas.openxmlformats.org/markup-compatibility/2006" xmlns:mo="http://schemas.microsoft.com/office/mac/office/2008/main" xmlns:mv="urn:schemas-microsoft-com:mac:vml" xmlns:o="urn:schemas-microsoft-com:office:office" xmlns:r="http://schemas.openxmlformats.org/officeDocument/2006/relationships" xmlns:v="urn:schemas-microsoft-com:vml" xmlns:w10="urn:schemas-microsoft-com:office:word" xmlns:w14="http://schemas.microsoft.com/office/word/2010/wordml" xmlns:w="http://schemas.openxmlformats.org/wordprocessingml/2006/main" xmlns:wne="http://schemas.microsoft.com/office/word/2006/wordml" xmlns:wp14="http://schemas.microsoft.com/office/word/2010/wordprocessingDrawing" xmlns:wp="http://schemas.openxmlformats.org/drawingml/2006/wordprocessingDrawing" xmlns:wpc="http://schemas.microsoft.com/office/word/2010/wordprocessingCanvas" xmlns:wpg="http://schemas.microsoft.com/office/word/2010/wordprocessingGroup" xmlns:wpi="http://schemas.microsoft.com/office/word/2010/wordprocessingInk" xmlns:wps="http://schemas.microsoft.com/office/word/2010/wordprocessingShape" mc:Ignorable="w14 wp14">
+  <w:p>
+    <w:pPr>
+      <w:pStyle w:val="Header"/>
+    </w:pPr>
+  </w:p>
+  <w:tbl>
+    <w:tblPr>
+      <w:tblW w:type="auto" w:w="0"/>
+      <w:jc w:val="center"/>
+      <w:tblLayout w:type="fixed"/>
+      <w:tblLook w:firstColumn="1" w:firstRow="1" w:lastColumn="0" w:lastRow="0" w:noHBand="0" w:noVBand="1" w:val="04A0"/>
+    </w:tblPr>
+    <w:tblGrid>
+      <w:gridCol w:w="5220"/>
+      <w:gridCol w:w="5220"/>
+    </w:tblGrid>
+    <w:tr>
+      <w:tc>
+        <w:tcPr>
+          <w:tcW w:type="dxa" w:w="8064"/>
+          <w:shd w:fill="005C49"/>
+          <w:tcMar>
+            <w:top w:w="60" w:type="dxa"/>
+            <w:bottom w:w="60" w:type="dxa"/>
+            <w:left w:w="120" w:type="dxa"/>
+            <w:right w:w="120" w:type="dxa"/>
+          </w:tcMar>
+          <w:tcBorders>
+            <w:top w:val="single" w:sz="0" w:space="0" w:color="005C49"/>
+            <w:left w:val="single" w:sz="0" w:space="0" w:color="005C49"/>
+            <w:bottom w:val="single" w:sz="0" w:space="0" w:color="005C49"/>
+            <w:right w:val="single" w:sz="0" w:space="0" w:color="005C49"/>
+          </w:tcBorders>
+        </w:tcPr>
+        <w:p>
+          <w:pPr>
+            <w:spacing w:after="0"/>
+          </w:pPr>
+          <w:r>
+            <w:rPr>
+              <w:rFonts w:ascii="Aptos" w:hAnsi="Aptos"/>
+              <w:b/>
+              <w:color w:val="FFFFFF"/>
+              <w:sz w:val="16"/>
+            </w:rPr>
+            <w:t>URSULINE ACADEMY · I.D.E.A. HUB</w:t>
+          </w:r>
+        </w:p>
+      </w:tc>
+      <w:tc>
+        <w:tcPr>
+          <w:tcW w:type="dxa" w:w="2376"/>
+          <w:shd w:fill="005C49"/>
+          <w:tcMar>
+            <w:top w:w="60" w:type="dxa"/>
+            <w:bottom w:w="60" w:type="dxa"/>
+            <w:left w:w="120" w:type="dxa"/>
+            <w:right w:w="120" w:type="dxa"/>
+          </w:tcMar>
+          <w:tcBorders>
+            <w:top w:val="single" w:sz="0" w:space="0" w:color="005C49"/>
+            <w:left w:val="single" w:sz="0" w:space="0" w:color="005C49"/>
+            <w:bottom w:val="single" w:sz="0" w:space="0" w:color="005C49"/>
+            <w:right w:val="single" w:sz="0" w:space="0" w:color="005C49"/>
+          </w:tcBorders>
+        </w:tcPr>
+        <w:p>
+          <w:pPr>
+            <w:spacing w:after="0"/>
+            <w:jc w:val="right"/>
+          </w:pPr>
+          <w:r>
+            <w:rPr>
+              <w:rFonts w:ascii="Aptos" w:hAnsi="Aptos"/>
+              <w:b/>
+              <w:color w:val="FFFFFF"/>
+              <w:sz w:val="16"/>
+            </w:rPr>
+            <w:t>TEACHER PLAN</w:t>
+          </w:r>
+        </w:p>
+      </w:tc>
+    </w:tr>
+  </w:tbl>
+</w:hdr>
 </file>
 
 <file path=word/numbering.xml><?xml version="1.0" encoding="utf-8"?>
@@ -1260,7 +3961,8 @@
     <w:rsid w:val="00FC693F"/>
     <w:rPr>
       <w:rFonts w:ascii="Aptos" w:hAnsi="Aptos"/>
-      <w:sz w:val="21"/>
+      <w:color w:val="17231F"/>
+      <w:sz w:val="19"/>
     </w:rPr>
   </w:style>
   <w:style w:type="paragraph" w:styleId="Header">
@@ -1322,11 +4024,11 @@
       <w:outlineLvl w:val="0"/>
     </w:pPr>
     <w:rPr>
-      <w:rFonts w:asciiTheme="majorHAnsi" w:eastAsiaTheme="majorEastAsia" w:hAnsiTheme="majorHAnsi" w:cstheme="majorBidi" w:ascii="Aptos Display" w:hAnsi="Aptos Display"/>
+      <w:rFonts w:asciiTheme="majorHAnsi" w:eastAsiaTheme="majorEastAsia" w:hAnsiTheme="majorHAnsi" w:cstheme="majorBidi" w:ascii="Georgia" w:hAnsi="Georgia"/>
       <w:b/>
       <w:bCs/>
-      <w:color w:val="365F91" w:themeColor="accent1" w:themeShade="BF"/>
-      <w:sz w:val="28"/>
+      <w:color w:val="003F35"/>
+      <w:sz w:val="36"/>
       <w:szCs w:val="28"/>
     </w:rPr>
   </w:style>
@@ -1346,10 +4048,10 @@
       <w:outlineLvl w:val="1"/>
     </w:pPr>
     <w:rPr>
-      <w:rFonts w:asciiTheme="majorHAnsi" w:eastAsiaTheme="majorEastAsia" w:hAnsiTheme="majorHAnsi" w:cstheme="majorBidi" w:ascii="Aptos Display" w:hAnsi="Aptos Display"/>
+      <w:rFonts w:asciiTheme="majorHAnsi" w:eastAsiaTheme="majorEastAsia" w:hAnsiTheme="majorHAnsi" w:cstheme="majorBidi" w:ascii="Georgia" w:hAnsi="Georgia"/>
       <w:b/>
       <w:bCs/>
-      <w:color w:val="4F81BD" w:themeColor="accent1"/>
+      <w:color w:val="005C49"/>
       <w:sz w:val="26"/>
       <w:szCs w:val="26"/>
     </w:rPr>
@@ -1370,10 +4072,11 @@
       <w:outlineLvl w:val="2"/>
     </w:pPr>
     <w:rPr>
-      <w:rFonts w:asciiTheme="majorHAnsi" w:eastAsiaTheme="majorEastAsia" w:hAnsiTheme="majorHAnsi" w:cstheme="majorBidi" w:ascii="Aptos Display" w:hAnsi="Aptos Display"/>
+      <w:rFonts w:asciiTheme="majorHAnsi" w:eastAsiaTheme="majorEastAsia" w:hAnsiTheme="majorHAnsi" w:cstheme="majorBidi" w:ascii="Georgia" w:hAnsi="Georgia"/>
       <w:b/>
       <w:bCs/>
-      <w:color w:val="4F81BD" w:themeColor="accent1"/>
+      <w:color w:val="10223B"/>
+      <w:sz w:val="21"/>
     </w:rPr>
   </w:style>
   <w:style w:type="paragraph" w:styleId="Heading4">

</xml_diff>